<commit_message>
FINISH LINE 96, ALL INSTRUCTIONS NEED WORK!!!!!! FINISH LINE 96, ALL INSTRUCTIONS NEED WORK!!!!!! FINISH LINE 96, ALL INSTRUCTIONS NEED WORK!!!!!! FINISH LINE 96, ALL INSTRUCTIONS NEED WORK!!!!!! FINISH LINE 96, ALL INSTRUCTIONS NEED WORK!!!!!! FINISH LINE 96, ALL INSTRUCTIONS NEED WORK!!!!!! FINISH LINE 96, ALL INSTRUCTIONS NEED WORK!!!!!! FINISH LINE 96, ALL INSTRUCTIONS NEED WORK!!!!!! FINISH LINE 96, ALL INSTRUCTIONS NEED WORK!!!!!! FINISH LINE 96, ALL INSTRUCTIONS NEED WORK!!!!!! FINISH LINE 96, ALL INSTRUCTIONS NEED WORK!!!!!! FINISH LINE 96, ALL INSTRUCTIONS NEED WORK!!!!!! FINISH LINE 96, ALL INSTRUCTIONS NEED WORK!!!!!! FINISH LINE 96, ALL INSTRUCTIONS NEED WORK!!!!!!
</commit_message>
<xml_diff>
--- a/Analysis.docx
+++ b/Analysis.docx
@@ -155,21 +155,7 @@
             <w:rStyle w:val="Hyperlink"/>
             <w:sz w:val="32"/>
           </w:rPr>
-          <w:t>he</w:t>
-        </w:r>
-        <w:r>
-          <w:rPr>
-            <w:rStyle w:val="Hyperlink"/>
-            <w:sz w:val="32"/>
-          </w:rPr>
-          <w:t>r</w:t>
-        </w:r>
-        <w:r>
-          <w:rPr>
-            <w:rStyle w:val="Hyperlink"/>
-            <w:sz w:val="32"/>
-          </w:rPr>
-          <w:t>e</w:t>
+          <w:t>here</w:t>
         </w:r>
       </w:hyperlink>
       <w:r>
@@ -222,7 +208,13 @@
         <w:rPr>
           <w:sz w:val="32"/>
         </w:rPr>
-        <w:t xml:space="preserve"> a notable desire being to have descriptive error messages and showing syntax errors.</w:t>
+        <w:t xml:space="preserve"> a notable desire being to have descriptive error messages and showing syntax errors</w:t>
+      </w:r>
+      <w:r>
+        <w:rPr>
+          <w:sz w:val="32"/>
+        </w:rPr>
+        <w:t>.</w:t>
       </w:r>
     </w:p>
     <w:p>
@@ -236,22 +228,11 @@
           <w:sz w:val="32"/>
         </w:rPr>
         <w:lastRenderedPageBreak/>
-        <w:t xml:space="preserve">I also looked at the AQA Assembly Language Simulator created by </w:t>
-      </w:r>
-      <w:r>
-        <w:rPr>
-          <w:sz w:val="32"/>
-        </w:rPr>
-        <w:t>Peter Higginson</w:t>
-      </w:r>
-      <w:r>
-        <w:rPr>
-          <w:sz w:val="32"/>
-        </w:rPr>
-        <w:t xml:space="preserve">, shown below. </w:t>
-      </w:r>
-      <w:r>
-        <w:rPr>
+        <w:t xml:space="preserve">I also looked at the AQA Assembly Language Simulator created by Peter Higginson, shown below. </w:t>
+      </w:r>
+      <w:r>
+        <w:rPr>
+          <w:noProof/>
           <w:sz w:val="32"/>
         </w:rPr>
         <w:drawing>
@@ -359,6 +340,7 @@
       </w:r>
       <w:r>
         <w:rPr>
+          <w:noProof/>
           <w:sz w:val="32"/>
         </w:rPr>
         <w:drawing>
@@ -408,10 +390,46 @@
         <w:rPr>
           <w:sz w:val="32"/>
         </w:rPr>
-        <w:t>From this I made sure to make my errors clear and understandable.</w:t>
+        <w:t xml:space="preserve">From this I </w:t>
+      </w:r>
+      <w:r>
+        <w:rPr>
+          <w:sz w:val="32"/>
+        </w:rPr>
+        <w:t>noted that I should</w:t>
+      </w:r>
+      <w:r>
+        <w:rPr>
+          <w:sz w:val="32"/>
+        </w:rPr>
+        <w:t xml:space="preserve"> </w:t>
+      </w:r>
+      <w:r>
+        <w:rPr>
+          <w:sz w:val="32"/>
+        </w:rPr>
+        <w:t>en</w:t>
+      </w:r>
+      <w:r>
+        <w:rPr>
+          <w:sz w:val="32"/>
+        </w:rPr>
+        <w:t>sure my errors</w:t>
+      </w:r>
+      <w:r>
+        <w:rPr>
+          <w:sz w:val="32"/>
+        </w:rPr>
+        <w:t xml:space="preserve"> are</w:t>
       </w:r>
       <w:bookmarkStart w:id="0" w:name="_GoBack"/>
       <w:bookmarkEnd w:id="0"/>
+      <w:r>
+        <w:rPr>
+          <w:sz w:val="32"/>
+        </w:rPr>
+        <w:t xml:space="preserve"> clear and understandable.</w:t>
+      </w:r>
     </w:p>
     <w:sectPr>
       <w:pgSz w:w="11906" w:h="16838"/>
@@ -1182,6 +1200,23 @@
 </file>
 
 <file path=customXml/item1.xml><?xml version="1.0" encoding="utf-8"?>
+<p:properties xmlns:p="http://schemas.microsoft.com/office/2006/metadata/properties" xmlns:xsi="http://www.w3.org/2001/XMLSchema-instance" xmlns:pc="http://schemas.microsoft.com/office/infopath/2007/PartnerControls">
+  <documentManagement>
+    <_activity xmlns="18287d57-4f0a-480d-ad86-c9ee94dcacf3" xsi:nil="true"/>
+  </documentManagement>
+</p:properties>
+</file>
+
+<file path=customXml/item2.xml><?xml version="1.0" encoding="utf-8"?>
+<?mso-contentType ?>
+<FormTemplates xmlns="http://schemas.microsoft.com/sharepoint/v3/contenttype/forms">
+  <Display>DocumentLibraryForm</Display>
+  <Edit>DocumentLibraryForm</Edit>
+  <New>DocumentLibraryForm</New>
+</FormTemplates>
+</file>
+
+<file path=customXml/item3.xml><?xml version="1.0" encoding="utf-8"?>
 <ct:contentTypeSchema xmlns:ct="http://schemas.microsoft.com/office/2006/metadata/contentType" xmlns:ma="http://schemas.microsoft.com/office/2006/metadata/properties/metaAttributes" ct:_="" ma:_="" ma:contentTypeName="Document" ma:contentTypeID="0x01010022BB3F6B8131D840BF96BCF4A4EF84F9" ma:contentTypeVersion="10" ma:contentTypeDescription="Create a new document." ma:contentTypeScope="" ma:versionID="0709e0e00c1628ada2952a194b352c4c">
   <xsd:schema xmlns:xsd="http://www.w3.org/2001/XMLSchema" xmlns:xs="http://www.w3.org/2001/XMLSchema" xmlns:p="http://schemas.microsoft.com/office/2006/metadata/properties" xmlns:ns3="18287d57-4f0a-480d-ad86-c9ee94dcacf3" targetNamespace="http://schemas.microsoft.com/office/2006/metadata/properties" ma:root="true" ma:fieldsID="015a3f7c76741bc21ba02f2dd042d1e6" ns3:_="">
     <xsd:import namespace="18287d57-4f0a-480d-ad86-c9ee94dcacf3"/>
@@ -1363,24 +1398,31 @@
 </ct:contentTypeSchema>
 </file>
 
-<file path=customXml/item2.xml><?xml version="1.0" encoding="utf-8"?>
-<?mso-contentType ?>
-<FormTemplates xmlns="http://schemas.microsoft.com/sharepoint/v3/contenttype/forms">
-  <Display>DocumentLibraryForm</Display>
-  <Edit>DocumentLibraryForm</Edit>
-  <New>DocumentLibraryForm</New>
-</FormTemplates>
+<file path=customXml/itemProps1.xml><?xml version="1.0" encoding="utf-8"?>
+<ds:datastoreItem xmlns:ds="http://schemas.openxmlformats.org/officeDocument/2006/customXml" ds:itemID="{64618EF6-6623-4DC4-AAB5-0FCDD6983B68}">
+  <ds:schemaRefs>
+    <ds:schemaRef ds:uri="http://schemas.microsoft.com/office/2006/documentManagement/types"/>
+    <ds:schemaRef ds:uri="http://purl.org/dc/terms/"/>
+    <ds:schemaRef ds:uri="http://schemas.microsoft.com/office/infopath/2007/PartnerControls"/>
+    <ds:schemaRef ds:uri="http://www.w3.org/XML/1998/namespace"/>
+    <ds:schemaRef ds:uri="18287d57-4f0a-480d-ad86-c9ee94dcacf3"/>
+    <ds:schemaRef ds:uri="http://schemas.microsoft.com/office/2006/metadata/properties"/>
+    <ds:schemaRef ds:uri="http://schemas.openxmlformats.org/package/2006/metadata/core-properties"/>
+    <ds:schemaRef ds:uri="http://purl.org/dc/dcmitype/"/>
+    <ds:schemaRef ds:uri="http://purl.org/dc/elements/1.1/"/>
+  </ds:schemaRefs>
+</ds:datastoreItem>
 </file>
 
-<file path=customXml/item3.xml><?xml version="1.0" encoding="utf-8"?>
-<p:properties xmlns:p="http://schemas.microsoft.com/office/2006/metadata/properties" xmlns:xsi="http://www.w3.org/2001/XMLSchema-instance" xmlns:pc="http://schemas.microsoft.com/office/infopath/2007/PartnerControls">
-  <documentManagement>
-    <_activity xmlns="18287d57-4f0a-480d-ad86-c9ee94dcacf3" xsi:nil="true"/>
-  </documentManagement>
-</p:properties>
+<file path=customXml/itemProps2.xml><?xml version="1.0" encoding="utf-8"?>
+<ds:datastoreItem xmlns:ds="http://schemas.openxmlformats.org/officeDocument/2006/customXml" ds:itemID="{B0A76E36-1CD7-4800-A269-A83947C5CADC}">
+  <ds:schemaRefs>
+    <ds:schemaRef ds:uri="http://schemas.microsoft.com/sharepoint/v3/contenttype/forms"/>
+  </ds:schemaRefs>
+</ds:datastoreItem>
 </file>
 
-<file path=customXml/itemProps1.xml><?xml version="1.0" encoding="utf-8"?>
+<file path=customXml/itemProps3.xml><?xml version="1.0" encoding="utf-8"?>
 <ds:datastoreItem xmlns:ds="http://schemas.openxmlformats.org/officeDocument/2006/customXml" ds:itemID="{7B03F66D-B961-483C-B46B-B2DB333DF10C}">
   <ds:schemaRefs>
     <ds:schemaRef ds:uri="http://schemas.microsoft.com/office/2006/metadata/contentType"/>
@@ -1396,28 +1438,4 @@
     <ds:schemaRef ds:uri="http://schemas.microsoft.com/internal/obd"/>
   </ds:schemaRefs>
 </ds:datastoreItem>
-</file>
-
-<file path=customXml/itemProps2.xml><?xml version="1.0" encoding="utf-8"?>
-<ds:datastoreItem xmlns:ds="http://schemas.openxmlformats.org/officeDocument/2006/customXml" ds:itemID="{B0A76E36-1CD7-4800-A269-A83947C5CADC}">
-  <ds:schemaRefs>
-    <ds:schemaRef ds:uri="http://schemas.microsoft.com/sharepoint/v3/contenttype/forms"/>
-  </ds:schemaRefs>
-</ds:datastoreItem>
-</file>
-
-<file path=customXml/itemProps3.xml><?xml version="1.0" encoding="utf-8"?>
-<ds:datastoreItem xmlns:ds="http://schemas.openxmlformats.org/officeDocument/2006/customXml" ds:itemID="{64618EF6-6623-4DC4-AAB5-0FCDD6983B68}">
-  <ds:schemaRefs>
-    <ds:schemaRef ds:uri="http://schemas.microsoft.com/office/2006/documentManagement/types"/>
-    <ds:schemaRef ds:uri="http://purl.org/dc/elements/1.1/"/>
-    <ds:schemaRef ds:uri="http://schemas.microsoft.com/office/2006/metadata/properties"/>
-    <ds:schemaRef ds:uri="http://purl.org/dc/terms/"/>
-    <ds:schemaRef ds:uri="http://schemas.microsoft.com/office/infopath/2007/PartnerControls"/>
-    <ds:schemaRef ds:uri="http://purl.org/dc/dcmitype/"/>
-    <ds:schemaRef ds:uri="http://schemas.openxmlformats.org/package/2006/metadata/core-properties"/>
-    <ds:schemaRef ds:uri="18287d57-4f0a-480d-ad86-c9ee94dcacf3"/>
-    <ds:schemaRef ds:uri="http://www.w3.org/XML/1998/namespace"/>
-  </ds:schemaRefs>
-</ds:datastoreItem>
 </file>
</xml_diff>

<commit_message>
xu lie do the thing
</commit_message>
<xml_diff>
--- a/Analysis.docx
+++ b/Analysis.docx
@@ -1,17 +1,19 @@
 
 <file path=word/document.xml><?xml version="1.0" encoding="utf-8"?>
-<w:document xmlns:wpc="http://schemas.microsoft.com/office/word/2010/wordprocessingCanvas" xmlns:cx="http://schemas.microsoft.com/office/drawing/2014/chartex" xmlns:cx1="http://schemas.microsoft.com/office/drawing/2015/9/8/chartex" xmlns:cx2="http://schemas.microsoft.com/office/drawing/2015/10/21/chartex" xmlns:cx3="http://schemas.microsoft.com/office/drawing/2016/5/9/chartex" xmlns:cx4="http://schemas.microsoft.com/office/drawing/2016/5/10/chartex" xmlns:cx5="http://schemas.microsoft.com/office/drawing/2016/5/11/chartex" xmlns:cx6="http://schemas.microsoft.com/office/drawing/2016/5/12/chartex" xmlns:cx7="http://schemas.microsoft.com/office/drawing/2016/5/13/chartex" xmlns:cx8="http://schemas.microsoft.com/office/drawing/2016/5/14/chartex" xmlns:mc="http://schemas.openxmlformats.org/markup-compatibility/2006" xmlns:aink="http://schemas.microsoft.com/office/drawing/2016/ink" xmlns:am3d="http://schemas.microsoft.com/office/drawing/2017/model3d" xmlns:o="urn:schemas-microsoft-com:office:office" xmlns:r="http://schemas.openxmlformats.org/officeDocument/2006/relationships" xmlns:m="http://schemas.openxmlformats.org/officeDocument/2006/math" xmlns:v="urn:schemas-microsoft-com:vml" xmlns:wp14="http://schemas.microsoft.com/office/word/2010/wordprocessingDrawing" xmlns:wp="http://schemas.openxmlformats.org/drawingml/2006/wordprocessingDrawing" xmlns:w10="urn:schemas-microsoft-com:office:word" xmlns:w="http://schemas.openxmlformats.org/wordprocessingml/2006/main" xmlns:w14="http://schemas.microsoft.com/office/word/2010/wordml" xmlns:w15="http://schemas.microsoft.com/office/word/2012/wordml" xmlns:w16cid="http://schemas.microsoft.com/office/word/2016/wordml/cid" xmlns:w16se="http://schemas.microsoft.com/office/word/2015/wordml/symex" xmlns:wpg="http://schemas.microsoft.com/office/word/2010/wordprocessingGroup" xmlns:wpi="http://schemas.microsoft.com/office/word/2010/wordprocessingInk" xmlns:wne="http://schemas.microsoft.com/office/word/2006/wordml" xmlns:wps="http://schemas.microsoft.com/office/word/2010/wordprocessingShape" mc:Ignorable="w14 w15 w16se w16cid wp14">
+<w:document xmlns:wpc="http://schemas.microsoft.com/office/word/2010/wordprocessingCanvas" xmlns:cx="http://schemas.microsoft.com/office/drawing/2014/chartex" xmlns:cx1="http://schemas.microsoft.com/office/drawing/2015/9/8/chartex" xmlns:cx2="http://schemas.microsoft.com/office/drawing/2015/10/21/chartex" xmlns:cx3="http://schemas.microsoft.com/office/drawing/2016/5/9/chartex" xmlns:cx4="http://schemas.microsoft.com/office/drawing/2016/5/10/chartex" xmlns:cx5="http://schemas.microsoft.com/office/drawing/2016/5/11/chartex" xmlns:cx6="http://schemas.microsoft.com/office/drawing/2016/5/12/chartex" xmlns:cx7="http://schemas.microsoft.com/office/drawing/2016/5/13/chartex" xmlns:cx8="http://schemas.microsoft.com/office/drawing/2016/5/14/chartex" xmlns:mc="http://schemas.openxmlformats.org/markup-compatibility/2006" xmlns:aink="http://schemas.microsoft.com/office/drawing/2016/ink" xmlns:am3d="http://schemas.microsoft.com/office/drawing/2017/model3d" xmlns:o="urn:schemas-microsoft-com:office:office" xmlns:oel="http://schemas.microsoft.com/office/2019/extlst" xmlns:r="http://schemas.openxmlformats.org/officeDocument/2006/relationships" xmlns:m="http://schemas.openxmlformats.org/officeDocument/2006/math" xmlns:v="urn:schemas-microsoft-com:vml" xmlns:wp14="http://schemas.microsoft.com/office/word/2010/wordprocessingDrawing" xmlns:wp="http://schemas.openxmlformats.org/drawingml/2006/wordprocessingDrawing" xmlns:w10="urn:schemas-microsoft-com:office:word" xmlns:w="http://schemas.openxmlformats.org/wordprocessingml/2006/main" xmlns:w14="http://schemas.microsoft.com/office/word/2010/wordml" xmlns:w15="http://schemas.microsoft.com/office/word/2012/wordml" xmlns:w16cex="http://schemas.microsoft.com/office/word/2018/wordml/cex" xmlns:w16cid="http://schemas.microsoft.com/office/word/2016/wordml/cid" xmlns:w16="http://schemas.microsoft.com/office/word/2018/wordml" xmlns:w16du="http://schemas.microsoft.com/office/word/2023/wordml/word16du" xmlns:w16sdtdh="http://schemas.microsoft.com/office/word/2020/wordml/sdtdatahash" xmlns:w16sdtfl="http://schemas.microsoft.com/office/word/2024/wordml/sdtformatlock" xmlns:w16se="http://schemas.microsoft.com/office/word/2015/wordml/symex" xmlns:wpg="http://schemas.microsoft.com/office/word/2010/wordprocessingGroup" xmlns:wpi="http://schemas.microsoft.com/office/word/2010/wordprocessingInk" xmlns:wne="http://schemas.microsoft.com/office/word/2006/wordml" xmlns:wps="http://schemas.microsoft.com/office/word/2010/wordprocessingShape" mc:Ignorable="w14 w15 w16se w16cid w16 w16cex w16sdtdh w16sdtfl w16du wp14">
   <w:body>
     <w:p>
       <w:pPr>
         <w:jc w:val="right"/>
         <w:rPr>
-          <w:sz w:val="40"/>
-        </w:rPr>
-      </w:pPr>
-      <w:r>
-        <w:rPr>
-          <w:sz w:val="40"/>
+          <w:sz w:val="24"/>
+          <w:szCs w:val="24"/>
+        </w:rPr>
+      </w:pPr>
+      <w:r>
+        <w:rPr>
+          <w:sz w:val="24"/>
+          <w:szCs w:val="24"/>
         </w:rPr>
         <w:t>Matt Price</w:t>
       </w:r>
@@ -20,12 +22,14 @@
       <w:pPr>
         <w:jc w:val="right"/>
         <w:rPr>
-          <w:sz w:val="40"/>
-        </w:rPr>
-      </w:pPr>
-      <w:r>
-        <w:rPr>
-          <w:sz w:val="40"/>
+          <w:sz w:val="24"/>
+          <w:szCs w:val="24"/>
+        </w:rPr>
+      </w:pPr>
+      <w:r>
+        <w:rPr>
+          <w:sz w:val="24"/>
+          <w:szCs w:val="24"/>
         </w:rPr>
         <w:t xml:space="preserve">Centre No.: 15162 </w:t>
       </w:r>
@@ -35,7 +39,8 @@
         <w:jc w:val="right"/>
         <w:rPr>
           <w:color w:val="002060"/>
-          <w:sz w:val="40"/>
+          <w:sz w:val="24"/>
+          <w:szCs w:val="24"/>
           <w14:textOutline w14:w="0" w14:cap="rnd" w14:cmpd="sng" w14:algn="ctr">
             <w14:solidFill>
               <w14:schemeClr w14:val="accent1"/>
@@ -47,14 +52,16 @@
       </w:pPr>
       <w:r>
         <w:rPr>
-          <w:sz w:val="40"/>
+          <w:sz w:val="24"/>
+          <w:szCs w:val="24"/>
         </w:rPr>
         <w:t xml:space="preserve">Candidate Number: </w:t>
       </w:r>
       <w:r>
         <w:rPr>
           <w:color w:val="002060"/>
-          <w:sz w:val="40"/>
+          <w:sz w:val="24"/>
+          <w:szCs w:val="24"/>
           <w14:textOutline w14:w="0" w14:cap="rnd" w14:cmpd="sng" w14:algn="ctr">
             <w14:solidFill>
               <w14:schemeClr w14:val="accent1"/>
@@ -70,12 +77,14 @@
       <w:pPr>
         <w:jc w:val="right"/>
         <w:rPr>
-          <w:sz w:val="40"/>
-        </w:rPr>
-      </w:pPr>
-      <w:r>
-        <w:rPr>
-          <w:sz w:val="40"/>
+          <w:sz w:val="24"/>
+          <w:szCs w:val="24"/>
+        </w:rPr>
+      </w:pPr>
+      <w:r>
+        <w:rPr>
+          <w:sz w:val="24"/>
+          <w:szCs w:val="24"/>
         </w:rPr>
         <w:t>Component 7517/C</w:t>
       </w:r>
@@ -84,20 +93,23 @@
       <w:pPr>
         <w:jc w:val="center"/>
         <w:rPr>
-          <w:sz w:val="72"/>
-        </w:rPr>
-      </w:pPr>
-    </w:p>
-    <w:p>
-      <w:pPr>
-        <w:rPr>
-          <w:sz w:val="36"/>
-          <w:u w:val="single"/>
-        </w:rPr>
-      </w:pPr>
-      <w:r>
-        <w:rPr>
-          <w:sz w:val="36"/>
+          <w:sz w:val="24"/>
+          <w:szCs w:val="24"/>
+        </w:rPr>
+      </w:pPr>
+    </w:p>
+    <w:p>
+      <w:pPr>
+        <w:rPr>
+          <w:sz w:val="24"/>
+          <w:szCs w:val="24"/>
+          <w:u w:val="single"/>
+        </w:rPr>
+      </w:pPr>
+      <w:r>
+        <w:rPr>
+          <w:sz w:val="24"/>
+          <w:szCs w:val="24"/>
           <w:u w:val="single"/>
         </w:rPr>
         <w:t>Introduction:</w:t>
@@ -106,18 +118,21 @@
     <w:p>
       <w:pPr>
         <w:rPr>
-          <w:sz w:val="32"/>
-        </w:rPr>
-      </w:pPr>
-      <w:r>
-        <w:rPr>
-          <w:sz w:val="32"/>
+          <w:sz w:val="24"/>
+          <w:szCs w:val="24"/>
+        </w:rPr>
+      </w:pPr>
+      <w:r>
+        <w:rPr>
+          <w:sz w:val="24"/>
+          <w:szCs w:val="24"/>
         </w:rPr>
         <w:t xml:space="preserve">My project is to design a working AQA Assembly interpreter which will </w:t>
       </w:r>
       <w:r>
         <w:rPr>
-          <w:sz w:val="32"/>
+          <w:sz w:val="24"/>
+          <w:szCs w:val="24"/>
         </w:rPr>
         <w:t>allow a user to write their own code into a file, which is then run, and the output of the program is outputted into the terminal.</w:t>
       </w:r>
@@ -125,13 +140,15 @@
     <w:p>
       <w:pPr>
         <w:rPr>
-          <w:sz w:val="36"/>
-          <w:u w:val="single"/>
-        </w:rPr>
-      </w:pPr>
-      <w:r>
-        <w:rPr>
-          <w:sz w:val="36"/>
+          <w:sz w:val="24"/>
+          <w:szCs w:val="24"/>
+          <w:u w:val="single"/>
+        </w:rPr>
+      </w:pPr>
+      <w:r>
+        <w:rPr>
+          <w:sz w:val="24"/>
+          <w:szCs w:val="24"/>
           <w:u w:val="single"/>
         </w:rPr>
         <w:t>Background:</w:t>
@@ -140,106 +157,50 @@
     <w:p>
       <w:pPr>
         <w:rPr>
-          <w:sz w:val="32"/>
-        </w:rPr>
-      </w:pPr>
-      <w:r>
-        <w:rPr>
-          <w:sz w:val="32"/>
-        </w:rPr>
-        <w:t>I would recommend looking over the AQA Instruction Set (</w:t>
-      </w:r>
-      <w:hyperlink r:id="rId7" w:history="1">
-        <w:r>
-          <w:rPr>
-            <w:rStyle w:val="Hyperlink"/>
-            <w:sz w:val="32"/>
-          </w:rPr>
-          <w:t>here</w:t>
-        </w:r>
-      </w:hyperlink>
-      <w:r>
-        <w:rPr>
-          <w:sz w:val="32"/>
-        </w:rPr>
-        <w:t>), and ensuring you understand Python 3.</w:t>
-      </w:r>
-    </w:p>
-    <w:p>
-      <w:pPr>
-        <w:rPr>
-          <w:sz w:val="36"/>
-          <w:u w:val="single"/>
-        </w:rPr>
-      </w:pPr>
-      <w:r>
-        <w:rPr>
-          <w:sz w:val="36"/>
-          <w:u w:val="single"/>
-        </w:rPr>
-        <w:t>Research:</w:t>
-      </w:r>
-    </w:p>
-    <w:p>
-      <w:pPr>
-        <w:rPr>
-          <w:sz w:val="32"/>
-        </w:rPr>
-      </w:pPr>
-      <w:r>
-        <w:rPr>
-          <w:sz w:val="32"/>
-        </w:rPr>
-        <w:t>To research for this project, I have spoken with my fellow students to see what they would like in an assembly program. To aid with this, I created a form in which the others could outline their wishes. I received 9 respon</w:t>
-      </w:r>
-      <w:r>
-        <w:rPr>
-          <w:sz w:val="32"/>
-        </w:rPr>
-        <w:t>s</w:t>
-      </w:r>
-      <w:r>
-        <w:rPr>
-          <w:sz w:val="32"/>
-        </w:rPr>
-        <w:t>es,</w:t>
-      </w:r>
-      <w:r>
-        <w:rPr>
-          <w:sz w:val="32"/>
-        </w:rPr>
-        <w:t xml:space="preserve"> a notable desire being to have descriptive error messages and showing syntax errors</w:t>
-      </w:r>
-      <w:r>
-        <w:rPr>
-          <w:sz w:val="32"/>
-        </w:rPr>
-        <w:t>.</w:t>
-      </w:r>
-    </w:p>
-    <w:p>
-      <w:pPr>
-        <w:rPr>
-          <w:sz w:val="32"/>
-        </w:rPr>
-      </w:pPr>
-      <w:r>
-        <w:rPr>
-          <w:sz w:val="32"/>
-        </w:rPr>
-        <w:lastRenderedPageBreak/>
-        <w:t xml:space="preserve">I also looked at the AQA Assembly Language Simulator created by Peter Higginson, shown below. </w:t>
-      </w:r>
-      <w:r>
-        <w:rPr>
-          <w:noProof/>
-          <w:sz w:val="32"/>
+          <w:sz w:val="24"/>
+          <w:szCs w:val="24"/>
+        </w:rPr>
+      </w:pPr>
+      <w:r>
+        <w:rPr>
+          <w:sz w:val="24"/>
+          <w:szCs w:val="24"/>
+        </w:rPr>
+        <w:t xml:space="preserve">For this A Level, we must know and be able to program in assembly. This is at times more difficult than a normal language, as it is hard to know whether your program has run correctly without running it by hand, line by line. My aim is to create a program which can execute your program and help you debug it. </w:t>
+      </w:r>
+    </w:p>
+    <w:p>
+      <w:pPr>
+        <w:rPr>
+          <w:sz w:val="24"/>
+          <w:szCs w:val="24"/>
+        </w:rPr>
+      </w:pPr>
+      <w:r>
+        <w:rPr>
+          <w:sz w:val="24"/>
+          <w:szCs w:val="24"/>
+        </w:rPr>
+        <w:t>The photo below is my initial plan of my project, which I added to over the course of my NEA.</w:t>
+      </w:r>
+    </w:p>
+    <w:p>
+      <w:pPr>
+        <w:rPr>
+          <w:sz w:val="24"/>
+          <w:szCs w:val="24"/>
+        </w:rPr>
+      </w:pPr>
+      <w:r>
+        <w:rPr>
+          <w:sz w:val="24"/>
+          <w:szCs w:val="24"/>
         </w:rPr>
         <w:drawing>
-          <wp:inline distT="0" distB="0" distL="0" distR="0" wp14:anchorId="5C459F81" wp14:editId="571AD612">
-            <wp:extent cx="5731510" cy="4060825"/>
+          <wp:inline distT="0" distB="0" distL="0" distR="0" wp14:anchorId="1BB84933" wp14:editId="180E7CC2">
+            <wp:extent cx="5731510" cy="3377565"/>
             <wp:effectExtent l="0" t="0" r="2540" b="0"/>
-            <wp:docPr id="1" name="Picture 1"/>
+            <wp:docPr id="998345261" name="Picture 1"/>
             <wp:cNvGraphicFramePr>
               <a:graphicFrameLocks xmlns:a="http://schemas.openxmlformats.org/drawingml/2006/main" noChangeAspect="1"/>
             </wp:cNvGraphicFramePr>
@@ -247,7 +208,7 @@
               <a:graphicData uri="http://schemas.openxmlformats.org/drawingml/2006/picture">
                 <pic:pic xmlns:pic="http://schemas.openxmlformats.org/drawingml/2006/picture">
                   <pic:nvPicPr>
-                    <pic:cNvPr id="1" name=""/>
+                    <pic:cNvPr id="998345261" name=""/>
                     <pic:cNvPicPr/>
                   </pic:nvPicPr>
                   <pic:blipFill>
@@ -259,7 +220,7 @@
                   <pic:spPr>
                     <a:xfrm>
                       <a:off x="0" y="0"/>
-                      <a:ext cx="5731510" cy="4060825"/>
+                      <a:ext cx="5731510" cy="3377565"/>
                     </a:xfrm>
                     <a:prstGeom prst="rect">
                       <a:avLst/>
@@ -275,73 +236,116 @@
     <w:p>
       <w:pPr>
         <w:rPr>
-          <w:sz w:val="32"/>
-        </w:rPr>
-      </w:pPr>
-      <w:r>
-        <w:rPr>
-          <w:sz w:val="32"/>
-        </w:rPr>
-        <w:t>Looking at it, its error handling system is verbose, telling you which line is having the error, and letting you look at the memory directly. This gave me a good ideal to strive for, and inspired me to try to use a website to host the program and let users input their programs from there.</w:t>
-      </w:r>
-    </w:p>
-    <w:p>
-      <w:pPr>
-        <w:rPr>
-          <w:sz w:val="32"/>
-        </w:rPr>
-      </w:pPr>
-      <w:r>
-        <w:rPr>
-          <w:sz w:val="32"/>
-        </w:rPr>
-        <w:t>This created a technical challenge in my project - creating a server and having it available for an end user, and parsing their program, as I cannot ensure they write their code exactly how I would like them to.</w:t>
-      </w:r>
-      <w:r>
-        <w:rPr>
-          <w:sz w:val="32"/>
-        </w:rPr>
-        <w:t xml:space="preserve"> Through further research I found Flask, a python module which aids in the creation of a server. This would prove very useful, allowing me to make my server online.</w:t>
-      </w:r>
-    </w:p>
-    <w:p>
-      <w:pPr>
-        <w:rPr>
-          <w:sz w:val="36"/>
-          <w:u w:val="single"/>
-        </w:rPr>
-      </w:pPr>
-      <w:r>
-        <w:rPr>
-          <w:sz w:val="36"/>
-          <w:u w:val="single"/>
-        </w:rPr>
+          <w:sz w:val="24"/>
+          <w:szCs w:val="24"/>
+          <w:u w:val="single"/>
+        </w:rPr>
+      </w:pPr>
+      <w:r>
+        <w:rPr>
+          <w:sz w:val="24"/>
+          <w:szCs w:val="24"/>
+          <w:u w:val="single"/>
+        </w:rPr>
+        <w:t>Research:</w:t>
+      </w:r>
+    </w:p>
+    <w:p>
+      <w:pPr>
+        <w:rPr>
+          <w:sz w:val="24"/>
+          <w:szCs w:val="24"/>
+        </w:rPr>
+      </w:pPr>
+      <w:r>
+        <w:rPr>
+          <w:sz w:val="24"/>
+          <w:szCs w:val="24"/>
+        </w:rPr>
+        <w:t>To research for this project, I have spoken with my fellow students to see what they would like in an assembly program. To aid with this, I created a form in which the others could outline their wishes. I received 9 respon</w:t>
+      </w:r>
+      <w:r>
+        <w:rPr>
+          <w:sz w:val="24"/>
+          <w:szCs w:val="24"/>
+        </w:rPr>
+        <w:t>s</w:t>
+      </w:r>
+      <w:r>
+        <w:rPr>
+          <w:sz w:val="24"/>
+          <w:szCs w:val="24"/>
+        </w:rPr>
+        <w:t>es,</w:t>
+      </w:r>
+      <w:r>
+        <w:rPr>
+          <w:sz w:val="24"/>
+          <w:szCs w:val="24"/>
+        </w:rPr>
+        <w:t xml:space="preserve"> a notable desire being to have descriptive error messages and showing syntax errors</w:t>
+      </w:r>
+      <w:r>
+        <w:rPr>
+          <w:sz w:val="24"/>
+          <w:szCs w:val="24"/>
+        </w:rPr>
+        <w:t>.</w:t>
+      </w:r>
+    </w:p>
+    <w:p>
+      <w:pPr>
+        <w:rPr>
+          <w:sz w:val="24"/>
+          <w:szCs w:val="24"/>
+          <w:u w:val="single"/>
+        </w:rPr>
+      </w:pPr>
+      <w:r>
+        <w:rPr>
+          <w:sz w:val="24"/>
+          <w:szCs w:val="24"/>
+          <w:u w:val="single"/>
+        </w:rPr>
+        <w:lastRenderedPageBreak/>
         <w:t>User:</w:t>
       </w:r>
     </w:p>
     <w:p>
       <w:pPr>
         <w:rPr>
-          <w:sz w:val="32"/>
-        </w:rPr>
-      </w:pPr>
-      <w:r>
-        <w:rPr>
-          <w:sz w:val="32"/>
-        </w:rPr>
-        <w:t xml:space="preserve">The form I sent to my fellow students was very insightful. After looking over each response I put their main points into a word cloud, </w:t>
-      </w:r>
-      <w:r>
-        <w:rPr>
-          <w:sz w:val="32"/>
-        </w:rPr>
-        <w:lastRenderedPageBreak/>
-        <w:t xml:space="preserve">helping me visualise what would be good to put into my program. </w:t>
-      </w:r>
-      <w:r>
-        <w:rPr>
-          <w:noProof/>
-          <w:sz w:val="32"/>
+          <w:sz w:val="24"/>
+          <w:szCs w:val="24"/>
+        </w:rPr>
+      </w:pPr>
+      <w:r>
+        <w:rPr>
+          <w:sz w:val="24"/>
+          <w:szCs w:val="24"/>
+        </w:rPr>
+        <w:t xml:space="preserve">The form I sent to my fellow students was very insightful. After </w:t>
+      </w:r>
+      <w:proofErr w:type="gramStart"/>
+      <w:r>
+        <w:rPr>
+          <w:sz w:val="24"/>
+          <w:szCs w:val="24"/>
+        </w:rPr>
+        <w:t>looking over each response</w:t>
+      </w:r>
+      <w:proofErr w:type="gramEnd"/>
+      <w:r>
+        <w:rPr>
+          <w:sz w:val="24"/>
+          <w:szCs w:val="24"/>
+        </w:rPr>
+        <w:t xml:space="preserve"> I put their main points into a word cloud, helping me visualise what would be good to put into my program. </w:t>
+      </w:r>
+      <w:r>
+        <w:rPr>
+          <w:noProof/>
+          <w:sz w:val="24"/>
+          <w:szCs w:val="24"/>
         </w:rPr>
         <w:drawing>
           <wp:inline distT="0" distB="0" distL="0" distR="0" wp14:anchorId="12FF3419" wp14:editId="094A18C3">
@@ -383,52 +387,1711 @@
     <w:p>
       <w:pPr>
         <w:rPr>
-          <w:sz w:val="32"/>
-        </w:rPr>
-      </w:pPr>
-      <w:r>
-        <w:rPr>
-          <w:sz w:val="32"/>
+          <w:sz w:val="24"/>
+          <w:szCs w:val="24"/>
+        </w:rPr>
+      </w:pPr>
+      <w:r>
+        <w:rPr>
+          <w:sz w:val="24"/>
+          <w:szCs w:val="24"/>
         </w:rPr>
         <w:t xml:space="preserve">From this I </w:t>
       </w:r>
       <w:r>
         <w:rPr>
-          <w:sz w:val="32"/>
+          <w:sz w:val="24"/>
+          <w:szCs w:val="24"/>
         </w:rPr>
         <w:t>noted that I should</w:t>
       </w:r>
       <w:r>
         <w:rPr>
-          <w:sz w:val="32"/>
+          <w:sz w:val="24"/>
+          <w:szCs w:val="24"/>
         </w:rPr>
         <w:t xml:space="preserve"> </w:t>
       </w:r>
       <w:r>
         <w:rPr>
-          <w:sz w:val="32"/>
+          <w:sz w:val="24"/>
+          <w:szCs w:val="24"/>
         </w:rPr>
         <w:t>en</w:t>
       </w:r>
       <w:r>
         <w:rPr>
-          <w:sz w:val="32"/>
+          <w:sz w:val="24"/>
+          <w:szCs w:val="24"/>
         </w:rPr>
         <w:t>sure my errors</w:t>
       </w:r>
       <w:r>
         <w:rPr>
-          <w:sz w:val="32"/>
+          <w:sz w:val="24"/>
+          <w:szCs w:val="24"/>
         </w:rPr>
         <w:t xml:space="preserve"> are</w:t>
       </w:r>
-      <w:bookmarkStart w:id="0" w:name="_GoBack"/>
-      <w:bookmarkEnd w:id="0"/>
-      <w:r>
-        <w:rPr>
-          <w:sz w:val="32"/>
+      <w:r>
+        <w:rPr>
+          <w:sz w:val="24"/>
+          <w:szCs w:val="24"/>
         </w:rPr>
         <w:t xml:space="preserve"> clear and understandable.</w:t>
+      </w:r>
+    </w:p>
+    <w:p>
+      <w:pPr>
+        <w:rPr>
+          <w:sz w:val="24"/>
+          <w:szCs w:val="24"/>
+          <w:u w:val="single"/>
+        </w:rPr>
+      </w:pPr>
+      <w:r>
+        <w:rPr>
+          <w:sz w:val="24"/>
+          <w:szCs w:val="24"/>
+          <w:u w:val="single"/>
+        </w:rPr>
+        <w:t>Similar Solutions:</w:t>
+      </w:r>
+    </w:p>
+    <w:p>
+      <w:pPr>
+        <w:rPr>
+          <w:noProof/>
+        </w:rPr>
+      </w:pPr>
+      <w:r>
+        <w:rPr>
+          <w:sz w:val="24"/>
+          <w:szCs w:val="24"/>
+        </w:rPr>
+        <w:t>As I was researching this topic,</w:t>
+      </w:r>
+      <w:r>
+        <w:rPr>
+          <w:sz w:val="24"/>
+          <w:szCs w:val="24"/>
+        </w:rPr>
+        <w:t xml:space="preserve"> </w:t>
+      </w:r>
+      <w:r>
+        <w:rPr>
+          <w:sz w:val="24"/>
+          <w:szCs w:val="24"/>
+        </w:rPr>
+        <w:t xml:space="preserve">I found the </w:t>
+      </w:r>
+      <w:hyperlink r:id="rId10" w:history="1">
+        <w:r>
+          <w:rPr>
+            <w:rStyle w:val="Hyperlink"/>
+            <w:sz w:val="24"/>
+            <w:szCs w:val="24"/>
+          </w:rPr>
+          <w:t>AQA Assembly Langu</w:t>
+        </w:r>
+        <w:r>
+          <w:rPr>
+            <w:rStyle w:val="Hyperlink"/>
+            <w:sz w:val="24"/>
+            <w:szCs w:val="24"/>
+          </w:rPr>
+          <w:t>a</w:t>
+        </w:r>
+        <w:r>
+          <w:rPr>
+            <w:rStyle w:val="Hyperlink"/>
+            <w:sz w:val="24"/>
+            <w:szCs w:val="24"/>
+          </w:rPr>
+          <w:t>ge Simulator by Peter Higginson</w:t>
+        </w:r>
+      </w:hyperlink>
+      <w:r>
+        <w:rPr>
+          <w:sz w:val="24"/>
+          <w:szCs w:val="24"/>
+        </w:rPr>
+        <w:t>.</w:t>
+      </w:r>
+      <w:r>
+        <w:rPr>
+          <w:noProof/>
+        </w:rPr>
+        <w:t xml:space="preserve"> </w:t>
+      </w:r>
+      <w:r>
+        <w:rPr>
+          <w:sz w:val="24"/>
+          <w:szCs w:val="24"/>
+        </w:rPr>
+        <w:drawing>
+          <wp:inline distT="0" distB="0" distL="0" distR="0" wp14:anchorId="42352DEA" wp14:editId="5C61F502">
+            <wp:extent cx="5731510" cy="4058920"/>
+            <wp:effectExtent l="0" t="0" r="2540" b="0"/>
+            <wp:docPr id="1689027074" name="Picture 1"/>
+            <wp:cNvGraphicFramePr>
+              <a:graphicFrameLocks xmlns:a="http://schemas.openxmlformats.org/drawingml/2006/main" noChangeAspect="1"/>
+            </wp:cNvGraphicFramePr>
+            <a:graphic xmlns:a="http://schemas.openxmlformats.org/drawingml/2006/main">
+              <a:graphicData uri="http://schemas.openxmlformats.org/drawingml/2006/picture">
+                <pic:pic xmlns:pic="http://schemas.openxmlformats.org/drawingml/2006/picture">
+                  <pic:nvPicPr>
+                    <pic:cNvPr id="1689027074" name=""/>
+                    <pic:cNvPicPr/>
+                  </pic:nvPicPr>
+                  <pic:blipFill>
+                    <a:blip r:embed="rId11"/>
+                    <a:stretch>
+                      <a:fillRect/>
+                    </a:stretch>
+                  </pic:blipFill>
+                  <pic:spPr>
+                    <a:xfrm>
+                      <a:off x="0" y="0"/>
+                      <a:ext cx="5731510" cy="4058920"/>
+                    </a:xfrm>
+                    <a:prstGeom prst="rect">
+                      <a:avLst/>
+                    </a:prstGeom>
+                  </pic:spPr>
+                </pic:pic>
+              </a:graphicData>
+            </a:graphic>
+          </wp:inline>
+        </w:drawing>
+      </w:r>
+    </w:p>
+    <w:p>
+      <w:pPr>
+        <w:rPr>
+          <w:noProof/>
+          <w:u w:val="single"/>
+        </w:rPr>
+      </w:pPr>
+      <w:r>
+        <w:rPr>
+          <w:noProof/>
+          <w:u w:val="single"/>
+        </w:rPr>
+        <w:lastRenderedPageBreak/>
+        <w:t>Key benefits:</w:t>
+      </w:r>
+    </w:p>
+    <w:p>
+      <w:pPr>
+        <w:pStyle w:val="ListParagraph"/>
+        <w:numPr>
+          <w:ilvl w:val="0"/>
+          <w:numId w:val="1"/>
+        </w:numPr>
+        <w:rPr>
+          <w:noProof/>
+          <w:u w:val="single"/>
+        </w:rPr>
+      </w:pPr>
+      <w:r>
+        <w:rPr>
+          <w:noProof/>
+        </w:rPr>
+        <w:t>Simple layout makes it easy to understand what is happening.</w:t>
+      </w:r>
+    </w:p>
+    <w:p>
+      <w:pPr>
+        <w:pStyle w:val="ListParagraph"/>
+        <w:numPr>
+          <w:ilvl w:val="0"/>
+          <w:numId w:val="1"/>
+        </w:numPr>
+        <w:rPr>
+          <w:noProof/>
+          <w:u w:val="single"/>
+        </w:rPr>
+      </w:pPr>
+      <w:r>
+        <w:rPr>
+          <w:noProof/>
+        </w:rPr>
+        <w:t>Data transfer is shown to the user, at chosen speeds, which makes errors faster to spot.</w:t>
+      </w:r>
+    </w:p>
+    <w:p>
+      <w:pPr>
+        <w:pStyle w:val="ListParagraph"/>
+        <w:numPr>
+          <w:ilvl w:val="0"/>
+          <w:numId w:val="1"/>
+        </w:numPr>
+        <w:rPr>
+          <w:noProof/>
+          <w:u w:val="single"/>
+        </w:rPr>
+      </w:pPr>
+      <w:r>
+        <w:rPr>
+          <w:noProof/>
+        </w:rPr>
+        <w:t>Full fetch-decode-execute cycle is shown to the user, aiding revision of said cycle.</w:t>
+      </w:r>
+    </w:p>
+    <w:p>
+      <w:pPr>
+        <w:pStyle w:val="ListParagraph"/>
+        <w:numPr>
+          <w:ilvl w:val="0"/>
+          <w:numId w:val="1"/>
+        </w:numPr>
+        <w:rPr>
+          <w:noProof/>
+          <w:u w:val="single"/>
+        </w:rPr>
+      </w:pPr>
+      <w:r>
+        <w:rPr>
+          <w:noProof/>
+        </w:rPr>
+        <w:t>Errors show the line the error occurs and a simple summary of the error, which aids debugging</w:t>
+      </w:r>
+    </w:p>
+    <w:p>
+      <w:pPr>
+        <w:pStyle w:val="ListParagraph"/>
+        <w:numPr>
+          <w:ilvl w:val="0"/>
+          <w:numId w:val="1"/>
+        </w:numPr>
+        <w:rPr>
+          <w:noProof/>
+          <w:u w:val="single"/>
+        </w:rPr>
+      </w:pPr>
+      <w:r>
+        <w:rPr>
+          <w:noProof/>
+        </w:rPr>
+        <w:t>Program is compiled into memory, allowing for errors to be spotted before runtime</w:t>
+      </w:r>
+    </w:p>
+    <w:p>
+      <w:pPr>
+        <w:pStyle w:val="ListParagraph"/>
+        <w:numPr>
+          <w:ilvl w:val="0"/>
+          <w:numId w:val="1"/>
+        </w:numPr>
+        <w:rPr>
+          <w:noProof/>
+          <w:u w:val="single"/>
+        </w:rPr>
+      </w:pPr>
+      <w:r>
+        <w:rPr>
+          <w:noProof/>
+        </w:rPr>
+        <w:t>Von Neumann Architecture, i.e instructio</w:t>
+      </w:r>
+      <w:r>
+        <w:rPr>
+          <w:noProof/>
+        </w:rPr>
+        <w:t>ns and data stored in the same memory block</w:t>
+      </w:r>
+    </w:p>
+    <w:p>
+      <w:pPr>
+        <w:rPr>
+          <w:noProof/>
+        </w:rPr>
+      </w:pPr>
+      <w:r>
+        <w:rPr>
+          <w:noProof/>
+        </w:rPr>
+        <w:t xml:space="preserve">As you run your program, it shows the data being sent between the registers and runs the program line by line. This helped me to decide to create </w:t>
+      </w:r>
+      <w:r>
+        <w:rPr>
+          <w:noProof/>
+        </w:rPr>
+        <w:t>a</w:t>
+      </w:r>
+      <w:r>
+        <w:rPr>
+          <w:noProof/>
+        </w:rPr>
+        <w:t xml:space="preserve"> compiler</w:t>
+      </w:r>
+      <w:r>
+        <w:rPr>
+          <w:noProof/>
+        </w:rPr>
+        <w:t xml:space="preserve"> instead of an interpreter</w:t>
+      </w:r>
+      <w:r>
+        <w:rPr>
+          <w:noProof/>
+        </w:rPr>
+        <w:t xml:space="preserve">, as it would allow </w:t>
+      </w:r>
+      <w:r>
+        <w:rPr>
+          <w:noProof/>
+        </w:rPr>
+        <w:t xml:space="preserve">errors to be handled before the program is ran. </w:t>
+      </w:r>
+      <w:r>
+        <w:rPr>
+          <w:noProof/>
+        </w:rPr>
+        <w:t>I also considered showing all the memory as the program is ran, but I chose not to, as it would take too long for the time I have to complete my NEA.</w:t>
+      </w:r>
+      <w:r>
+        <w:rPr>
+          <w:noProof/>
+        </w:rPr>
+        <w:t xml:space="preserve"> It also comes with 6 premade programs, which inspired me to allow users to store programs in a server to be shared with others. </w:t>
+      </w:r>
+      <w:r>
+        <w:rPr>
+          <w:noProof/>
+        </w:rPr>
+        <w:t>The use of Von Neumann architecture also helped me to solve one of my initial problems, which is explained below.</w:t>
+      </w:r>
+    </w:p>
+    <w:p>
+      <w:pPr>
+        <w:rPr>
+          <w:noProof/>
+        </w:rPr>
+      </w:pPr>
+    </w:p>
+    <w:p>
+      <w:pPr>
+        <w:rPr>
+          <w:noProof/>
+        </w:rPr>
+      </w:pPr>
+      <w:r>
+        <w:rPr>
+          <w:noProof/>
+        </w:rPr>
+        <w:t xml:space="preserve">I also found </w:t>
+      </w:r>
+      <w:hyperlink r:id="rId12" w:history="1">
+        <w:r>
+          <w:rPr>
+            <w:rStyle w:val="Hyperlink"/>
+            <w:noProof/>
+          </w:rPr>
+          <w:t>OneCompiler</w:t>
+        </w:r>
+      </w:hyperlink>
+      <w:r>
+        <w:rPr>
+          <w:noProof/>
+        </w:rPr>
+        <w:t xml:space="preserve">, a web-based editor for assembly programs. </w:t>
+      </w:r>
+      <w:r>
+        <w:rPr>
+          <w:noProof/>
+        </w:rPr>
+        <w:drawing>
+          <wp:inline distT="0" distB="0" distL="0" distR="0" wp14:anchorId="0511FAB6" wp14:editId="1A225BCB">
+            <wp:extent cx="5731510" cy="3631565"/>
+            <wp:effectExtent l="0" t="0" r="2540" b="6985"/>
+            <wp:docPr id="1102580056" name="Picture 1"/>
+            <wp:cNvGraphicFramePr>
+              <a:graphicFrameLocks xmlns:a="http://schemas.openxmlformats.org/drawingml/2006/main" noChangeAspect="1"/>
+            </wp:cNvGraphicFramePr>
+            <a:graphic xmlns:a="http://schemas.openxmlformats.org/drawingml/2006/main">
+              <a:graphicData uri="http://schemas.openxmlformats.org/drawingml/2006/picture">
+                <pic:pic xmlns:pic="http://schemas.openxmlformats.org/drawingml/2006/picture">
+                  <pic:nvPicPr>
+                    <pic:cNvPr id="1102580056" name=""/>
+                    <pic:cNvPicPr/>
+                  </pic:nvPicPr>
+                  <pic:blipFill>
+                    <a:blip r:embed="rId13"/>
+                    <a:stretch>
+                      <a:fillRect/>
+                    </a:stretch>
+                  </pic:blipFill>
+                  <pic:spPr>
+                    <a:xfrm>
+                      <a:off x="0" y="0"/>
+                      <a:ext cx="5731510" cy="3631565"/>
+                    </a:xfrm>
+                    <a:prstGeom prst="rect">
+                      <a:avLst/>
+                    </a:prstGeom>
+                  </pic:spPr>
+                </pic:pic>
+              </a:graphicData>
+            </a:graphic>
+          </wp:inline>
+        </w:drawing>
+      </w:r>
+    </w:p>
+    <w:p>
+      <w:pPr>
+        <w:rPr>
+          <w:noProof/>
+          <w:u w:val="single"/>
+        </w:rPr>
+      </w:pPr>
+      <w:r>
+        <w:rPr>
+          <w:noProof/>
+          <w:u w:val="single"/>
+        </w:rPr>
+        <w:t>Key Benefits:</w:t>
+      </w:r>
+    </w:p>
+    <w:p>
+      <w:pPr>
+        <w:pStyle w:val="ListParagraph"/>
+        <w:numPr>
+          <w:ilvl w:val="0"/>
+          <w:numId w:val="1"/>
+        </w:numPr>
+        <w:rPr>
+          <w:sz w:val="24"/>
+          <w:szCs w:val="24"/>
+        </w:rPr>
+      </w:pPr>
+      <w:r>
+        <w:rPr>
+          <w:sz w:val="24"/>
+          <w:szCs w:val="24"/>
+        </w:rPr>
+        <w:t>Verbose error handling to help with coding</w:t>
+      </w:r>
+    </w:p>
+    <w:p>
+      <w:pPr>
+        <w:pStyle w:val="ListParagraph"/>
+        <w:numPr>
+          <w:ilvl w:val="0"/>
+          <w:numId w:val="1"/>
+        </w:numPr>
+        <w:rPr>
+          <w:sz w:val="24"/>
+          <w:szCs w:val="24"/>
+        </w:rPr>
+      </w:pPr>
+      <w:r>
+        <w:rPr>
+          <w:sz w:val="24"/>
+          <w:szCs w:val="24"/>
+        </w:rPr>
+        <w:t>Fast code execution with a timer to show the speed the program ran at, which means prototyping small changes in code will be efficient and not time consuming</w:t>
+      </w:r>
+    </w:p>
+    <w:p>
+      <w:pPr>
+        <w:pStyle w:val="ListParagraph"/>
+        <w:numPr>
+          <w:ilvl w:val="0"/>
+          <w:numId w:val="1"/>
+        </w:numPr>
+        <w:rPr>
+          <w:sz w:val="24"/>
+          <w:szCs w:val="24"/>
+        </w:rPr>
+      </w:pPr>
+      <w:r>
+        <w:rPr>
+          <w:sz w:val="24"/>
+          <w:szCs w:val="24"/>
+        </w:rPr>
+        <w:t>AI Agent to help with solving problems</w:t>
+      </w:r>
+    </w:p>
+    <w:p>
+      <w:pPr>
+        <w:pStyle w:val="ListParagraph"/>
+        <w:numPr>
+          <w:ilvl w:val="0"/>
+          <w:numId w:val="1"/>
+        </w:numPr>
+        <w:rPr>
+          <w:sz w:val="24"/>
+          <w:szCs w:val="24"/>
+        </w:rPr>
+      </w:pPr>
+      <w:r>
+        <w:rPr>
+          <w:sz w:val="24"/>
+          <w:szCs w:val="24"/>
+        </w:rPr>
+        <w:t>Dark mode, which helps reduce eye strain when coding</w:t>
+      </w:r>
+    </w:p>
+    <w:p>
+      <w:pPr>
+        <w:pStyle w:val="ListParagraph"/>
+        <w:numPr>
+          <w:ilvl w:val="0"/>
+          <w:numId w:val="1"/>
+        </w:numPr>
+        <w:rPr>
+          <w:sz w:val="24"/>
+          <w:szCs w:val="24"/>
+        </w:rPr>
+      </w:pPr>
+      <w:r>
+        <w:rPr>
+          <w:sz w:val="24"/>
+          <w:szCs w:val="24"/>
+        </w:rPr>
+        <w:lastRenderedPageBreak/>
+        <w:drawing>
+          <wp:inline distT="0" distB="0" distL="0" distR="0" wp14:anchorId="3D1097A6" wp14:editId="227BB8A3">
+            <wp:extent cx="5731510" cy="1055370"/>
+            <wp:effectExtent l="0" t="0" r="2540" b="0"/>
+            <wp:docPr id="630273873" name="Picture 1"/>
+            <wp:cNvGraphicFramePr>
+              <a:graphicFrameLocks xmlns:a="http://schemas.openxmlformats.org/drawingml/2006/main" noChangeAspect="1"/>
+            </wp:cNvGraphicFramePr>
+            <a:graphic xmlns:a="http://schemas.openxmlformats.org/drawingml/2006/main">
+              <a:graphicData uri="http://schemas.openxmlformats.org/drawingml/2006/picture">
+                <pic:pic xmlns:pic="http://schemas.openxmlformats.org/drawingml/2006/picture">
+                  <pic:nvPicPr>
+                    <pic:cNvPr id="630273873" name=""/>
+                    <pic:cNvPicPr/>
+                  </pic:nvPicPr>
+                  <pic:blipFill>
+                    <a:blip r:embed="rId14"/>
+                    <a:stretch>
+                      <a:fillRect/>
+                    </a:stretch>
+                  </pic:blipFill>
+                  <pic:spPr>
+                    <a:xfrm>
+                      <a:off x="0" y="0"/>
+                      <a:ext cx="5731510" cy="1055370"/>
+                    </a:xfrm>
+                    <a:prstGeom prst="rect">
+                      <a:avLst/>
+                    </a:prstGeom>
+                  </pic:spPr>
+                </pic:pic>
+              </a:graphicData>
+            </a:graphic>
+          </wp:inline>
+        </w:drawing>
+      </w:r>
+    </w:p>
+    <w:p>
+      <w:pPr>
+        <w:pStyle w:val="ListParagraph"/>
+        <w:numPr>
+          <w:ilvl w:val="0"/>
+          <w:numId w:val="1"/>
+        </w:numPr>
+        <w:rPr>
+          <w:sz w:val="24"/>
+          <w:szCs w:val="24"/>
+        </w:rPr>
+      </w:pPr>
+      <w:r>
+        <w:rPr>
+          <w:sz w:val="24"/>
+          <w:szCs w:val="24"/>
+        </w:rPr>
+        <w:t>Syntax highlighting, showing what is data, what is an instruction, what is a label, etc.</w:t>
+      </w:r>
+    </w:p>
+    <w:p>
+      <w:pPr>
+        <w:pStyle w:val="ListParagraph"/>
+        <w:numPr>
+          <w:ilvl w:val="0"/>
+          <w:numId w:val="1"/>
+        </w:numPr>
+        <w:rPr>
+          <w:sz w:val="24"/>
+          <w:szCs w:val="24"/>
+        </w:rPr>
+      </w:pPr>
+      <w:r>
+        <w:rPr>
+          <w:sz w:val="24"/>
+          <w:szCs w:val="24"/>
+        </w:rPr>
+        <w:t>“Organisations” for people to share code and work on challenges.</w:t>
+      </w:r>
+    </w:p>
+    <w:p>
+      <w:pPr>
+        <w:pStyle w:val="ListParagraph"/>
+        <w:numPr>
+          <w:ilvl w:val="0"/>
+          <w:numId w:val="1"/>
+        </w:numPr>
+        <w:rPr>
+          <w:sz w:val="24"/>
+          <w:szCs w:val="24"/>
+        </w:rPr>
+      </w:pPr>
+      <w:r>
+        <w:rPr>
+          <w:sz w:val="24"/>
+          <w:szCs w:val="24"/>
+        </w:rPr>
+        <w:t>Web based, to make it widely accessible.</w:t>
+      </w:r>
+    </w:p>
+    <w:p>
+      <w:pPr>
+        <w:rPr>
+          <w:sz w:val="24"/>
+          <w:szCs w:val="24"/>
+        </w:rPr>
+      </w:pPr>
+      <w:r>
+        <w:rPr>
+          <w:sz w:val="24"/>
+          <w:szCs w:val="24"/>
+        </w:rPr>
+        <w:t xml:space="preserve">This website was much larger in scope than I could make myself, but I still took a few things </w:t>
+      </w:r>
+      <w:r>
+        <w:rPr>
+          <w:sz w:val="24"/>
+          <w:szCs w:val="24"/>
+        </w:rPr>
+        <w:t>a</w:t>
+      </w:r>
+      <w:r>
+        <w:rPr>
+          <w:sz w:val="24"/>
+          <w:szCs w:val="24"/>
+        </w:rPr>
+        <w:t>way from it. Having the ability to toggle between dark and light mode, for personal preference, would be very pleasant for anyone using my project. The syntax highlighting was also extremely useful, and something I would want to have in my program. Most important, however, was its verbose error handling. Not being able to understand what is wrong when your code fails to function is one of the most infuriating things that can happen to a programmer. Therefore, I made sure to create understandable error codes.</w:t>
+      </w:r>
+      <w:r>
+        <w:rPr>
+          <w:sz w:val="24"/>
+          <w:szCs w:val="24"/>
+        </w:rPr>
+        <w:t xml:space="preserve"> Additionally, I chose </w:t>
+      </w:r>
+      <w:proofErr w:type="gramStart"/>
+      <w:r>
+        <w:rPr>
+          <w:sz w:val="24"/>
+          <w:szCs w:val="24"/>
+        </w:rPr>
+        <w:t xml:space="preserve">to </w:t>
+      </w:r>
+      <w:r>
+        <w:rPr>
+          <w:sz w:val="24"/>
+          <w:szCs w:val="24"/>
+        </w:rPr>
+        <w:t xml:space="preserve"> Anything</w:t>
+      </w:r>
+      <w:proofErr w:type="gramEnd"/>
+      <w:r>
+        <w:rPr>
+          <w:sz w:val="24"/>
+          <w:szCs w:val="24"/>
+        </w:rPr>
+        <w:t xml:space="preserve"> else I could achieve would be a good bonus,</w:t>
+      </w:r>
+      <w:r>
+        <w:rPr>
+          <w:sz w:val="24"/>
+          <w:szCs w:val="24"/>
+        </w:rPr>
+        <w:t xml:space="preserve"> but not my highest priority.</w:t>
+      </w:r>
+    </w:p>
+    <w:p>
+      <w:pPr>
+        <w:rPr>
+          <w:sz w:val="24"/>
+          <w:szCs w:val="24"/>
+          <w:u w:val="single"/>
+        </w:rPr>
+      </w:pPr>
+      <w:r>
+        <w:rPr>
+          <w:sz w:val="24"/>
+          <w:szCs w:val="24"/>
+          <w:u w:val="single"/>
+        </w:rPr>
+        <w:t>Implementation:</w:t>
+      </w:r>
+    </w:p>
+    <w:p>
+      <w:pPr>
+        <w:rPr>
+          <w:sz w:val="24"/>
+          <w:szCs w:val="24"/>
+        </w:rPr>
+      </w:pPr>
+      <w:proofErr w:type="gramStart"/>
+      <w:r>
+        <w:rPr>
+          <w:sz w:val="24"/>
+          <w:szCs w:val="24"/>
+        </w:rPr>
+        <w:t>In order to</w:t>
+      </w:r>
+      <w:proofErr w:type="gramEnd"/>
+      <w:r>
+        <w:rPr>
+          <w:sz w:val="24"/>
+          <w:szCs w:val="24"/>
+        </w:rPr>
+        <w:t xml:space="preserve"> implement a web server and handle databases, I had to research the available libraries. </w:t>
+      </w:r>
+    </w:p>
+    <w:p>
+      <w:pPr>
+        <w:rPr>
+          <w:sz w:val="24"/>
+          <w:szCs w:val="24"/>
+        </w:rPr>
+      </w:pPr>
+      <w:r>
+        <w:rPr>
+          <w:sz w:val="24"/>
+          <w:szCs w:val="24"/>
+        </w:rPr>
+        <w:t xml:space="preserve">For the web server, I found two options; Flask, and Django. </w:t>
+      </w:r>
+      <w:r>
+        <w:rPr>
+          <w:sz w:val="24"/>
+          <w:szCs w:val="24"/>
+        </w:rPr>
+        <w:t xml:space="preserve">Flask, </w:t>
+      </w:r>
+      <w:r>
+        <w:rPr>
+          <w:sz w:val="24"/>
+          <w:szCs w:val="24"/>
+        </w:rPr>
+        <w:t xml:space="preserve">described as a </w:t>
+      </w:r>
+      <w:r>
+        <w:rPr>
+          <w:sz w:val="24"/>
+          <w:szCs w:val="24"/>
+        </w:rPr>
+        <w:t>“lightweight WSGI web application framework” python library. Primarily, it is used for smaller projects but has the capability to scale to more complex applications.</w:t>
+      </w:r>
+      <w:r>
+        <w:rPr>
+          <w:sz w:val="24"/>
+          <w:szCs w:val="24"/>
+        </w:rPr>
+        <w:t xml:space="preserve"> This makes it useful for my project as it will be easy to </w:t>
+      </w:r>
+      <w:proofErr w:type="gramStart"/>
+      <w:r>
+        <w:rPr>
+          <w:sz w:val="24"/>
+          <w:szCs w:val="24"/>
+        </w:rPr>
+        <w:t>implement, and</w:t>
+      </w:r>
+      <w:proofErr w:type="gramEnd"/>
+      <w:r>
+        <w:rPr>
+          <w:sz w:val="24"/>
+          <w:szCs w:val="24"/>
+        </w:rPr>
+        <w:t xml:space="preserve"> will not require much extra work to ensure all code works with Flask. On the other hand, there is Django,</w:t>
+      </w:r>
+      <w:r>
+        <w:rPr>
+          <w:sz w:val="24"/>
+          <w:szCs w:val="24"/>
+        </w:rPr>
+        <w:t xml:space="preserve"> described on their website as a “</w:t>
+      </w:r>
+      <w:r>
+        <w:rPr>
+          <w:sz w:val="24"/>
+          <w:szCs w:val="24"/>
+        </w:rPr>
+        <w:t>high-level Python web framework that encourages rapid development and clean, pragmatic design</w:t>
+      </w:r>
+      <w:r>
+        <w:rPr>
+          <w:sz w:val="24"/>
+          <w:szCs w:val="24"/>
+        </w:rPr>
+        <w:t>.” It comes with built in security and is advertised as being “ridiculously fast”, but is, from my research, harder to immediately implement.</w:t>
+      </w:r>
+    </w:p>
+    <w:p>
+      <w:pPr>
+        <w:rPr>
+          <w:sz w:val="24"/>
+          <w:szCs w:val="24"/>
+        </w:rPr>
+      </w:pPr>
+      <w:r>
+        <w:rPr>
+          <w:sz w:val="24"/>
+          <w:szCs w:val="24"/>
+        </w:rPr>
+        <w:t>Due to the time constraints, and since I had more experience with it, I used Flask. This made creating a base website much quicker and easier, helping me to “find my footing” so to speak.</w:t>
+      </w:r>
+    </w:p>
+    <w:p>
+      <w:pPr>
+        <w:rPr>
+          <w:sz w:val="24"/>
+          <w:szCs w:val="24"/>
+        </w:rPr>
+      </w:pPr>
+      <w:r>
+        <w:rPr>
+          <w:sz w:val="24"/>
+          <w:szCs w:val="24"/>
+        </w:rPr>
+        <w:t xml:space="preserve">For the database, there were two primary options; MySQL or SQLite. To compare them, I used this </w:t>
+      </w:r>
+      <w:hyperlink r:id="rId15" w:history="1">
+        <w:r>
+          <w:rPr>
+            <w:rStyle w:val="Hyperlink"/>
+            <w:sz w:val="24"/>
+            <w:szCs w:val="24"/>
+          </w:rPr>
+          <w:t>website</w:t>
+        </w:r>
+      </w:hyperlink>
+      <w:r>
+        <w:rPr>
+          <w:sz w:val="24"/>
+          <w:szCs w:val="24"/>
+        </w:rPr>
+        <w:t>, which listed some pros and cons. From this, I found that MySQL is more suited to cases where multiple users will require the database at once, and there is a large amount of data to be handled, whereas SQLite is more suited to smaller environments with only one user sending requests. Additionally, MySQL requires a server, while SQLite does not. Since my project would not be on a large scale, and I aimed to only require one server to be running as it would reduce complexity, I decided to use SQLite.</w:t>
+      </w:r>
+    </w:p>
+    <w:p>
+      <w:pPr>
+        <w:rPr>
+          <w:sz w:val="24"/>
+          <w:szCs w:val="24"/>
+          <w:u w:val="single"/>
+        </w:rPr>
+      </w:pPr>
+    </w:p>
+    <w:p>
+      <w:pPr>
+        <w:rPr>
+          <w:sz w:val="24"/>
+          <w:szCs w:val="24"/>
+        </w:rPr>
+      </w:pPr>
+      <w:r>
+        <w:rPr>
+          <w:sz w:val="24"/>
+          <w:szCs w:val="24"/>
+          <w:u w:val="single"/>
+        </w:rPr>
+        <w:lastRenderedPageBreak/>
+        <w:t>Technical Challenges</w:t>
+      </w:r>
+      <w:r>
+        <w:rPr>
+          <w:sz w:val="24"/>
+          <w:szCs w:val="24"/>
+          <w:u w:val="single"/>
+        </w:rPr>
+        <w:t>:</w:t>
+      </w:r>
+    </w:p>
+    <w:p>
+      <w:pPr>
+        <w:rPr>
+          <w:sz w:val="24"/>
+          <w:szCs w:val="24"/>
+        </w:rPr>
+      </w:pPr>
+      <w:r>
+        <w:rPr>
+          <w:sz w:val="24"/>
+          <w:szCs w:val="24"/>
+        </w:rPr>
+        <w:t>Reasonably early on into the project I encountered a few challenges. Here is a list of them.</w:t>
+      </w:r>
+    </w:p>
+    <w:p>
+      <w:pPr>
+        <w:pStyle w:val="ListParagraph"/>
+        <w:numPr>
+          <w:ilvl w:val="0"/>
+          <w:numId w:val="1"/>
+        </w:numPr>
+        <w:rPr>
+          <w:sz w:val="24"/>
+          <w:szCs w:val="24"/>
+        </w:rPr>
+      </w:pPr>
+      <w:r>
+        <w:rPr>
+          <w:sz w:val="24"/>
+          <w:szCs w:val="24"/>
+        </w:rPr>
+        <w:t>Data handling: How will I structure the program internally, and how will memory be stored?</w:t>
+      </w:r>
+    </w:p>
+    <w:p>
+      <w:pPr>
+        <w:pStyle w:val="ListParagraph"/>
+        <w:numPr>
+          <w:ilvl w:val="0"/>
+          <w:numId w:val="1"/>
+        </w:numPr>
+        <w:rPr>
+          <w:sz w:val="24"/>
+          <w:szCs w:val="24"/>
+        </w:rPr>
+      </w:pPr>
+      <w:r>
+        <w:rPr>
+          <w:sz w:val="24"/>
+          <w:szCs w:val="24"/>
+        </w:rPr>
+        <w:t>Input parsing: How will I parse the program input by the user into something the program can execute?</w:t>
+      </w:r>
+    </w:p>
+    <w:p>
+      <w:pPr>
+        <w:pStyle w:val="ListParagraph"/>
+        <w:numPr>
+          <w:ilvl w:val="0"/>
+          <w:numId w:val="1"/>
+        </w:numPr>
+        <w:rPr>
+          <w:sz w:val="24"/>
+          <w:szCs w:val="24"/>
+        </w:rPr>
+      </w:pPr>
+      <w:r>
+        <w:rPr>
+          <w:sz w:val="24"/>
+          <w:szCs w:val="24"/>
+        </w:rPr>
+        <w:t>Labels and branching: How will labels be stored and how will they work with branching? Will the labels be replaced in the code when compiled, or will they be stored separately to the program in their own bank of memory?</w:t>
+      </w:r>
+    </w:p>
+    <w:p>
+      <w:pPr>
+        <w:pStyle w:val="ListParagraph"/>
+        <w:numPr>
+          <w:ilvl w:val="0"/>
+          <w:numId w:val="1"/>
+        </w:numPr>
+        <w:rPr>
+          <w:sz w:val="24"/>
+          <w:szCs w:val="24"/>
+        </w:rPr>
+      </w:pPr>
+      <w:r>
+        <w:rPr>
+          <w:sz w:val="24"/>
+          <w:szCs w:val="24"/>
+        </w:rPr>
+        <w:t xml:space="preserve">Von Neumann or Harvard architecture: Will I store the program separately to the rest of the memory, or keep it in with </w:t>
+      </w:r>
+      <w:r>
+        <w:rPr>
+          <w:sz w:val="24"/>
+          <w:szCs w:val="24"/>
+        </w:rPr>
+        <w:t>all</w:t>
+      </w:r>
+      <w:r>
+        <w:rPr>
+          <w:sz w:val="24"/>
+          <w:szCs w:val="24"/>
+        </w:rPr>
+        <w:t xml:space="preserve"> the data used by the program?</w:t>
+      </w:r>
+    </w:p>
+    <w:p>
+      <w:pPr>
+        <w:pStyle w:val="ListParagraph"/>
+        <w:numPr>
+          <w:ilvl w:val="0"/>
+          <w:numId w:val="1"/>
+        </w:numPr>
+        <w:rPr>
+          <w:sz w:val="24"/>
+          <w:szCs w:val="24"/>
+        </w:rPr>
+      </w:pPr>
+      <w:r>
+        <w:rPr>
+          <w:sz w:val="24"/>
+          <w:szCs w:val="24"/>
+        </w:rPr>
+        <w:t xml:space="preserve">Program Sharing: How will programs be accessible to other users? </w:t>
+      </w:r>
+    </w:p>
+    <w:p>
+      <w:pPr>
+        <w:rPr>
+          <w:sz w:val="24"/>
+          <w:szCs w:val="24"/>
+          <w:u w:val="single"/>
+        </w:rPr>
+      </w:pPr>
+      <w:r>
+        <w:rPr>
+          <w:sz w:val="24"/>
+          <w:szCs w:val="24"/>
+          <w:u w:val="single"/>
+        </w:rPr>
+        <w:t>Challenge 1:</w:t>
+      </w:r>
+    </w:p>
+    <w:p>
+      <w:pPr>
+        <w:rPr>
+          <w:sz w:val="24"/>
+          <w:szCs w:val="24"/>
+          <w:u w:val="single"/>
+        </w:rPr>
+      </w:pPr>
+      <w:r>
+        <w:rPr>
+          <w:sz w:val="24"/>
+          <w:szCs w:val="24"/>
+        </w:rPr>
+        <w:t xml:space="preserve">Initially, I was unsure about how to handle the data. To solve this, I prototyped multiple designs and worked with them each for a short </w:t>
+      </w:r>
+      <w:r>
+        <w:rPr>
+          <w:sz w:val="24"/>
+          <w:szCs w:val="24"/>
+        </w:rPr>
+        <w:t>while;</w:t>
+      </w:r>
+      <w:r>
+        <w:rPr>
+          <w:sz w:val="24"/>
+          <w:szCs w:val="24"/>
+        </w:rPr>
+        <w:t xml:space="preserve"> to see how easy or hard it was to work with it.</w:t>
+      </w:r>
+      <w:r>
+        <w:rPr>
+          <w:sz w:val="24"/>
+          <w:szCs w:val="24"/>
+        </w:rPr>
+        <w:t xml:space="preserve"> </w:t>
+      </w:r>
+      <w:r>
+        <w:rPr>
+          <w:sz w:val="24"/>
+          <w:szCs w:val="24"/>
+        </w:rPr>
+        <w:t xml:space="preserve">Eventually I settled on having an array for each instruction, holding its type, (label, instruction, or data) its opcode (the instruction to be performed), its operand(s) (the value(s) the instruction is using), and a type for each of these operands. </w:t>
+      </w:r>
+    </w:p>
+    <w:p>
+      <w:pPr>
+        <w:rPr>
+          <w:sz w:val="24"/>
+          <w:szCs w:val="24"/>
+          <w:u w:val="single"/>
+        </w:rPr>
+      </w:pPr>
+      <w:r>
+        <w:rPr>
+          <w:sz w:val="24"/>
+          <w:szCs w:val="24"/>
+          <w:u w:val="single"/>
+        </w:rPr>
+        <w:t>Challenge 2:</w:t>
+      </w:r>
+    </w:p>
+    <w:p>
+      <w:pPr>
+        <w:rPr>
+          <w:sz w:val="24"/>
+          <w:szCs w:val="24"/>
+        </w:rPr>
+      </w:pPr>
+      <w:r>
+        <w:rPr>
+          <w:sz w:val="24"/>
+          <w:szCs w:val="24"/>
+        </w:rPr>
+        <w:t xml:space="preserve">Working with a user’s input can always lead to problems.  Therefore, when figuring out how to deal with user input, I asked multiple of my fellow students to write their own assembly programs and send them to me. This was very helpful as it reminded me of the need to remove trailing whitespace. After this, I used a whiteboard to brainstorm a solution. My final solution was to decompose the input into smaller sub parts which could be dealt with individually, namely the opcode, operands, and then </w:t>
+      </w:r>
+      <w:r>
+        <w:rPr>
+          <w:sz w:val="24"/>
+          <w:szCs w:val="24"/>
+        </w:rPr>
+        <w:t xml:space="preserve">splitting the operands into </w:t>
+      </w:r>
+      <w:r>
+        <w:rPr>
+          <w:sz w:val="24"/>
+          <w:szCs w:val="24"/>
+        </w:rPr>
+        <w:t xml:space="preserve">each operand </w:t>
+      </w:r>
+      <w:r>
+        <w:rPr>
+          <w:sz w:val="24"/>
+          <w:szCs w:val="24"/>
+        </w:rPr>
+        <w:t>to be decoded individually.</w:t>
+      </w:r>
+    </w:p>
+    <w:p>
+      <w:pPr>
+        <w:rPr>
+          <w:sz w:val="24"/>
+          <w:szCs w:val="24"/>
+          <w:u w:val="single"/>
+        </w:rPr>
+      </w:pPr>
+      <w:r>
+        <w:rPr>
+          <w:sz w:val="24"/>
+          <w:szCs w:val="24"/>
+          <w:u w:val="single"/>
+        </w:rPr>
+        <w:t>Challenge 3:</w:t>
+      </w:r>
+    </w:p>
+    <w:p>
+      <w:pPr>
+        <w:rPr>
+          <w:sz w:val="24"/>
+          <w:szCs w:val="24"/>
+        </w:rPr>
+      </w:pPr>
+      <w:r>
+        <w:rPr>
+          <w:sz w:val="24"/>
+          <w:szCs w:val="24"/>
+        </w:rPr>
+        <w:t xml:space="preserve">Originally, I had thought to replace the labels with their locations in memory when the program is compiled. That would make the program execute faster, as it would not have to </w:t>
+      </w:r>
+      <w:proofErr w:type="spellStart"/>
+      <w:r>
+        <w:rPr>
+          <w:sz w:val="24"/>
+          <w:szCs w:val="24"/>
+        </w:rPr>
+        <w:t>lookup</w:t>
+      </w:r>
+      <w:proofErr w:type="spellEnd"/>
+      <w:r>
+        <w:rPr>
+          <w:sz w:val="24"/>
+          <w:szCs w:val="24"/>
+        </w:rPr>
+        <w:t xml:space="preserve"> the location for a given label each time. However, doing so would make labels more unclear when shown in any errors that may occur, as a line number or location in memory is less recognisable than a label name.</w:t>
+      </w:r>
+    </w:p>
+    <w:p>
+      <w:pPr>
+        <w:rPr>
+          <w:sz w:val="24"/>
+          <w:szCs w:val="24"/>
+        </w:rPr>
+      </w:pPr>
+      <w:r>
+        <w:rPr>
+          <w:sz w:val="24"/>
+          <w:szCs w:val="24"/>
+        </w:rPr>
+        <w:t xml:space="preserve">A second option would be to store a dictionary of the labels and their locations in </w:t>
+      </w:r>
+      <w:proofErr w:type="gramStart"/>
+      <w:r>
+        <w:rPr>
+          <w:sz w:val="24"/>
+          <w:szCs w:val="24"/>
+        </w:rPr>
+        <w:t>memory, and</w:t>
+      </w:r>
+      <w:proofErr w:type="gramEnd"/>
+      <w:r>
+        <w:rPr>
+          <w:sz w:val="24"/>
+          <w:szCs w:val="24"/>
+        </w:rPr>
+        <w:t xml:space="preserve"> get said location whenever the label is called upon, for a branch instruction or similar. This would be much slower compared to the method described above as it would take time to lookup the values from the dictionary, but it would make errors easier to understand as I could simply give the label name.</w:t>
+      </w:r>
+    </w:p>
+    <w:p>
+      <w:pPr>
+        <w:rPr>
+          <w:sz w:val="24"/>
+          <w:szCs w:val="24"/>
+        </w:rPr>
+      </w:pPr>
+      <w:r>
+        <w:rPr>
+          <w:sz w:val="24"/>
+          <w:szCs w:val="24"/>
+        </w:rPr>
+        <w:t xml:space="preserve">Both methods have their advantages, but since this is a web program, and users </w:t>
+      </w:r>
+      <w:r>
+        <w:rPr>
+          <w:sz w:val="24"/>
+          <w:szCs w:val="24"/>
+        </w:rPr>
+        <w:t>expect</w:t>
+      </w:r>
+      <w:r>
+        <w:rPr>
+          <w:sz w:val="24"/>
+          <w:szCs w:val="24"/>
+        </w:rPr>
+        <w:t xml:space="preserve"> some delay</w:t>
+      </w:r>
+      <w:r>
+        <w:rPr>
+          <w:sz w:val="24"/>
+          <w:szCs w:val="24"/>
+        </w:rPr>
+        <w:t xml:space="preserve"> already and do not require blazingly fast execute speeds, I chose the second </w:t>
+      </w:r>
+      <w:r>
+        <w:rPr>
+          <w:sz w:val="24"/>
+          <w:szCs w:val="24"/>
+        </w:rPr>
+        <w:lastRenderedPageBreak/>
+        <w:t>option, as it made the user debugging experience better. This also made the writing of the compiler easier, which gave me more time to work on the rest of the program.</w:t>
+      </w:r>
+    </w:p>
+    <w:p>
+      <w:pPr>
+        <w:rPr>
+          <w:sz w:val="24"/>
+          <w:szCs w:val="24"/>
+        </w:rPr>
+      </w:pPr>
+      <w:r>
+        <w:rPr>
+          <w:sz w:val="24"/>
+          <w:szCs w:val="24"/>
+          <w:u w:val="single"/>
+        </w:rPr>
+        <w:t>Challenge 4:</w:t>
+      </w:r>
+    </w:p>
+    <w:p>
+      <w:pPr>
+        <w:rPr>
+          <w:sz w:val="24"/>
+          <w:szCs w:val="24"/>
+        </w:rPr>
+      </w:pPr>
+      <w:r>
+        <w:rPr>
+          <w:sz w:val="24"/>
+          <w:szCs w:val="24"/>
+        </w:rPr>
+        <w:t xml:space="preserve">This was something I struggled with initially, until I was reminded of the research I had done. Peter Higginson’s solution to the problem used Von Neumann architecture </w:t>
+      </w:r>
+      <w:r>
+        <w:rPr>
+          <w:sz w:val="24"/>
+          <w:szCs w:val="24"/>
+        </w:rPr>
+        <w:t>to</w:t>
+      </w:r>
+      <w:r>
+        <w:rPr>
+          <w:sz w:val="24"/>
+          <w:szCs w:val="24"/>
+        </w:rPr>
+        <w:t xml:space="preserve"> closer mimic most modern computers, which informed my decision to do the same.</w:t>
+      </w:r>
+    </w:p>
+    <w:p>
+      <w:pPr>
+        <w:rPr>
+          <w:sz w:val="24"/>
+          <w:szCs w:val="24"/>
+          <w:u w:val="single"/>
+        </w:rPr>
+      </w:pPr>
+      <w:r>
+        <w:rPr>
+          <w:sz w:val="24"/>
+          <w:szCs w:val="24"/>
+          <w:u w:val="single"/>
+        </w:rPr>
+        <w:t>Challenge 5:</w:t>
+      </w:r>
+    </w:p>
+    <w:p>
+      <w:pPr>
+        <w:rPr>
+          <w:sz w:val="24"/>
+          <w:szCs w:val="24"/>
+        </w:rPr>
+      </w:pPr>
+      <w:r>
+        <w:rPr>
+          <w:sz w:val="24"/>
+          <w:szCs w:val="24"/>
+        </w:rPr>
+        <w:t xml:space="preserve">When I had the idea to allow users to share programs, I did not consider how to implement it. It would require some way of storing the programs, and some way of accessing them. Thanks to my education, I knew of databases and their uses, which aligned perfectly to solve this problem. </w:t>
+      </w:r>
+      <w:r>
+        <w:rPr>
+          <w:sz w:val="24"/>
+          <w:szCs w:val="24"/>
+        </w:rPr>
+        <w:t>From here, I had to decide between which implementation of SQL I would use which worked with python.</w:t>
+      </w:r>
+      <w:r>
+        <w:rPr>
+          <w:sz w:val="24"/>
+          <w:szCs w:val="24"/>
+        </w:rPr>
+        <w:t xml:space="preserve"> I have already discussed this above, in the Implementation section.</w:t>
+      </w:r>
+    </w:p>
+    <w:p>
+      <w:pPr>
+        <w:rPr>
+          <w:sz w:val="24"/>
+          <w:szCs w:val="24"/>
+        </w:rPr>
+      </w:pPr>
+      <w:r>
+        <w:rPr>
+          <w:sz w:val="24"/>
+          <w:szCs w:val="24"/>
+        </w:rPr>
+        <w:t xml:space="preserve">However, storing programs and making them accessible led to another program. </w:t>
+      </w:r>
+    </w:p>
+    <w:p>
+      <w:pPr>
+        <w:rPr>
+          <w:sz w:val="24"/>
+          <w:szCs w:val="24"/>
+        </w:rPr>
+      </w:pPr>
+    </w:p>
+    <w:p>
+      <w:pPr>
+        <w:rPr>
+          <w:sz w:val="24"/>
+          <w:szCs w:val="24"/>
+        </w:rPr>
+      </w:pPr>
+      <w:r>
+        <w:rPr>
+          <w:sz w:val="24"/>
+          <w:szCs w:val="24"/>
+          <w:u w:val="single"/>
+        </w:rPr>
+        <w:t>Conclusion:</w:t>
+      </w:r>
+    </w:p>
+    <w:p>
+      <w:pPr>
+        <w:rPr>
+          <w:sz w:val="24"/>
+          <w:szCs w:val="24"/>
+        </w:rPr>
+      </w:pPr>
+      <w:r>
+        <w:rPr>
+          <w:sz w:val="24"/>
+          <w:szCs w:val="24"/>
+        </w:rPr>
+        <w:t xml:space="preserve">As a result of this research, my refined idea is summarised as </w:t>
+      </w:r>
+      <w:r>
+        <w:rPr>
+          <w:sz w:val="24"/>
+          <w:szCs w:val="24"/>
+        </w:rPr>
+        <w:t>a website which compiles and executes AQA Assembly Programs, with error handling and a server to store your programs and share them with other users.</w:t>
+      </w:r>
+    </w:p>
+    <w:p>
+      <w:pPr>
+        <w:rPr>
+          <w:sz w:val="24"/>
+          <w:szCs w:val="24"/>
+        </w:rPr>
+      </w:pPr>
+    </w:p>
+    <w:p>
+      <w:pPr>
+        <w:rPr>
+          <w:sz w:val="24"/>
+          <w:szCs w:val="24"/>
+          <w:u w:val="single"/>
+        </w:rPr>
+      </w:pPr>
+      <w:r>
+        <w:rPr>
+          <w:sz w:val="24"/>
+          <w:szCs w:val="24"/>
+          <w:u w:val="single"/>
+        </w:rPr>
+        <w:t>Modelling:</w:t>
+      </w:r>
+    </w:p>
+    <w:p>
+      <w:pPr>
+        <w:rPr>
+          <w:sz w:val="24"/>
+          <w:szCs w:val="24"/>
+        </w:rPr>
+      </w:pPr>
+      <w:r>
+        <w:rPr>
+          <w:sz w:val="24"/>
+          <w:szCs w:val="24"/>
+        </w:rPr>
+        <w:t xml:space="preserve">To explain my project, I have created a </w:t>
+      </w:r>
+      <w:r>
+        <w:rPr>
+          <w:sz w:val="24"/>
+          <w:szCs w:val="24"/>
+        </w:rPr>
+        <w:t>blueprint</w:t>
+      </w:r>
+      <w:r>
+        <w:rPr>
+          <w:sz w:val="24"/>
+          <w:szCs w:val="24"/>
+        </w:rPr>
+        <w:t xml:space="preserve"> which is shown as a picture below.</w:t>
+      </w:r>
+    </w:p>
+    <w:p>
+      <w:pPr>
+        <w:rPr>
+          <w:sz w:val="24"/>
+          <w:szCs w:val="24"/>
+        </w:rPr>
+      </w:pPr>
+      <w:r>
+        <w:rPr>
+          <w:sz w:val="24"/>
+          <w:szCs w:val="24"/>
+        </w:rPr>
+        <w:drawing>
+          <wp:inline distT="0" distB="0" distL="0" distR="0" wp14:anchorId="4D86FADC" wp14:editId="789114D3">
+            <wp:extent cx="5731510" cy="2790825"/>
+            <wp:effectExtent l="0" t="0" r="2540" b="9525"/>
+            <wp:docPr id="1481681481" name="Picture 1"/>
+            <wp:cNvGraphicFramePr>
+              <a:graphicFrameLocks xmlns:a="http://schemas.openxmlformats.org/drawingml/2006/main" noChangeAspect="1"/>
+            </wp:cNvGraphicFramePr>
+            <a:graphic xmlns:a="http://schemas.openxmlformats.org/drawingml/2006/main">
+              <a:graphicData uri="http://schemas.openxmlformats.org/drawingml/2006/picture">
+                <pic:pic xmlns:pic="http://schemas.openxmlformats.org/drawingml/2006/picture">
+                  <pic:nvPicPr>
+                    <pic:cNvPr id="1481681481" name=""/>
+                    <pic:cNvPicPr/>
+                  </pic:nvPicPr>
+                  <pic:blipFill>
+                    <a:blip r:embed="rId16"/>
+                    <a:stretch>
+                      <a:fillRect/>
+                    </a:stretch>
+                  </pic:blipFill>
+                  <pic:spPr>
+                    <a:xfrm>
+                      <a:off x="0" y="0"/>
+                      <a:ext cx="5731510" cy="2790825"/>
+                    </a:xfrm>
+                    <a:prstGeom prst="rect">
+                      <a:avLst/>
+                    </a:prstGeom>
+                  </pic:spPr>
+                </pic:pic>
+              </a:graphicData>
+            </a:graphic>
+          </wp:inline>
+        </w:drawing>
+      </w:r>
+    </w:p>
+    <w:p>
+      <w:pPr>
+        <w:rPr>
+          <w:sz w:val="24"/>
+          <w:szCs w:val="24"/>
+          <w:u w:val="single"/>
+        </w:rPr>
+      </w:pPr>
+      <w:r>
+        <w:rPr>
+          <w:sz w:val="24"/>
+          <w:szCs w:val="24"/>
+          <w:u w:val="single"/>
+        </w:rPr>
+        <w:t>Objectives:</w:t>
+      </w:r>
+    </w:p>
+    <w:p>
+      <w:pPr>
+        <w:pStyle w:val="ListParagraph"/>
+        <w:numPr>
+          <w:ilvl w:val="0"/>
+          <w:numId w:val="1"/>
+        </w:numPr>
+        <w:rPr>
+          <w:sz w:val="24"/>
+          <w:szCs w:val="24"/>
+        </w:rPr>
+      </w:pPr>
+      <w:r>
+        <w:rPr>
+          <w:sz w:val="24"/>
+          <w:szCs w:val="24"/>
+        </w:rPr>
+        <w:lastRenderedPageBreak/>
+        <w:t>The project should be able to produce the correct output for any given assembly program.</w:t>
+      </w:r>
+    </w:p>
+    <w:p>
+      <w:pPr>
+        <w:pStyle w:val="ListParagraph"/>
+        <w:numPr>
+          <w:ilvl w:val="0"/>
+          <w:numId w:val="1"/>
+        </w:numPr>
+        <w:rPr>
+          <w:sz w:val="24"/>
+          <w:szCs w:val="24"/>
+        </w:rPr>
+      </w:pPr>
+      <w:r>
+        <w:rPr>
+          <w:sz w:val="24"/>
+          <w:szCs w:val="24"/>
+        </w:rPr>
+        <w:t>The user must be able to code on the website and send the code to be processed by the server.</w:t>
+      </w:r>
+    </w:p>
+    <w:p>
+      <w:pPr>
+        <w:pStyle w:val="ListParagraph"/>
+        <w:numPr>
+          <w:ilvl w:val="0"/>
+          <w:numId w:val="1"/>
+        </w:numPr>
+        <w:rPr>
+          <w:sz w:val="24"/>
+          <w:szCs w:val="24"/>
+        </w:rPr>
+      </w:pPr>
+      <w:r>
+        <w:rPr>
+          <w:sz w:val="24"/>
+          <w:szCs w:val="24"/>
+        </w:rPr>
+        <w:t xml:space="preserve">A debugging mode must be available in which the user can see more about their program than without it. If I were able to do it within the time bound, a stretch goal would be to allow the user to see the whole memory at any </w:t>
+      </w:r>
+      <w:proofErr w:type="gramStart"/>
+      <w:r>
+        <w:rPr>
+          <w:sz w:val="24"/>
+          <w:szCs w:val="24"/>
+        </w:rPr>
+        <w:t>point, and</w:t>
+      </w:r>
+      <w:proofErr w:type="gramEnd"/>
+      <w:r>
+        <w:rPr>
+          <w:sz w:val="24"/>
+          <w:szCs w:val="24"/>
+        </w:rPr>
+        <w:t xml:space="preserve"> go backwards and forwards through the program to see the changes from one instruction to another.</w:t>
+      </w:r>
+    </w:p>
+    <w:p>
+      <w:pPr>
+        <w:pStyle w:val="ListParagraph"/>
+        <w:numPr>
+          <w:ilvl w:val="0"/>
+          <w:numId w:val="1"/>
+        </w:numPr>
+        <w:rPr>
+          <w:sz w:val="24"/>
+          <w:szCs w:val="24"/>
+        </w:rPr>
+      </w:pPr>
+      <w:r>
+        <w:rPr>
+          <w:sz w:val="24"/>
+          <w:szCs w:val="24"/>
+        </w:rPr>
+        <w:t>The user should be able to share their code to be accessible by other users.</w:t>
+      </w:r>
+    </w:p>
+    <w:p>
+      <w:pPr>
+        <w:pStyle w:val="ListParagraph"/>
+        <w:numPr>
+          <w:ilvl w:val="0"/>
+          <w:numId w:val="1"/>
+        </w:numPr>
+        <w:rPr>
+          <w:sz w:val="24"/>
+          <w:szCs w:val="24"/>
+        </w:rPr>
+      </w:pPr>
+      <w:r>
+        <w:rPr>
+          <w:sz w:val="24"/>
+          <w:szCs w:val="24"/>
+        </w:rPr>
+        <w:t>As another stretch goal, there could be syntax highlighting on the code the user writes. This</w:t>
+      </w:r>
+      <w:r>
+        <w:rPr>
+          <w:sz w:val="24"/>
+          <w:szCs w:val="24"/>
+        </w:rPr>
+        <w:t xml:space="preserve"> may fall out of the timescale I have, as it would require learning some </w:t>
+      </w:r>
+      <w:proofErr w:type="spellStart"/>
+      <w:r>
+        <w:rPr>
+          <w:sz w:val="24"/>
+          <w:szCs w:val="24"/>
+        </w:rPr>
+        <w:t>javascript</w:t>
+      </w:r>
+      <w:proofErr w:type="spellEnd"/>
+      <w:r>
+        <w:rPr>
+          <w:sz w:val="24"/>
+          <w:szCs w:val="24"/>
+        </w:rPr>
+        <w:t>, but if I were able to achieve it, that would improve the user experience.</w:t>
       </w:r>
     </w:p>
     <w:sectPr>
@@ -441,8 +2104,128 @@
 </w:document>
 </file>
 
+<file path=word/numbering.xml><?xml version="1.0" encoding="utf-8"?>
+<w:numbering xmlns:wpc="http://schemas.microsoft.com/office/word/2010/wordprocessingCanvas" xmlns:cx="http://schemas.microsoft.com/office/drawing/2014/chartex" xmlns:cx1="http://schemas.microsoft.com/office/drawing/2015/9/8/chartex" xmlns:cx2="http://schemas.microsoft.com/office/drawing/2015/10/21/chartex" xmlns:cx3="http://schemas.microsoft.com/office/drawing/2016/5/9/chartex" xmlns:cx4="http://schemas.microsoft.com/office/drawing/2016/5/10/chartex" xmlns:cx5="http://schemas.microsoft.com/office/drawing/2016/5/11/chartex" xmlns:cx6="http://schemas.microsoft.com/office/drawing/2016/5/12/chartex" xmlns:cx7="http://schemas.microsoft.com/office/drawing/2016/5/13/chartex" xmlns:cx8="http://schemas.microsoft.com/office/drawing/2016/5/14/chartex" xmlns:mc="http://schemas.openxmlformats.org/markup-compatibility/2006" xmlns:aink="http://schemas.microsoft.com/office/drawing/2016/ink" xmlns:am3d="http://schemas.microsoft.com/office/drawing/2017/model3d" xmlns:o="urn:schemas-microsoft-com:office:office" xmlns:oel="http://schemas.microsoft.com/office/2019/extlst" xmlns:r="http://schemas.openxmlformats.org/officeDocument/2006/relationships" xmlns:m="http://schemas.openxmlformats.org/officeDocument/2006/math" xmlns:v="urn:schemas-microsoft-com:vml" xmlns:wp14="http://schemas.microsoft.com/office/word/2010/wordprocessingDrawing" xmlns:wp="http://schemas.openxmlformats.org/drawingml/2006/wordprocessingDrawing" xmlns:w10="urn:schemas-microsoft-com:office:word" xmlns:w="http://schemas.openxmlformats.org/wordprocessingml/2006/main" xmlns:w14="http://schemas.microsoft.com/office/word/2010/wordml" xmlns:w15="http://schemas.microsoft.com/office/word/2012/wordml" xmlns:w16cex="http://schemas.microsoft.com/office/word/2018/wordml/cex" xmlns:w16cid="http://schemas.microsoft.com/office/word/2016/wordml/cid" xmlns:w16="http://schemas.microsoft.com/office/word/2018/wordml" xmlns:w16du="http://schemas.microsoft.com/office/word/2023/wordml/word16du" xmlns:w16sdtdh="http://schemas.microsoft.com/office/word/2020/wordml/sdtdatahash" xmlns:w16sdtfl="http://schemas.microsoft.com/office/word/2024/wordml/sdtformatlock" xmlns:w16se="http://schemas.microsoft.com/office/word/2015/wordml/symex" xmlns:wpg="http://schemas.microsoft.com/office/word/2010/wordprocessingGroup" xmlns:wpi="http://schemas.microsoft.com/office/word/2010/wordprocessingInk" xmlns:wne="http://schemas.microsoft.com/office/word/2006/wordml" xmlns:wps="http://schemas.microsoft.com/office/word/2010/wordprocessingShape" mc:Ignorable="w14 w15 w16se w16cid w16 w16cex w16sdtdh w16sdtfl w16du wp14">
+  <w:abstractNum w:abstractNumId="0" w15:restartNumberingAfterBreak="0">
+    <w:nsid w:val="38EB60C4"/>
+    <w:multiLevelType w:val="hybridMultilevel"/>
+    <w:tmpl w:val="62FAAB72"/>
+    <w:lvl w:ilvl="0" w:tplc="E340A7B6">
+      <w:numFmt w:val="bullet"/>
+      <w:lvlText w:val="-"/>
+      <w:lvlJc w:val="left"/>
+      <w:pPr>
+        <w:ind w:left="720" w:hanging="360"/>
+      </w:pPr>
+      <w:rPr>
+        <w:rFonts w:ascii="Calibri" w:eastAsiaTheme="minorHAnsi" w:hAnsi="Calibri" w:cs="Calibri" w:hint="default"/>
+      </w:rPr>
+    </w:lvl>
+    <w:lvl w:ilvl="1" w:tplc="08090003" w:tentative="1">
+      <w:start w:val="1"/>
+      <w:numFmt w:val="bullet"/>
+      <w:lvlText w:val="o"/>
+      <w:lvlJc w:val="left"/>
+      <w:pPr>
+        <w:ind w:left="1440" w:hanging="360"/>
+      </w:pPr>
+      <w:rPr>
+        <w:rFonts w:ascii="Courier New" w:hAnsi="Courier New" w:cs="Courier New" w:hint="default"/>
+      </w:rPr>
+    </w:lvl>
+    <w:lvl w:ilvl="2" w:tplc="08090005" w:tentative="1">
+      <w:start w:val="1"/>
+      <w:numFmt w:val="bullet"/>
+      <w:lvlText w:val=""/>
+      <w:lvlJc w:val="left"/>
+      <w:pPr>
+        <w:ind w:left="2160" w:hanging="360"/>
+      </w:pPr>
+      <w:rPr>
+        <w:rFonts w:ascii="Wingdings" w:hAnsi="Wingdings" w:hint="default"/>
+      </w:rPr>
+    </w:lvl>
+    <w:lvl w:ilvl="3" w:tplc="08090001" w:tentative="1">
+      <w:start w:val="1"/>
+      <w:numFmt w:val="bullet"/>
+      <w:lvlText w:val=""/>
+      <w:lvlJc w:val="left"/>
+      <w:pPr>
+        <w:ind w:left="2880" w:hanging="360"/>
+      </w:pPr>
+      <w:rPr>
+        <w:rFonts w:ascii="Symbol" w:hAnsi="Symbol" w:hint="default"/>
+      </w:rPr>
+    </w:lvl>
+    <w:lvl w:ilvl="4" w:tplc="08090003" w:tentative="1">
+      <w:start w:val="1"/>
+      <w:numFmt w:val="bullet"/>
+      <w:lvlText w:val="o"/>
+      <w:lvlJc w:val="left"/>
+      <w:pPr>
+        <w:ind w:left="3600" w:hanging="360"/>
+      </w:pPr>
+      <w:rPr>
+        <w:rFonts w:ascii="Courier New" w:hAnsi="Courier New" w:cs="Courier New" w:hint="default"/>
+      </w:rPr>
+    </w:lvl>
+    <w:lvl w:ilvl="5" w:tplc="08090005" w:tentative="1">
+      <w:start w:val="1"/>
+      <w:numFmt w:val="bullet"/>
+      <w:lvlText w:val=""/>
+      <w:lvlJc w:val="left"/>
+      <w:pPr>
+        <w:ind w:left="4320" w:hanging="360"/>
+      </w:pPr>
+      <w:rPr>
+        <w:rFonts w:ascii="Wingdings" w:hAnsi="Wingdings" w:hint="default"/>
+      </w:rPr>
+    </w:lvl>
+    <w:lvl w:ilvl="6" w:tplc="08090001" w:tentative="1">
+      <w:start w:val="1"/>
+      <w:numFmt w:val="bullet"/>
+      <w:lvlText w:val=""/>
+      <w:lvlJc w:val="left"/>
+      <w:pPr>
+        <w:ind w:left="5040" w:hanging="360"/>
+      </w:pPr>
+      <w:rPr>
+        <w:rFonts w:ascii="Symbol" w:hAnsi="Symbol" w:hint="default"/>
+      </w:rPr>
+    </w:lvl>
+    <w:lvl w:ilvl="7" w:tplc="08090003" w:tentative="1">
+      <w:start w:val="1"/>
+      <w:numFmt w:val="bullet"/>
+      <w:lvlText w:val="o"/>
+      <w:lvlJc w:val="left"/>
+      <w:pPr>
+        <w:ind w:left="5760" w:hanging="360"/>
+      </w:pPr>
+      <w:rPr>
+        <w:rFonts w:ascii="Courier New" w:hAnsi="Courier New" w:cs="Courier New" w:hint="default"/>
+      </w:rPr>
+    </w:lvl>
+    <w:lvl w:ilvl="8" w:tplc="08090005" w:tentative="1">
+      <w:start w:val="1"/>
+      <w:numFmt w:val="bullet"/>
+      <w:lvlText w:val=""/>
+      <w:lvlJc w:val="left"/>
+      <w:pPr>
+        <w:ind w:left="6480" w:hanging="360"/>
+      </w:pPr>
+      <w:rPr>
+        <w:rFonts w:ascii="Wingdings" w:hAnsi="Wingdings" w:hint="default"/>
+      </w:rPr>
+    </w:lvl>
+  </w:abstractNum>
+  <w:num w:numId="1" w16cid:durableId="1030374754">
+    <w:abstractNumId w:val="0"/>
+  </w:num>
+</w:numbering>
+</file>
+
 <file path=word/styles.xml><?xml version="1.0" encoding="utf-8"?>
-<w:styles xmlns:mc="http://schemas.openxmlformats.org/markup-compatibility/2006" xmlns:r="http://schemas.openxmlformats.org/officeDocument/2006/relationships" xmlns:w="http://schemas.openxmlformats.org/wordprocessingml/2006/main" xmlns:w14="http://schemas.microsoft.com/office/word/2010/wordml" xmlns:w15="http://schemas.microsoft.com/office/word/2012/wordml" xmlns:w16cid="http://schemas.microsoft.com/office/word/2016/wordml/cid" xmlns:w16se="http://schemas.microsoft.com/office/word/2015/wordml/symex" mc:Ignorable="w14 w15 w16se w16cid">
+<w:styles xmlns:mc="http://schemas.openxmlformats.org/markup-compatibility/2006" xmlns:r="http://schemas.openxmlformats.org/officeDocument/2006/relationships" xmlns:w="http://schemas.openxmlformats.org/wordprocessingml/2006/main" xmlns:w14="http://schemas.microsoft.com/office/word/2010/wordml" xmlns:w15="http://schemas.microsoft.com/office/word/2012/wordml" xmlns:w16cex="http://schemas.microsoft.com/office/word/2018/wordml/cex" xmlns:w16cid="http://schemas.microsoft.com/office/word/2016/wordml/cid" xmlns:w16="http://schemas.microsoft.com/office/word/2018/wordml" xmlns:w16du="http://schemas.microsoft.com/office/word/2023/wordml/word16du" xmlns:w16sdtdh="http://schemas.microsoft.com/office/word/2020/wordml/sdtdatahash" xmlns:w16sdtfl="http://schemas.microsoft.com/office/word/2024/wordml/sdtformatlock" xmlns:w16se="http://schemas.microsoft.com/office/word/2015/wordml/symex" mc:Ignorable="w14 w15 w16se w16cid w16 w16cex w16sdtdh w16sdtfl w16du">
   <w:docDefaults>
     <w:rPrDefault>
       <w:rPr>
@@ -458,7 +2241,7 @@
       </w:pPr>
     </w:pPrDefault>
   </w:docDefaults>
-  <w:latentStyles w:defLockedState="0" w:defUIPriority="99" w:defSemiHidden="0" w:defUnhideWhenUsed="0" w:defQFormat="0" w:count="375">
+  <w:latentStyles w:defLockedState="0" w:defUIPriority="99" w:defSemiHidden="0" w:defUnhideWhenUsed="0" w:defQFormat="0" w:count="376">
     <w:lsdException w:name="Normal" w:uiPriority="0" w:qFormat="1"/>
     <w:lsdException w:name="heading 1" w:uiPriority="9" w:qFormat="1"/>
     <w:lsdException w:name="heading 2" w:semiHidden="1" w:uiPriority="9" w:unhideWhenUsed="1" w:qFormat="1"/>
@@ -834,6 +2617,7 @@
     <w:lsdException w:name="Smart Hyperlink" w:semiHidden="1" w:unhideWhenUsed="1"/>
     <w:lsdException w:name="Hashtag" w:semiHidden="1" w:unhideWhenUsed="1"/>
     <w:lsdException w:name="Unresolved Mention" w:semiHidden="1" w:unhideWhenUsed="1"/>
+    <w:lsdException w:name="Smart Link" w:semiHidden="1" w:unhideWhenUsed="1"/>
   </w:latentStyles>
   <w:style w:type="paragraph" w:default="1" w:styleId="Normal">
     <w:name w:val="Normal"/>
@@ -842,7 +2626,6 @@
   <w:style w:type="character" w:default="1" w:styleId="DefaultParagraphFont">
     <w:name w:val="Default Paragraph Font"/>
     <w:uiPriority w:val="1"/>
-    <w:semiHidden/>
     <w:unhideWhenUsed/>
   </w:style>
   <w:style w:type="table" w:default="1" w:styleId="TableNormal">
@@ -900,6 +2683,17 @@
       <w:color w:val="954F72" w:themeColor="followedHyperlink"/>
       <w:u w:val="single"/>
     </w:rPr>
+  </w:style>
+  <w:style w:type="paragraph" w:styleId="ListParagraph">
+    <w:name w:val="List Paragraph"/>
+    <w:basedOn w:val="Normal"/>
+    <w:uiPriority w:val="34"/>
+    <w:qFormat/>
+    <w:rsid w:val="004547D1"/>
+    <w:pPr>
+      <w:ind w:left="720"/>
+      <w:contextualSpacing/>
+    </w:pPr>
   </w:style>
 </w:styles>
 </file>
@@ -1200,23 +2994,6 @@
 </file>
 
 <file path=customXml/item1.xml><?xml version="1.0" encoding="utf-8"?>
-<p:properties xmlns:p="http://schemas.microsoft.com/office/2006/metadata/properties" xmlns:xsi="http://www.w3.org/2001/XMLSchema-instance" xmlns:pc="http://schemas.microsoft.com/office/infopath/2007/PartnerControls">
-  <documentManagement>
-    <_activity xmlns="18287d57-4f0a-480d-ad86-c9ee94dcacf3" xsi:nil="true"/>
-  </documentManagement>
-</p:properties>
-</file>
-
-<file path=customXml/item2.xml><?xml version="1.0" encoding="utf-8"?>
-<?mso-contentType ?>
-<FormTemplates xmlns="http://schemas.microsoft.com/sharepoint/v3/contenttype/forms">
-  <Display>DocumentLibraryForm</Display>
-  <Edit>DocumentLibraryForm</Edit>
-  <New>DocumentLibraryForm</New>
-</FormTemplates>
-</file>
-
-<file path=customXml/item3.xml><?xml version="1.0" encoding="utf-8"?>
 <ct:contentTypeSchema xmlns:ct="http://schemas.microsoft.com/office/2006/metadata/contentType" xmlns:ma="http://schemas.microsoft.com/office/2006/metadata/properties/metaAttributes" ct:_="" ma:_="" ma:contentTypeName="Document" ma:contentTypeID="0x01010022BB3F6B8131D840BF96BCF4A4EF84F9" ma:contentTypeVersion="10" ma:contentTypeDescription="Create a new document." ma:contentTypeScope="" ma:versionID="0709e0e00c1628ada2952a194b352c4c">
   <xsd:schema xmlns:xsd="http://www.w3.org/2001/XMLSchema" xmlns:xs="http://www.w3.org/2001/XMLSchema" xmlns:p="http://schemas.microsoft.com/office/2006/metadata/properties" xmlns:ns3="18287d57-4f0a-480d-ad86-c9ee94dcacf3" targetNamespace="http://schemas.microsoft.com/office/2006/metadata/properties" ma:root="true" ma:fieldsID="015a3f7c76741bc21ba02f2dd042d1e6" ns3:_="">
     <xsd:import namespace="18287d57-4f0a-480d-ad86-c9ee94dcacf3"/>
@@ -1398,31 +3175,24 @@
 </ct:contentTypeSchema>
 </file>
 
-<file path=customXml/itemProps1.xml><?xml version="1.0" encoding="utf-8"?>
-<ds:datastoreItem xmlns:ds="http://schemas.openxmlformats.org/officeDocument/2006/customXml" ds:itemID="{64618EF6-6623-4DC4-AAB5-0FCDD6983B68}">
-  <ds:schemaRefs>
-    <ds:schemaRef ds:uri="http://schemas.microsoft.com/office/2006/documentManagement/types"/>
-    <ds:schemaRef ds:uri="http://purl.org/dc/terms/"/>
-    <ds:schemaRef ds:uri="http://schemas.microsoft.com/office/infopath/2007/PartnerControls"/>
-    <ds:schemaRef ds:uri="http://www.w3.org/XML/1998/namespace"/>
-    <ds:schemaRef ds:uri="18287d57-4f0a-480d-ad86-c9ee94dcacf3"/>
-    <ds:schemaRef ds:uri="http://schemas.microsoft.com/office/2006/metadata/properties"/>
-    <ds:schemaRef ds:uri="http://schemas.openxmlformats.org/package/2006/metadata/core-properties"/>
-    <ds:schemaRef ds:uri="http://purl.org/dc/dcmitype/"/>
-    <ds:schemaRef ds:uri="http://purl.org/dc/elements/1.1/"/>
-  </ds:schemaRefs>
-</ds:datastoreItem>
+<file path=customXml/item2.xml><?xml version="1.0" encoding="utf-8"?>
+<?mso-contentType ?>
+<FormTemplates xmlns="http://schemas.microsoft.com/sharepoint/v3/contenttype/forms">
+  <Display>DocumentLibraryForm</Display>
+  <Edit>DocumentLibraryForm</Edit>
+  <New>DocumentLibraryForm</New>
+</FormTemplates>
 </file>
 
-<file path=customXml/itemProps2.xml><?xml version="1.0" encoding="utf-8"?>
-<ds:datastoreItem xmlns:ds="http://schemas.openxmlformats.org/officeDocument/2006/customXml" ds:itemID="{B0A76E36-1CD7-4800-A269-A83947C5CADC}">
-  <ds:schemaRefs>
-    <ds:schemaRef ds:uri="http://schemas.microsoft.com/sharepoint/v3/contenttype/forms"/>
-  </ds:schemaRefs>
-</ds:datastoreItem>
+<file path=customXml/item3.xml><?xml version="1.0" encoding="utf-8"?>
+<p:properties xmlns:p="http://schemas.microsoft.com/office/2006/metadata/properties" xmlns:xsi="http://www.w3.org/2001/XMLSchema-instance" xmlns:pc="http://schemas.microsoft.com/office/infopath/2007/PartnerControls">
+  <documentManagement>
+    <_activity xmlns="18287d57-4f0a-480d-ad86-c9ee94dcacf3" xsi:nil="true"/>
+  </documentManagement>
+</p:properties>
 </file>
 
-<file path=customXml/itemProps3.xml><?xml version="1.0" encoding="utf-8"?>
+<file path=customXml/itemProps1.xml><?xml version="1.0" encoding="utf-8"?>
 <ds:datastoreItem xmlns:ds="http://schemas.openxmlformats.org/officeDocument/2006/customXml" ds:itemID="{7B03F66D-B961-483C-B46B-B2DB333DF10C}">
   <ds:schemaRefs>
     <ds:schemaRef ds:uri="http://schemas.microsoft.com/office/2006/metadata/contentType"/>
@@ -1438,4 +3208,22 @@
     <ds:schemaRef ds:uri="http://schemas.microsoft.com/internal/obd"/>
   </ds:schemaRefs>
 </ds:datastoreItem>
+</file>
+
+<file path=customXml/itemProps2.xml><?xml version="1.0" encoding="utf-8"?>
+<ds:datastoreItem xmlns:ds="http://schemas.openxmlformats.org/officeDocument/2006/customXml" ds:itemID="{B0A76E36-1CD7-4800-A269-A83947C5CADC}">
+  <ds:schemaRefs>
+    <ds:schemaRef ds:uri="http://schemas.microsoft.com/sharepoint/v3/contenttype/forms"/>
+  </ds:schemaRefs>
+</ds:datastoreItem>
+</file>
+
+<file path=customXml/itemProps3.xml><?xml version="1.0" encoding="utf-8"?>
+<ds:datastoreItem xmlns:ds="http://schemas.openxmlformats.org/officeDocument/2006/customXml" ds:itemID="{64618EF6-6623-4DC4-AAB5-0FCDD6983B68}">
+  <ds:schemaRefs>
+    <ds:schemaRef ds:uri="http://schemas.microsoft.com/office/2006/metadata/properties"/>
+    <ds:schemaRef ds:uri="http://schemas.microsoft.com/office/infopath/2007/PartnerControls"/>
+    <ds:schemaRef ds:uri="18287d57-4f0a-480d-ad86-c9ee94dcacf3"/>
+  </ds:schemaRefs>
+</ds:datastoreItem>
 </file>
</xml_diff>

<commit_message>
zhu lie do the thing
</commit_message>
<xml_diff>
--- a/Analysis.docx
+++ b/Analysis.docx
@@ -101,15 +101,15 @@
     <w:p>
       <w:pPr>
         <w:rPr>
-          <w:sz w:val="24"/>
-          <w:szCs w:val="24"/>
-          <w:u w:val="single"/>
-        </w:rPr>
-      </w:pPr>
-      <w:r>
-        <w:rPr>
-          <w:sz w:val="24"/>
-          <w:szCs w:val="24"/>
+          <w:sz w:val="32"/>
+          <w:szCs w:val="32"/>
+          <w:u w:val="single"/>
+        </w:rPr>
+      </w:pPr>
+      <w:r>
+        <w:rPr>
+          <w:sz w:val="32"/>
+          <w:szCs w:val="32"/>
           <w:u w:val="single"/>
         </w:rPr>
         <w:t>Introduction:</w:t>
@@ -140,15 +140,15 @@
     <w:p>
       <w:pPr>
         <w:rPr>
-          <w:sz w:val="24"/>
-          <w:szCs w:val="24"/>
-          <w:u w:val="single"/>
-        </w:rPr>
-      </w:pPr>
-      <w:r>
-        <w:rPr>
-          <w:sz w:val="24"/>
-          <w:szCs w:val="24"/>
+          <w:sz w:val="32"/>
+          <w:szCs w:val="32"/>
+          <w:u w:val="single"/>
+        </w:rPr>
+      </w:pPr>
+      <w:r>
+        <w:rPr>
+          <w:sz w:val="32"/>
+          <w:szCs w:val="32"/>
           <w:u w:val="single"/>
         </w:rPr>
         <w:t>Background:</w:t>
@@ -181,18 +181,26 @@
           <w:sz w:val="24"/>
           <w:szCs w:val="24"/>
         </w:rPr>
-        <w:t>The photo below is my initial plan of my project, which I added to over the course of my NEA.</w:t>
-      </w:r>
-    </w:p>
-    <w:p>
-      <w:pPr>
-        <w:rPr>
-          <w:sz w:val="24"/>
-          <w:szCs w:val="24"/>
-        </w:rPr>
-      </w:pPr>
-      <w:r>
-        <w:rPr>
+        <w:t>The photo below is my initial plan of my project</w:t>
+      </w:r>
+      <w:r>
+        <w:rPr>
+          <w:sz w:val="24"/>
+          <w:szCs w:val="24"/>
+        </w:rPr>
+        <w:t>. On the left is a screenshot of the official AQA Assembly instruction set taken from their website.</w:t>
+      </w:r>
+    </w:p>
+    <w:p>
+      <w:pPr>
+        <w:rPr>
+          <w:sz w:val="24"/>
+          <w:szCs w:val="24"/>
+        </w:rPr>
+      </w:pPr>
+      <w:r>
+        <w:rPr>
+          <w:noProof/>
           <w:sz w:val="24"/>
           <w:szCs w:val="24"/>
         </w:rPr>
@@ -236,15 +244,15 @@
     <w:p>
       <w:pPr>
         <w:rPr>
-          <w:sz w:val="24"/>
-          <w:szCs w:val="24"/>
-          <w:u w:val="single"/>
-        </w:rPr>
-      </w:pPr>
-      <w:r>
-        <w:rPr>
-          <w:sz w:val="24"/>
-          <w:szCs w:val="24"/>
+          <w:sz w:val="32"/>
+          <w:szCs w:val="32"/>
+          <w:u w:val="single"/>
+        </w:rPr>
+      </w:pPr>
+      <w:r>
+        <w:rPr>
+          <w:sz w:val="32"/>
+          <w:szCs w:val="32"/>
           <w:u w:val="single"/>
         </w:rPr>
         <w:t>Research:</w:t>
@@ -262,7 +270,15 @@
           <w:sz w:val="24"/>
           <w:szCs w:val="24"/>
         </w:rPr>
-        <w:t>To research for this project, I have spoken with my fellow students to see what they would like in an assembly program. To aid with this, I created a form in which the others could outline their wishes. I received 9 respon</w:t>
+        <w:t xml:space="preserve">To research for this project, I have spoken with my fellow students to see what they would like in an assembly program. To aid with this, I created a form in which the others could </w:t>
+      </w:r>
+      <w:r>
+        <w:rPr>
+          <w:sz w:val="24"/>
+          <w:szCs w:val="24"/>
+        </w:rPr>
+        <w:lastRenderedPageBreak/>
+        <w:t>outline their wishes. I received 9 respon</w:t>
       </w:r>
       <w:r>
         <w:rPr>
@@ -296,18 +312,17 @@
     <w:p>
       <w:pPr>
         <w:rPr>
-          <w:sz w:val="24"/>
-          <w:szCs w:val="24"/>
-          <w:u w:val="single"/>
-        </w:rPr>
-      </w:pPr>
-      <w:r>
-        <w:rPr>
-          <w:sz w:val="24"/>
-          <w:szCs w:val="24"/>
-          <w:u w:val="single"/>
-        </w:rPr>
-        <w:lastRenderedPageBreak/>
+          <w:sz w:val="32"/>
+          <w:szCs w:val="32"/>
+          <w:u w:val="single"/>
+        </w:rPr>
+      </w:pPr>
+      <w:r>
+        <w:rPr>
+          <w:sz w:val="32"/>
+          <w:szCs w:val="32"/>
+          <w:u w:val="single"/>
+        </w:rPr>
         <w:t>User:</w:t>
       </w:r>
     </w:p>
@@ -348,7 +363,7 @@
           <w:szCs w:val="24"/>
         </w:rPr>
         <w:drawing>
-          <wp:inline distT="0" distB="0" distL="0" distR="0" wp14:anchorId="12FF3419" wp14:editId="094A18C3">
+          <wp:inline distT="0" distB="0" distL="0" distR="0" wp14:anchorId="12FF3419" wp14:editId="2013A646">
             <wp:extent cx="5731510" cy="2689860"/>
             <wp:effectExtent l="0" t="0" r="2540" b="0"/>
             <wp:docPr id="2" name="Picture 2"/>
@@ -444,15 +459,15 @@
     <w:p>
       <w:pPr>
         <w:rPr>
-          <w:sz w:val="24"/>
-          <w:szCs w:val="24"/>
-          <w:u w:val="single"/>
-        </w:rPr>
-      </w:pPr>
-      <w:r>
-        <w:rPr>
-          <w:sz w:val="24"/>
-          <w:szCs w:val="24"/>
+          <w:sz w:val="32"/>
+          <w:szCs w:val="32"/>
+          <w:u w:val="single"/>
+        </w:rPr>
+      </w:pPr>
+      <w:r>
+        <w:rPr>
+          <w:sz w:val="32"/>
+          <w:szCs w:val="32"/>
           <w:u w:val="single"/>
         </w:rPr>
         <w:t>Similar Solutions:</w:t>
@@ -461,14 +476,70 @@
     <w:p>
       <w:pPr>
         <w:rPr>
-          <w:noProof/>
-        </w:rPr>
-      </w:pPr>
-      <w:r>
-        <w:rPr>
-          <w:sz w:val="24"/>
-          <w:szCs w:val="24"/>
-        </w:rPr>
+          <w:sz w:val="24"/>
+          <w:szCs w:val="24"/>
+        </w:rPr>
+      </w:pPr>
+      <w:r>
+        <w:rPr>
+          <w:sz w:val="24"/>
+          <w:szCs w:val="24"/>
+        </w:rPr>
+        <w:t xml:space="preserve">As I was researching this topic, I found the AQA Assembly Language Simulator by Peter Higginson. We have used it in lesson before, </w:t>
+      </w:r>
+      <w:proofErr w:type="gramStart"/>
+      <w:r>
+        <w:rPr>
+          <w:sz w:val="24"/>
+          <w:szCs w:val="24"/>
+        </w:rPr>
+        <w:t>in order to</w:t>
+      </w:r>
+      <w:proofErr w:type="gramEnd"/>
+      <w:r>
+        <w:rPr>
+          <w:sz w:val="24"/>
+          <w:szCs w:val="24"/>
+        </w:rPr>
+        <w:t xml:space="preserve"> simulate our assembly code and watch the fetch execute cycle as it is performed, however for my research I focused on the features available and the reasons they were added. For example, with this simulator the user </w:t>
+      </w:r>
+      <w:proofErr w:type="gramStart"/>
+      <w:r>
+        <w:rPr>
+          <w:sz w:val="24"/>
+          <w:szCs w:val="24"/>
+        </w:rPr>
+        <w:t>has the ability to</w:t>
+      </w:r>
+      <w:proofErr w:type="gramEnd"/>
+      <w:r>
+        <w:rPr>
+          <w:sz w:val="24"/>
+          <w:szCs w:val="24"/>
+        </w:rPr>
+        <w:t xml:space="preserve"> change the speed at which the program runs, from very slow, to a medium speed, to so fast that the fetch execute cycle is not shown, and only the result of each instruction is </w:t>
+      </w:r>
+      <w:r>
+        <w:rPr>
+          <w:sz w:val="24"/>
+          <w:szCs w:val="24"/>
+        </w:rPr>
+        <w:t>outputted to the user. An ability to slow down or speed up the code is very useful, as it makes understanding the fetch-execute cycle much easier. However, due to the way I have implemented my program, doing this would be difficult, so it was something I noted as more of a stretch goal, if I had the time and ability later in my project.</w:t>
+      </w:r>
+    </w:p>
+    <w:p>
+      <w:pPr>
+        <w:rPr>
+          <w:sz w:val="24"/>
+          <w:szCs w:val="24"/>
+        </w:rPr>
+      </w:pPr>
+      <w:r>
+        <w:rPr>
+          <w:sz w:val="24"/>
+          <w:szCs w:val="24"/>
+        </w:rPr>
+        <w:lastRenderedPageBreak/>
         <w:t>As I was researching this topic,</w:t>
       </w:r>
       <w:r>
@@ -492,23 +563,7 @@
             <w:sz w:val="24"/>
             <w:szCs w:val="24"/>
           </w:rPr>
-          <w:t>AQA Assembly Langu</w:t>
-        </w:r>
-        <w:r>
-          <w:rPr>
-            <w:rStyle w:val="Hyperlink"/>
-            <w:sz w:val="24"/>
-            <w:szCs w:val="24"/>
-          </w:rPr>
-          <w:t>a</w:t>
-        </w:r>
-        <w:r>
-          <w:rPr>
-            <w:rStyle w:val="Hyperlink"/>
-            <w:sz w:val="24"/>
-            <w:szCs w:val="24"/>
-          </w:rPr>
-          <w:t>ge Simulator by Peter Higginson</w:t>
+          <w:t>AQA Assembly Language Simulator by Peter Higginson</w:t>
         </w:r>
       </w:hyperlink>
       <w:r>
@@ -526,13 +581,22 @@
       </w:r>
       <w:r>
         <w:rPr>
+          <w:noProof/>
           <w:sz w:val="24"/>
           <w:szCs w:val="24"/>
         </w:rPr>
         <w:drawing>
-          <wp:inline distT="0" distB="0" distL="0" distR="0" wp14:anchorId="42352DEA" wp14:editId="5C61F502">
+          <wp:anchor distT="0" distB="0" distL="114300" distR="114300" simplePos="0" relativeHeight="251658240" behindDoc="0" locked="0" layoutInCell="1" allowOverlap="1" wp14:anchorId="42352DEA" wp14:editId="18348395">
+            <wp:simplePos x="0" y="0"/>
+            <wp:positionH relativeFrom="column">
+              <wp:posOffset>0</wp:posOffset>
+            </wp:positionH>
+            <wp:positionV relativeFrom="paragraph">
+              <wp:posOffset>400050</wp:posOffset>
+            </wp:positionV>
             <wp:extent cx="5731510" cy="4058920"/>
             <wp:effectExtent l="0" t="0" r="2540" b="0"/>
+            <wp:wrapTopAndBottom/>
             <wp:docPr id="1689027074" name="Picture 1"/>
             <wp:cNvGraphicFramePr>
               <a:graphicFrameLocks xmlns:a="http://schemas.openxmlformats.org/drawingml/2006/main" noChangeAspect="1"/>
@@ -545,7 +609,13 @@
                     <pic:cNvPicPr/>
                   </pic:nvPicPr>
                   <pic:blipFill>
-                    <a:blip r:embed="rId11"/>
+                    <a:blip r:embed="rId11">
+                      <a:extLst>
+                        <a:ext uri="{28A0092B-C50C-407E-A947-70E740481C1C}">
+                          <a14:useLocalDpi xmlns:a14="http://schemas.microsoft.com/office/drawing/2010/main" val="0"/>
+                        </a:ext>
+                      </a:extLst>
+                    </a:blip>
                     <a:stretch>
                       <a:fillRect/>
                     </a:stretch>
@@ -562,7 +632,7 @@
                 </pic:pic>
               </a:graphicData>
             </a:graphic>
-          </wp:inline>
+          </wp:anchor>
         </w:drawing>
       </w:r>
     </w:p>
@@ -570,15 +640,18 @@
       <w:pPr>
         <w:rPr>
           <w:noProof/>
-          <w:u w:val="single"/>
-        </w:rPr>
-      </w:pPr>
-      <w:r>
-        <w:rPr>
-          <w:noProof/>
-          <w:u w:val="single"/>
-        </w:rPr>
-        <w:lastRenderedPageBreak/>
+          <w:sz w:val="28"/>
+          <w:szCs w:val="28"/>
+          <w:u w:val="single"/>
+        </w:rPr>
+      </w:pPr>
+      <w:r>
+        <w:rPr>
+          <w:noProof/>
+          <w:sz w:val="28"/>
+          <w:szCs w:val="28"/>
+          <w:u w:val="single"/>
+        </w:rPr>
         <w:t>Key benefits:</w:t>
       </w:r>
     </w:p>
@@ -780,6 +853,7 @@
         <w:rPr>
           <w:noProof/>
         </w:rPr>
+        <w:lastRenderedPageBreak/>
         <w:t xml:space="preserve">I also found </w:t>
       </w:r>
       <w:hyperlink r:id="rId12" w:history="1">
@@ -842,12 +916,16 @@
       <w:pPr>
         <w:rPr>
           <w:noProof/>
-          <w:u w:val="single"/>
-        </w:rPr>
-      </w:pPr>
-      <w:r>
-        <w:rPr>
-          <w:noProof/>
+          <w:sz w:val="28"/>
+          <w:szCs w:val="28"/>
+          <w:u w:val="single"/>
+        </w:rPr>
+      </w:pPr>
+      <w:r>
+        <w:rPr>
+          <w:noProof/>
+          <w:sz w:val="28"/>
+          <w:szCs w:val="28"/>
           <w:u w:val="single"/>
         </w:rPr>
         <w:t>Key Benefits:</w:t>
@@ -947,10 +1025,10 @@
       </w:pPr>
       <w:r>
         <w:rPr>
-          <w:sz w:val="24"/>
-          <w:szCs w:val="24"/>
-        </w:rPr>
-        <w:lastRenderedPageBreak/>
+          <w:noProof/>
+          <w:sz w:val="24"/>
+          <w:szCs w:val="24"/>
+        </w:rPr>
         <w:drawing>
           <wp:inline distT="0" distB="0" distL="0" distR="0" wp14:anchorId="3D1097A6" wp14:editId="227BB8A3">
             <wp:extent cx="5731510" cy="1055370"/>
@@ -1081,22 +1159,76 @@
           <w:sz w:val="24"/>
           <w:szCs w:val="24"/>
         </w:rPr>
-        <w:t xml:space="preserve"> Additionally, I chose </w:t>
-      </w:r>
+        <w:t xml:space="preserve"> Addit</w:t>
+      </w:r>
+      <w:r>
+        <w:rPr>
+          <w:sz w:val="24"/>
+          <w:szCs w:val="24"/>
+        </w:rPr>
+        <w:t xml:space="preserve">ionally, the ease of accessibility of this product inspired me to make my project accessible via the web. This would require more research, which I have performed and have </w:t>
+      </w:r>
+      <w:r>
+        <w:rPr>
+          <w:sz w:val="24"/>
+          <w:szCs w:val="24"/>
+        </w:rPr>
+        <w:lastRenderedPageBreak/>
+        <w:t>written about below. Anything</w:t>
+      </w:r>
+      <w:r>
+        <w:rPr>
+          <w:sz w:val="24"/>
+          <w:szCs w:val="24"/>
+        </w:rPr>
+        <w:t xml:space="preserve"> else I could achieve would be a good bonus,</w:t>
+      </w:r>
+      <w:r>
+        <w:rPr>
+          <w:sz w:val="24"/>
+          <w:szCs w:val="24"/>
+        </w:rPr>
+        <w:t xml:space="preserve"> but not </w:t>
+      </w:r>
+      <w:r>
+        <w:rPr>
+          <w:sz w:val="24"/>
+          <w:szCs w:val="24"/>
+        </w:rPr>
+        <w:t>a key objective.</w:t>
+      </w:r>
+    </w:p>
+    <w:p>
+      <w:pPr>
+        <w:rPr>
+          <w:sz w:val="32"/>
+          <w:szCs w:val="32"/>
+          <w:u w:val="single"/>
+        </w:rPr>
+      </w:pPr>
+      <w:r>
+        <w:rPr>
+          <w:sz w:val="32"/>
+          <w:szCs w:val="32"/>
+          <w:u w:val="single"/>
+        </w:rPr>
+        <w:t>Implementation:</w:t>
+      </w:r>
+    </w:p>
+    <w:p>
+      <w:pPr>
+        <w:rPr>
+          <w:sz w:val="24"/>
+          <w:szCs w:val="24"/>
+        </w:rPr>
+      </w:pPr>
       <w:proofErr w:type="gramStart"/>
       <w:r>
         <w:rPr>
           <w:sz w:val="24"/>
           <w:szCs w:val="24"/>
         </w:rPr>
-        <w:t xml:space="preserve">to </w:t>
-      </w:r>
-      <w:r>
-        <w:rPr>
-          <w:sz w:val="24"/>
-          <w:szCs w:val="24"/>
-        </w:rPr>
-        <w:t xml:space="preserve"> Anything</w:t>
+        <w:t>In order to</w:t>
       </w:r>
       <w:proofErr w:type="gramEnd"/>
       <w:r>
@@ -1104,47 +1236,45 @@
           <w:sz w:val="24"/>
           <w:szCs w:val="24"/>
         </w:rPr>
-        <w:t xml:space="preserve"> else I could achieve would be a good bonus,</w:t>
-      </w:r>
-      <w:r>
-        <w:rPr>
-          <w:sz w:val="24"/>
-          <w:szCs w:val="24"/>
-        </w:rPr>
-        <w:t xml:space="preserve"> but not my highest priority.</w:t>
-      </w:r>
-    </w:p>
-    <w:p>
-      <w:pPr>
-        <w:rPr>
-          <w:sz w:val="24"/>
-          <w:szCs w:val="24"/>
-          <w:u w:val="single"/>
-        </w:rPr>
-      </w:pPr>
-      <w:r>
-        <w:rPr>
-          <w:sz w:val="24"/>
-          <w:szCs w:val="24"/>
-          <w:u w:val="single"/>
-        </w:rPr>
-        <w:t>Implementation:</w:t>
-      </w:r>
-    </w:p>
-    <w:p>
-      <w:pPr>
-        <w:rPr>
-          <w:sz w:val="24"/>
-          <w:szCs w:val="24"/>
-        </w:rPr>
-      </w:pPr>
+        <w:t xml:space="preserve"> implement a web server and handle databases, I had to research the available libraries. </w:t>
+      </w:r>
+    </w:p>
+    <w:p>
+      <w:pPr>
+        <w:rPr>
+          <w:sz w:val="24"/>
+          <w:szCs w:val="24"/>
+        </w:rPr>
+      </w:pPr>
+      <w:r>
+        <w:rPr>
+          <w:sz w:val="24"/>
+          <w:szCs w:val="24"/>
+        </w:rPr>
+        <w:t xml:space="preserve">For the web server, I found two options; Flask, and Django. </w:t>
+      </w:r>
+    </w:p>
+    <w:p>
+      <w:pPr>
+        <w:rPr>
+          <w:sz w:val="24"/>
+          <w:szCs w:val="24"/>
+        </w:rPr>
+      </w:pPr>
+      <w:r>
+        <w:rPr>
+          <w:sz w:val="24"/>
+          <w:szCs w:val="24"/>
+        </w:rPr>
+        <w:t xml:space="preserve">Flask, described as a “lightweight WSGI web application framework” python library. Primarily, it is used for smaller projects but has the capability to scale to more complex applications. This makes it useful for my project as it will be easy to </w:t>
+      </w:r>
       <w:proofErr w:type="gramStart"/>
       <w:r>
         <w:rPr>
           <w:sz w:val="24"/>
           <w:szCs w:val="24"/>
         </w:rPr>
-        <w:t>In order to</w:t>
+        <w:t>implement, and</w:t>
       </w:r>
       <w:proofErr w:type="gramEnd"/>
       <w:r>
@@ -1152,66 +1282,22 @@
           <w:sz w:val="24"/>
           <w:szCs w:val="24"/>
         </w:rPr>
-        <w:t xml:space="preserve"> implement a web server and handle databases, I had to research the available libraries. </w:t>
-      </w:r>
-    </w:p>
-    <w:p>
-      <w:pPr>
-        <w:rPr>
-          <w:sz w:val="24"/>
-          <w:szCs w:val="24"/>
-        </w:rPr>
-      </w:pPr>
-      <w:r>
-        <w:rPr>
-          <w:sz w:val="24"/>
-          <w:szCs w:val="24"/>
-        </w:rPr>
-        <w:t xml:space="preserve">For the web server, I found two options; Flask, and Django. </w:t>
-      </w:r>
-      <w:r>
-        <w:rPr>
-          <w:sz w:val="24"/>
-          <w:szCs w:val="24"/>
-        </w:rPr>
-        <w:t xml:space="preserve">Flask, </w:t>
-      </w:r>
-      <w:r>
-        <w:rPr>
-          <w:sz w:val="24"/>
-          <w:szCs w:val="24"/>
-        </w:rPr>
-        <w:t xml:space="preserve">described as a </w:t>
-      </w:r>
-      <w:r>
-        <w:rPr>
-          <w:sz w:val="24"/>
-          <w:szCs w:val="24"/>
-        </w:rPr>
-        <w:t>“lightweight WSGI web application framework” python library. Primarily, it is used for smaller projects but has the capability to scale to more complex applications.</w:t>
-      </w:r>
-      <w:r>
-        <w:rPr>
-          <w:sz w:val="24"/>
-          <w:szCs w:val="24"/>
-        </w:rPr>
-        <w:t xml:space="preserve"> This makes it useful for my project as it will be easy to </w:t>
-      </w:r>
-      <w:proofErr w:type="gramStart"/>
-      <w:r>
-        <w:rPr>
-          <w:sz w:val="24"/>
-          <w:szCs w:val="24"/>
-        </w:rPr>
-        <w:t>implement, and</w:t>
-      </w:r>
-      <w:proofErr w:type="gramEnd"/>
-      <w:r>
-        <w:rPr>
-          <w:sz w:val="24"/>
-          <w:szCs w:val="24"/>
-        </w:rPr>
-        <w:t xml:space="preserve"> will not require much extra work to ensure all code works with Flask. On the other hand, there is Django,</w:t>
+        <w:t xml:space="preserve"> will not require much extra work to ensure all code works with Flask. </w:t>
+      </w:r>
+    </w:p>
+    <w:p>
+      <w:pPr>
+        <w:rPr>
+          <w:sz w:val="24"/>
+          <w:szCs w:val="24"/>
+        </w:rPr>
+      </w:pPr>
+      <w:r>
+        <w:rPr>
+          <w:sz w:val="24"/>
+          <w:szCs w:val="24"/>
+        </w:rPr>
+        <w:t>On the other hand, there is Django,</w:t>
       </w:r>
       <w:r>
         <w:rPr>
@@ -1232,7 +1318,14 @@
           <w:sz w:val="24"/>
           <w:szCs w:val="24"/>
         </w:rPr>
-        <w:t>.” It comes with built in security and is advertised as being “ridiculously fast”, but is, from my research, harder to immediately implement.</w:t>
+        <w:t>.” It comes with built in security and is advertised as being “ridiculously fast”, but is, from my research, harder to immediately implement</w:t>
+      </w:r>
+      <w:r>
+        <w:rPr>
+          <w:sz w:val="24"/>
+          <w:szCs w:val="24"/>
+        </w:rPr>
+        <w:t>, which would make it require more time to learn.</w:t>
       </w:r>
     </w:p>
     <w:p>
@@ -1294,26 +1387,17 @@
     <w:p>
       <w:pPr>
         <w:rPr>
-          <w:sz w:val="24"/>
-          <w:szCs w:val="24"/>
-        </w:rPr>
-      </w:pPr>
-      <w:r>
-        <w:rPr>
-          <w:sz w:val="24"/>
-          <w:szCs w:val="24"/>
-          <w:u w:val="single"/>
-        </w:rPr>
-        <w:lastRenderedPageBreak/>
-        <w:t>Technical Challenges</w:t>
-      </w:r>
-      <w:r>
-        <w:rPr>
-          <w:sz w:val="24"/>
-          <w:szCs w:val="24"/>
-          <w:u w:val="single"/>
-        </w:rPr>
-        <w:t>:</w:t>
+          <w:sz w:val="32"/>
+          <w:szCs w:val="32"/>
+        </w:rPr>
+      </w:pPr>
+      <w:r>
+        <w:rPr>
+          <w:sz w:val="32"/>
+          <w:szCs w:val="32"/>
+          <w:u w:val="single"/>
+        </w:rPr>
+        <w:t>Technical Challenges:</w:t>
       </w:r>
     </w:p>
     <w:p>
@@ -1447,16 +1531,37 @@
     </w:p>
     <w:p>
       <w:pPr>
-        <w:rPr>
-          <w:sz w:val="24"/>
-          <w:szCs w:val="24"/>
-          <w:u w:val="single"/>
-        </w:rPr>
-      </w:pPr>
-      <w:r>
-        <w:rPr>
-          <w:sz w:val="24"/>
-          <w:szCs w:val="24"/>
+        <w:pStyle w:val="ListParagraph"/>
+        <w:numPr>
+          <w:ilvl w:val="0"/>
+          <w:numId w:val="1"/>
+        </w:numPr>
+        <w:rPr>
+          <w:sz w:val="24"/>
+          <w:szCs w:val="24"/>
+        </w:rPr>
+      </w:pPr>
+      <w:r>
+        <w:rPr>
+          <w:sz w:val="24"/>
+          <w:szCs w:val="24"/>
+        </w:rPr>
+        <w:lastRenderedPageBreak/>
+        <w:t>Security: How will the website be secure?</w:t>
+      </w:r>
+    </w:p>
+    <w:p>
+      <w:pPr>
+        <w:rPr>
+          <w:sz w:val="28"/>
+          <w:szCs w:val="28"/>
+          <w:u w:val="single"/>
+        </w:rPr>
+      </w:pPr>
+      <w:r>
+        <w:rPr>
+          <w:sz w:val="28"/>
+          <w:szCs w:val="28"/>
           <w:u w:val="single"/>
         </w:rPr>
         <w:t>Challenge 1:</w:t>
@@ -1509,15 +1614,15 @@
     <w:p>
       <w:pPr>
         <w:rPr>
-          <w:sz w:val="24"/>
-          <w:szCs w:val="24"/>
-          <w:u w:val="single"/>
-        </w:rPr>
-      </w:pPr>
-      <w:r>
-        <w:rPr>
-          <w:sz w:val="24"/>
-          <w:szCs w:val="24"/>
+          <w:sz w:val="28"/>
+          <w:szCs w:val="28"/>
+          <w:u w:val="single"/>
+        </w:rPr>
+      </w:pPr>
+      <w:r>
+        <w:rPr>
+          <w:sz w:val="28"/>
+          <w:szCs w:val="28"/>
           <w:u w:val="single"/>
         </w:rPr>
         <w:t>Challenge 2:</w:t>
@@ -1562,15 +1667,15 @@
     <w:p>
       <w:pPr>
         <w:rPr>
-          <w:sz w:val="24"/>
-          <w:szCs w:val="24"/>
-          <w:u w:val="single"/>
-        </w:rPr>
-      </w:pPr>
-      <w:r>
-        <w:rPr>
-          <w:sz w:val="24"/>
-          <w:szCs w:val="24"/>
+          <w:sz w:val="28"/>
+          <w:szCs w:val="28"/>
+          <w:u w:val="single"/>
+        </w:rPr>
+      </w:pPr>
+      <w:r>
+        <w:rPr>
+          <w:sz w:val="28"/>
+          <w:szCs w:val="28"/>
           <w:u w:val="single"/>
         </w:rPr>
         <w:t>Challenge 3:</w:t>
@@ -1635,7 +1740,23 @@
           <w:sz w:val="24"/>
           <w:szCs w:val="24"/>
         </w:rPr>
-        <w:t xml:space="preserve"> get said location whenever the label is called upon, for a branch instruction or similar. This would be much slower compared to the method described above as it would take time to lookup the values from the dictionary, but it would make errors easier to understand as I could simply give the label name.</w:t>
+        <w:t xml:space="preserve"> get said location whenever the label is called upon, for a branch instruction or similar. This would be much slower compared to the method described above as it would take time to </w:t>
+      </w:r>
+      <w:proofErr w:type="spellStart"/>
+      <w:r>
+        <w:rPr>
+          <w:sz w:val="24"/>
+          <w:szCs w:val="24"/>
+        </w:rPr>
+        <w:t>lookup</w:t>
+      </w:r>
+      <w:proofErr w:type="spellEnd"/>
+      <w:r>
+        <w:rPr>
+          <w:sz w:val="24"/>
+          <w:szCs w:val="24"/>
+        </w:rPr>
+        <w:t xml:space="preserve"> the values from the dictionary, but it would make errors easier to understand as I could simply give the label name.</w:t>
       </w:r>
     </w:p>
     <w:p>
@@ -1671,7 +1792,84 @@
           <w:sz w:val="24"/>
           <w:szCs w:val="24"/>
         </w:rPr>
-        <w:t xml:space="preserve"> already and do not require blazingly fast execute speeds, I chose the second </w:t>
+        <w:t xml:space="preserve"> already and do not require blazingly fast execute speeds, I chose the second option, as it made the user debugging experience better. This also made the writing of the compiler easier, which gave me more time to work on the rest of the program.</w:t>
+      </w:r>
+    </w:p>
+    <w:p>
+      <w:pPr>
+        <w:rPr>
+          <w:sz w:val="28"/>
+          <w:szCs w:val="28"/>
+        </w:rPr>
+      </w:pPr>
+      <w:r>
+        <w:rPr>
+          <w:sz w:val="28"/>
+          <w:szCs w:val="28"/>
+          <w:u w:val="single"/>
+        </w:rPr>
+        <w:t>Challenge 4:</w:t>
+      </w:r>
+    </w:p>
+    <w:p>
+      <w:pPr>
+        <w:rPr>
+          <w:sz w:val="24"/>
+          <w:szCs w:val="24"/>
+        </w:rPr>
+      </w:pPr>
+      <w:r>
+        <w:rPr>
+          <w:sz w:val="24"/>
+          <w:szCs w:val="24"/>
+        </w:rPr>
+        <w:t xml:space="preserve">This was something I struggled with initially, until I was reminded of the research I had done. Peter Higginson’s solution to the problem used Von Neumann architecture </w:t>
+      </w:r>
+      <w:r>
+        <w:rPr>
+          <w:sz w:val="24"/>
+          <w:szCs w:val="24"/>
+        </w:rPr>
+        <w:t>to</w:t>
+      </w:r>
+      <w:r>
+        <w:rPr>
+          <w:sz w:val="24"/>
+          <w:szCs w:val="24"/>
+        </w:rPr>
+        <w:t xml:space="preserve"> closer mimic most modern computers, which informed my decision to do the same.</w:t>
+      </w:r>
+    </w:p>
+    <w:p>
+      <w:pPr>
+        <w:rPr>
+          <w:sz w:val="28"/>
+          <w:szCs w:val="28"/>
+          <w:u w:val="single"/>
+        </w:rPr>
+      </w:pPr>
+      <w:r>
+        <w:rPr>
+          <w:sz w:val="28"/>
+          <w:szCs w:val="28"/>
+          <w:u w:val="single"/>
+        </w:rPr>
+        <w:t>Challenge 5:</w:t>
+      </w:r>
+    </w:p>
+    <w:p>
+      <w:pPr>
+        <w:rPr>
+          <w:sz w:val="24"/>
+          <w:szCs w:val="24"/>
+        </w:rPr>
+      </w:pPr>
+      <w:r>
+        <w:rPr>
+          <w:sz w:val="24"/>
+          <w:szCs w:val="24"/>
+        </w:rPr>
+        <w:t xml:space="preserve">When I had the idea to allow users to share programs, I did not consider how to implement it. It would require some way of storing the programs, and some way of accessing them. </w:t>
       </w:r>
       <w:r>
         <w:rPr>
@@ -1679,84 +1877,7 @@
           <w:szCs w:val="24"/>
         </w:rPr>
         <w:lastRenderedPageBreak/>
-        <w:t>option, as it made the user debugging experience better. This also made the writing of the compiler easier, which gave me more time to work on the rest of the program.</w:t>
-      </w:r>
-    </w:p>
-    <w:p>
-      <w:pPr>
-        <w:rPr>
-          <w:sz w:val="24"/>
-          <w:szCs w:val="24"/>
-        </w:rPr>
-      </w:pPr>
-      <w:r>
-        <w:rPr>
-          <w:sz w:val="24"/>
-          <w:szCs w:val="24"/>
-          <w:u w:val="single"/>
-        </w:rPr>
-        <w:t>Challenge 4:</w:t>
-      </w:r>
-    </w:p>
-    <w:p>
-      <w:pPr>
-        <w:rPr>
-          <w:sz w:val="24"/>
-          <w:szCs w:val="24"/>
-        </w:rPr>
-      </w:pPr>
-      <w:r>
-        <w:rPr>
-          <w:sz w:val="24"/>
-          <w:szCs w:val="24"/>
-        </w:rPr>
-        <w:t xml:space="preserve">This was something I struggled with initially, until I was reminded of the research I had done. Peter Higginson’s solution to the problem used Von Neumann architecture </w:t>
-      </w:r>
-      <w:r>
-        <w:rPr>
-          <w:sz w:val="24"/>
-          <w:szCs w:val="24"/>
-        </w:rPr>
-        <w:t>to</w:t>
-      </w:r>
-      <w:r>
-        <w:rPr>
-          <w:sz w:val="24"/>
-          <w:szCs w:val="24"/>
-        </w:rPr>
-        <w:t xml:space="preserve"> closer mimic most modern computers, which informed my decision to do the same.</w:t>
-      </w:r>
-    </w:p>
-    <w:p>
-      <w:pPr>
-        <w:rPr>
-          <w:sz w:val="24"/>
-          <w:szCs w:val="24"/>
-          <w:u w:val="single"/>
-        </w:rPr>
-      </w:pPr>
-      <w:r>
-        <w:rPr>
-          <w:sz w:val="24"/>
-          <w:szCs w:val="24"/>
-          <w:u w:val="single"/>
-        </w:rPr>
-        <w:t>Challenge 5:</w:t>
-      </w:r>
-    </w:p>
-    <w:p>
-      <w:pPr>
-        <w:rPr>
-          <w:sz w:val="24"/>
-          <w:szCs w:val="24"/>
-        </w:rPr>
-      </w:pPr>
-      <w:r>
-        <w:rPr>
-          <w:sz w:val="24"/>
-          <w:szCs w:val="24"/>
-        </w:rPr>
-        <w:t xml:space="preserve">When I had the idea to allow users to share programs, I did not consider how to implement it. It would require some way of storing the programs, and some way of accessing them. Thanks to my education, I knew of databases and their uses, which aligned perfectly to solve this problem. </w:t>
+        <w:t xml:space="preserve">Thanks to my education, I knew of databases and their uses, which aligned perfectly to solve this problem. </w:t>
       </w:r>
       <w:r>
         <w:rPr>
@@ -1787,26 +1908,33 @@
         </w:rPr>
         <w:t xml:space="preserve">However, storing programs and making them accessible led to another program. </w:t>
       </w:r>
-    </w:p>
-    <w:p>
-      <w:pPr>
-        <w:rPr>
-          <w:sz w:val="24"/>
-          <w:szCs w:val="24"/>
-        </w:rPr>
-      </w:pPr>
-    </w:p>
-    <w:p>
-      <w:pPr>
-        <w:rPr>
-          <w:sz w:val="24"/>
-          <w:szCs w:val="24"/>
-        </w:rPr>
-      </w:pPr>
-      <w:r>
-        <w:rPr>
-          <w:sz w:val="24"/>
-          <w:szCs w:val="24"/>
+      <w:r>
+        <w:rPr>
+          <w:sz w:val="24"/>
+          <w:szCs w:val="24"/>
+        </w:rPr>
+        <w:t>/</w:t>
+      </w:r>
+    </w:p>
+    <w:p>
+      <w:pPr>
+        <w:rPr>
+          <w:sz w:val="24"/>
+          <w:szCs w:val="24"/>
+        </w:rPr>
+      </w:pPr>
+    </w:p>
+    <w:p>
+      <w:pPr>
+        <w:rPr>
+          <w:sz w:val="32"/>
+          <w:szCs w:val="32"/>
+        </w:rPr>
+      </w:pPr>
+      <w:r>
+        <w:rPr>
+          <w:sz w:val="32"/>
+          <w:szCs w:val="32"/>
           <w:u w:val="single"/>
         </w:rPr>
         <w:t>Conclusion:</w:t>
@@ -1845,15 +1973,15 @@
     <w:p>
       <w:pPr>
         <w:rPr>
-          <w:sz w:val="24"/>
-          <w:szCs w:val="24"/>
-          <w:u w:val="single"/>
-        </w:rPr>
-      </w:pPr>
-      <w:r>
-        <w:rPr>
-          <w:sz w:val="24"/>
-          <w:szCs w:val="24"/>
+          <w:sz w:val="32"/>
+          <w:szCs w:val="32"/>
+          <w:u w:val="single"/>
+        </w:rPr>
+      </w:pPr>
+      <w:r>
+        <w:rPr>
+          <w:sz w:val="32"/>
+          <w:szCs w:val="32"/>
           <w:u w:val="single"/>
         </w:rPr>
         <w:t>Modelling:</w:t>
@@ -1897,6 +2025,7 @@
       </w:pPr>
       <w:r>
         <w:rPr>
+          <w:noProof/>
           <w:sz w:val="24"/>
           <w:szCs w:val="24"/>
         </w:rPr>
@@ -1940,15 +2069,23 @@
     <w:p>
       <w:pPr>
         <w:rPr>
-          <w:sz w:val="24"/>
-          <w:szCs w:val="24"/>
-          <w:u w:val="single"/>
-        </w:rPr>
-      </w:pPr>
-      <w:r>
-        <w:rPr>
-          <w:sz w:val="24"/>
-          <w:szCs w:val="24"/>
+          <w:sz w:val="32"/>
+          <w:szCs w:val="32"/>
+        </w:rPr>
+      </w:pPr>
+    </w:p>
+    <w:p>
+      <w:pPr>
+        <w:rPr>
+          <w:sz w:val="32"/>
+          <w:szCs w:val="32"/>
+          <w:u w:val="single"/>
+        </w:rPr>
+      </w:pPr>
+      <w:r>
+        <w:rPr>
+          <w:sz w:val="32"/>
+          <w:szCs w:val="32"/>
           <w:u w:val="single"/>
         </w:rPr>
         <w:t>Objectives:</w:t>
@@ -1971,7 +2108,6 @@
           <w:sz w:val="24"/>
           <w:szCs w:val="24"/>
         </w:rPr>
-        <w:lastRenderedPageBreak/>
         <w:t>The project should be able to produce the correct output for any given assembly program.</w:t>
       </w:r>
     </w:p>
@@ -2028,7 +2164,15 @@
           <w:sz w:val="24"/>
           <w:szCs w:val="24"/>
         </w:rPr>
-        <w:t xml:space="preserve"> go backwards and forwards through the program to see the changes from one instruction to another.</w:t>
+        <w:t xml:space="preserve"> go backwards </w:t>
+      </w:r>
+      <w:r>
+        <w:rPr>
+          <w:sz w:val="24"/>
+          <w:szCs w:val="24"/>
+        </w:rPr>
+        <w:lastRenderedPageBreak/>
+        <w:t>and forwards through the program to see the changes from one instruction to another.</w:t>
       </w:r>
     </w:p>
     <w:p>
@@ -2626,6 +2770,7 @@
   <w:style w:type="character" w:default="1" w:styleId="DefaultParagraphFont">
     <w:name w:val="Default Paragraph Font"/>
     <w:uiPriority w:val="1"/>
+    <w:semiHidden/>
     <w:unhideWhenUsed/>
   </w:style>
   <w:style w:type="table" w:default="1" w:styleId="TableNormal">

</xml_diff>

<commit_message>
improve analysis text, adding images
get to that 10 page minimum baybee
</commit_message>
<xml_diff>
--- a/Analysis.docx
+++ b/Analysis.docx
@@ -1,6 +1,6 @@
 
 <file path=word/document.xml><?xml version="1.0" encoding="utf-8"?>
-<w:document xmlns:wpc="http://schemas.microsoft.com/office/word/2010/wordprocessingCanvas" xmlns:cx="http://schemas.microsoft.com/office/drawing/2014/chartex" xmlns:cx1="http://schemas.microsoft.com/office/drawing/2015/9/8/chartex" xmlns:cx2="http://schemas.microsoft.com/office/drawing/2015/10/21/chartex" xmlns:cx3="http://schemas.microsoft.com/office/drawing/2016/5/9/chartex" xmlns:cx4="http://schemas.microsoft.com/office/drawing/2016/5/10/chartex" xmlns:cx5="http://schemas.microsoft.com/office/drawing/2016/5/11/chartex" xmlns:cx6="http://schemas.microsoft.com/office/drawing/2016/5/12/chartex" xmlns:cx7="http://schemas.microsoft.com/office/drawing/2016/5/13/chartex" xmlns:cx8="http://schemas.microsoft.com/office/drawing/2016/5/14/chartex" xmlns:mc="http://schemas.openxmlformats.org/markup-compatibility/2006" xmlns:aink="http://schemas.microsoft.com/office/drawing/2016/ink" xmlns:am3d="http://schemas.microsoft.com/office/drawing/2017/model3d" xmlns:o="urn:schemas-microsoft-com:office:office" xmlns:oel="http://schemas.microsoft.com/office/2019/extlst" xmlns:r="http://schemas.openxmlformats.org/officeDocument/2006/relationships" xmlns:m="http://schemas.openxmlformats.org/officeDocument/2006/math" xmlns:v="urn:schemas-microsoft-com:vml" xmlns:wp14="http://schemas.microsoft.com/office/word/2010/wordprocessingDrawing" xmlns:wp="http://schemas.openxmlformats.org/drawingml/2006/wordprocessingDrawing" xmlns:w10="urn:schemas-microsoft-com:office:word" xmlns:w="http://schemas.openxmlformats.org/wordprocessingml/2006/main" xmlns:w14="http://schemas.microsoft.com/office/word/2010/wordml" xmlns:w15="http://schemas.microsoft.com/office/word/2012/wordml" xmlns:w16cex="http://schemas.microsoft.com/office/word/2018/wordml/cex" xmlns:w16cid="http://schemas.microsoft.com/office/word/2016/wordml/cid" xmlns:w16="http://schemas.microsoft.com/office/word/2018/wordml" xmlns:w16du="http://schemas.microsoft.com/office/word/2023/wordml/word16du" xmlns:w16sdtdh="http://schemas.microsoft.com/office/word/2020/wordml/sdtdatahash" xmlns:w16sdtfl="http://schemas.microsoft.com/office/word/2024/wordml/sdtformatlock" xmlns:w16se="http://schemas.microsoft.com/office/word/2015/wordml/symex" xmlns:wpg="http://schemas.microsoft.com/office/word/2010/wordprocessingGroup" xmlns:wpi="http://schemas.microsoft.com/office/word/2010/wordprocessingInk" xmlns:wne="http://schemas.microsoft.com/office/word/2006/wordml" xmlns:wps="http://schemas.microsoft.com/office/word/2010/wordprocessingShape" mc:Ignorable="w14 w15 w16se w16cid w16 w16cex w16sdtdh w16sdtfl w16du wp14">
+<w:document xmlns:wpc="http://schemas.microsoft.com/office/word/2010/wordprocessingCanvas" xmlns:cx="http://schemas.microsoft.com/office/drawing/2014/chartex" xmlns:cx1="http://schemas.microsoft.com/office/drawing/2015/9/8/chartex" xmlns:cx2="http://schemas.microsoft.com/office/drawing/2015/10/21/chartex" xmlns:cx3="http://schemas.microsoft.com/office/drawing/2016/5/9/chartex" xmlns:cx4="http://schemas.microsoft.com/office/drawing/2016/5/10/chartex" xmlns:cx5="http://schemas.microsoft.com/office/drawing/2016/5/11/chartex" xmlns:cx6="http://schemas.microsoft.com/office/drawing/2016/5/12/chartex" xmlns:cx7="http://schemas.microsoft.com/office/drawing/2016/5/13/chartex" xmlns:cx8="http://schemas.microsoft.com/office/drawing/2016/5/14/chartex" xmlns:mc="http://schemas.openxmlformats.org/markup-compatibility/2006" xmlns:aink="http://schemas.microsoft.com/office/drawing/2016/ink" xmlns:am3d="http://schemas.microsoft.com/office/drawing/2017/model3d" xmlns:o="urn:schemas-microsoft-com:office:office" xmlns:r="http://schemas.openxmlformats.org/officeDocument/2006/relationships" xmlns:m="http://schemas.openxmlformats.org/officeDocument/2006/math" xmlns:v="urn:schemas-microsoft-com:vml" xmlns:wp14="http://schemas.microsoft.com/office/word/2010/wordprocessingDrawing" xmlns:wp="http://schemas.openxmlformats.org/drawingml/2006/wordprocessingDrawing" xmlns:w10="urn:schemas-microsoft-com:office:word" xmlns:w="http://schemas.openxmlformats.org/wordprocessingml/2006/main" xmlns:w14="http://schemas.microsoft.com/office/word/2010/wordml" xmlns:w15="http://schemas.microsoft.com/office/word/2012/wordml" xmlns:w16cid="http://schemas.microsoft.com/office/word/2016/wordml/cid" xmlns:w16se="http://schemas.microsoft.com/office/word/2015/wordml/symex" xmlns:wpg="http://schemas.microsoft.com/office/word/2010/wordprocessingGroup" xmlns:wpi="http://schemas.microsoft.com/office/word/2010/wordprocessingInk" xmlns:wne="http://schemas.microsoft.com/office/word/2006/wordml" xmlns:wps="http://schemas.microsoft.com/office/word/2010/wordprocessingShape" mc:Ignorable="w14 w15 w16se w16cid wp14">
   <w:body>
     <w:p>
       <w:pPr>
@@ -261,8 +261,7 @@
     <w:p>
       <w:pPr>
         <w:rPr>
-          <w:sz w:val="24"/>
-          <w:szCs w:val="24"/>
+          <w:noProof/>
         </w:rPr>
       </w:pPr>
       <w:r>
@@ -278,95 +277,24 @@
           <w:szCs w:val="24"/>
         </w:rPr>
         <w:lastRenderedPageBreak/>
-        <w:t>outline their wishes. I received 9 respon</w:t>
-      </w:r>
-      <w:r>
-        <w:rPr>
-          <w:sz w:val="24"/>
-          <w:szCs w:val="24"/>
-        </w:rPr>
-        <w:t>s</w:t>
-      </w:r>
-      <w:r>
-        <w:rPr>
-          <w:sz w:val="24"/>
-          <w:szCs w:val="24"/>
-        </w:rPr>
-        <w:t>es,</w:t>
-      </w:r>
-      <w:r>
-        <w:rPr>
-          <w:sz w:val="24"/>
-          <w:szCs w:val="24"/>
-        </w:rPr>
-        <w:t xml:space="preserve"> a notable desire being to have descriptive error messages and showing syntax errors</w:t>
-      </w:r>
-      <w:r>
-        <w:rPr>
-          <w:sz w:val="24"/>
-          <w:szCs w:val="24"/>
-        </w:rPr>
-        <w:t>.</w:t>
-      </w:r>
-    </w:p>
-    <w:p>
-      <w:pPr>
-        <w:rPr>
-          <w:sz w:val="32"/>
-          <w:szCs w:val="32"/>
-          <w:u w:val="single"/>
-        </w:rPr>
-      </w:pPr>
-      <w:r>
-        <w:rPr>
-          <w:sz w:val="32"/>
-          <w:szCs w:val="32"/>
-          <w:u w:val="single"/>
-        </w:rPr>
-        <w:t>User:</w:t>
-      </w:r>
-    </w:p>
-    <w:p>
-      <w:pPr>
-        <w:rPr>
-          <w:sz w:val="24"/>
-          <w:szCs w:val="24"/>
-        </w:rPr>
-      </w:pPr>
-      <w:r>
-        <w:rPr>
-          <w:sz w:val="24"/>
-          <w:szCs w:val="24"/>
-        </w:rPr>
-        <w:t xml:space="preserve">The form I sent to my fellow students was very insightful. After </w:t>
-      </w:r>
-      <w:proofErr w:type="gramStart"/>
-      <w:r>
-        <w:rPr>
-          <w:sz w:val="24"/>
-          <w:szCs w:val="24"/>
-        </w:rPr>
-        <w:t>looking over each response</w:t>
-      </w:r>
-      <w:proofErr w:type="gramEnd"/>
-      <w:r>
-        <w:rPr>
-          <w:sz w:val="24"/>
-          <w:szCs w:val="24"/>
-        </w:rPr>
-        <w:t xml:space="preserve"> I put their main points into a word cloud, helping me visualise what would be good to put into my program. </w:t>
-      </w:r>
-      <w:r>
-        <w:rPr>
-          <w:noProof/>
+        <w:t>outline their wishes.</w:t>
+      </w:r>
+      <w:r>
+        <w:rPr>
+          <w:noProof/>
+        </w:rPr>
+        <w:t xml:space="preserve"> </w:t>
+      </w:r>
+      <w:r>
+        <w:rPr>
           <w:sz w:val="24"/>
           <w:szCs w:val="24"/>
         </w:rPr>
         <w:drawing>
-          <wp:inline distT="0" distB="0" distL="0" distR="0" wp14:anchorId="12FF3419" wp14:editId="2013A646">
-            <wp:extent cx="5731510" cy="2689860"/>
+          <wp:inline distT="0" distB="0" distL="0" distR="0" wp14:anchorId="4AD50886" wp14:editId="3B249610">
+            <wp:extent cx="5731510" cy="2237105"/>
             <wp:effectExtent l="0" t="0" r="2540" b="0"/>
-            <wp:docPr id="2" name="Picture 2"/>
+            <wp:docPr id="1" name="Picture 1"/>
             <wp:cNvGraphicFramePr>
               <a:graphicFrameLocks xmlns:a="http://schemas.openxmlformats.org/drawingml/2006/main" noChangeAspect="1"/>
             </wp:cNvGraphicFramePr>
@@ -386,6 +314,355 @@
                   <pic:spPr>
                     <a:xfrm>
                       <a:off x="0" y="0"/>
+                      <a:ext cx="5731510" cy="2237105"/>
+                    </a:xfrm>
+                    <a:prstGeom prst="rect">
+                      <a:avLst/>
+                    </a:prstGeom>
+                  </pic:spPr>
+                </pic:pic>
+              </a:graphicData>
+            </a:graphic>
+          </wp:inline>
+        </w:drawing>
+      </w:r>
+    </w:p>
+    <w:p>
+      <w:pPr>
+        <w:rPr>
+          <w:sz w:val="24"/>
+          <w:szCs w:val="24"/>
+        </w:rPr>
+      </w:pPr>
+      <w:r>
+        <w:rPr>
+          <w:sz w:val="24"/>
+          <w:szCs w:val="24"/>
+        </w:rPr>
+        <w:t>I am very happy with this question. It was clear and easy to understand. The responses I was given show that a way to view the output of your code is a high priority.</w:t>
+      </w:r>
+      <w:r>
+        <w:rPr>
+          <w:noProof/>
+        </w:rPr>
+        <w:drawing>
+          <wp:inline distT="0" distB="0" distL="0" distR="0" wp14:anchorId="6C8FFF04" wp14:editId="6BAAAD57">
+            <wp:extent cx="5731510" cy="3910965"/>
+            <wp:effectExtent l="0" t="0" r="2540" b="0"/>
+            <wp:docPr id="5" name="Picture 5"/>
+            <wp:cNvGraphicFramePr>
+              <a:graphicFrameLocks xmlns:a="http://schemas.openxmlformats.org/drawingml/2006/main" noChangeAspect="1"/>
+            </wp:cNvGraphicFramePr>
+            <a:graphic xmlns:a="http://schemas.openxmlformats.org/drawingml/2006/main">
+              <a:graphicData uri="http://schemas.openxmlformats.org/drawingml/2006/picture">
+                <pic:pic xmlns:pic="http://schemas.openxmlformats.org/drawingml/2006/picture">
+                  <pic:nvPicPr>
+                    <pic:cNvPr id="1" name=""/>
+                    <pic:cNvPicPr/>
+                  </pic:nvPicPr>
+                  <pic:blipFill>
+                    <a:blip r:embed="rId10"/>
+                    <a:stretch>
+                      <a:fillRect/>
+                    </a:stretch>
+                  </pic:blipFill>
+                  <pic:spPr>
+                    <a:xfrm>
+                      <a:off x="0" y="0"/>
+                      <a:ext cx="5731510" cy="3910965"/>
+                    </a:xfrm>
+                    <a:prstGeom prst="rect">
+                      <a:avLst/>
+                    </a:prstGeom>
+                  </pic:spPr>
+                </pic:pic>
+              </a:graphicData>
+            </a:graphic>
+          </wp:inline>
+        </w:drawing>
+      </w:r>
+      <w:r>
+        <w:rPr>
+          <w:sz w:val="24"/>
+          <w:szCs w:val="24"/>
+        </w:rPr>
+        <w:t>Looking back, this question was too open-ended to provide a much of a useful conclusion. It is good to know why people like assembly, but it does not help me in figuring out the features people want from a code editor for assembly. If I were to remake this form, I would rewrite this question to use a set of pre-written responses, so that I could view a summary and see what is prioritised by my users. The conclusion I take from the responses to this question is that people enjoy the simplicity of assembly. Therefore, I will try not to add or “bloat” my compiler with too many features that do not directly assist coding.</w:t>
+      </w:r>
+      <w:r>
+        <w:rPr>
+          <w:noProof/>
+        </w:rPr>
+        <w:lastRenderedPageBreak/>
+        <w:drawing>
+          <wp:inline distT="0" distB="0" distL="0" distR="0" wp14:anchorId="3965186F" wp14:editId="02636541">
+            <wp:extent cx="5731510" cy="2137410"/>
+            <wp:effectExtent l="0" t="0" r="2540" b="0"/>
+            <wp:docPr id="3" name="Picture 3"/>
+            <wp:cNvGraphicFramePr>
+              <a:graphicFrameLocks xmlns:a="http://schemas.openxmlformats.org/drawingml/2006/main" noChangeAspect="1"/>
+            </wp:cNvGraphicFramePr>
+            <a:graphic xmlns:a="http://schemas.openxmlformats.org/drawingml/2006/main">
+              <a:graphicData uri="http://schemas.openxmlformats.org/drawingml/2006/picture">
+                <pic:pic xmlns:pic="http://schemas.openxmlformats.org/drawingml/2006/picture">
+                  <pic:nvPicPr>
+                    <pic:cNvPr id="1" name=""/>
+                    <pic:cNvPicPr/>
+                  </pic:nvPicPr>
+                  <pic:blipFill>
+                    <a:blip r:embed="rId11"/>
+                    <a:stretch>
+                      <a:fillRect/>
+                    </a:stretch>
+                  </pic:blipFill>
+                  <pic:spPr>
+                    <a:xfrm>
+                      <a:off x="0" y="0"/>
+                      <a:ext cx="5731510" cy="2137410"/>
+                    </a:xfrm>
+                    <a:prstGeom prst="rect">
+                      <a:avLst/>
+                    </a:prstGeom>
+                  </pic:spPr>
+                </pic:pic>
+              </a:graphicData>
+            </a:graphic>
+          </wp:inline>
+        </w:drawing>
+      </w:r>
+      <w:r>
+        <w:rPr>
+          <w:sz w:val="24"/>
+          <w:szCs w:val="24"/>
+        </w:rPr>
+        <w:t>I think this question was a good question to ask. It helped me to define my scope, and confirmed that a way to share programs is something I should aspire to have in my project.</w:t>
+      </w:r>
+      <w:bookmarkStart w:id="0" w:name="_GoBack"/>
+      <w:bookmarkEnd w:id="0"/>
+      <w:r>
+        <w:rPr>
+          <w:sz w:val="24"/>
+          <w:szCs w:val="24"/>
+        </w:rPr>
+        <w:t xml:space="preserve"> </w:t>
+      </w:r>
+      <w:r>
+        <w:rPr>
+          <w:noProof/>
+        </w:rPr>
+        <w:drawing>
+          <wp:inline distT="0" distB="0" distL="0" distR="0" wp14:anchorId="16990D50" wp14:editId="1AD0E283">
+            <wp:extent cx="5731510" cy="3947795"/>
+            <wp:effectExtent l="0" t="0" r="2540" b="0"/>
+            <wp:docPr id="4" name="Picture 4" descr="Answers to the question &quot;What would you want in an assembly code editor?&quot;. The answers include &quot;Easy to debug&quot;, &quot;Shows syntax errors&quot;, and &quot;Live debugging&quot;">
+              <a:extLst xmlns:a="http://schemas.openxmlformats.org/drawingml/2006/main">
+                <a:ext uri="{C183D7F6-B498-43B3-948B-1728B52AA6E4}">
+                  <adec:decorative xmlns:adec="http://schemas.microsoft.com/office/drawing/2017/decorative" val="0"/>
+                </a:ext>
+              </a:extLst>
+            </wp:docPr>
+            <wp:cNvGraphicFramePr>
+              <a:graphicFrameLocks xmlns:a="http://schemas.openxmlformats.org/drawingml/2006/main" noChangeAspect="1"/>
+            </wp:cNvGraphicFramePr>
+            <a:graphic xmlns:a="http://schemas.openxmlformats.org/drawingml/2006/main">
+              <a:graphicData uri="http://schemas.openxmlformats.org/drawingml/2006/picture">
+                <pic:pic xmlns:pic="http://schemas.openxmlformats.org/drawingml/2006/picture">
+                  <pic:nvPicPr>
+                    <pic:cNvPr id="1" name=""/>
+                    <pic:cNvPicPr/>
+                  </pic:nvPicPr>
+                  <pic:blipFill>
+                    <a:blip r:embed="rId12"/>
+                    <a:stretch>
+                      <a:fillRect/>
+                    </a:stretch>
+                  </pic:blipFill>
+                  <pic:spPr>
+                    <a:xfrm>
+                      <a:off x="0" y="0"/>
+                      <a:ext cx="5731510" cy="3947795"/>
+                    </a:xfrm>
+                    <a:prstGeom prst="rect">
+                      <a:avLst/>
+                    </a:prstGeom>
+                  </pic:spPr>
+                </pic:pic>
+              </a:graphicData>
+            </a:graphic>
+          </wp:inline>
+        </w:drawing>
+      </w:r>
+      <w:r>
+        <w:rPr>
+          <w:sz w:val="24"/>
+          <w:szCs w:val="24"/>
+        </w:rPr>
+        <w:t xml:space="preserve"> </w:t>
+      </w:r>
+    </w:p>
+    <w:p>
+      <w:pPr>
+        <w:rPr>
+          <w:sz w:val="24"/>
+          <w:szCs w:val="24"/>
+        </w:rPr>
+      </w:pPr>
+      <w:r>
+        <w:rPr>
+          <w:sz w:val="24"/>
+          <w:szCs w:val="24"/>
+        </w:rPr>
+        <w:t xml:space="preserve">From this form I can tell that people prioritise having a working, simple program which can execute their assembly code. Additionally, a large majority of people wish to be able to share their code with others. Multiple users also expressed their desire for an easy to use debugger, so I made sure to include this in my objectives. </w:t>
+      </w:r>
+    </w:p>
+    <w:p>
+      <w:pPr>
+        <w:rPr>
+          <w:sz w:val="24"/>
+          <w:szCs w:val="24"/>
+        </w:rPr>
+      </w:pPr>
+      <w:r>
+        <w:rPr>
+          <w:sz w:val="24"/>
+          <w:szCs w:val="24"/>
+        </w:rPr>
+        <w:t>This form which I created was useful in finding out what users want from an assembly interpreter, but</w:t>
+      </w:r>
+      <w:r>
+        <w:rPr>
+          <w:sz w:val="24"/>
+          <w:szCs w:val="24"/>
+        </w:rPr>
+        <w:t xml:space="preserve"> it had a few issues. It was very open ended, which made it unclear as to what I was asking of those who completed the form. Due to my format, I was also unable to see a summarise of the written answers. This meant it was harder for me to understand the general viewpoint of my users.</w:t>
+      </w:r>
+    </w:p>
+    <w:p>
+      <w:pPr>
+        <w:rPr>
+          <w:sz w:val="24"/>
+          <w:szCs w:val="24"/>
+        </w:rPr>
+      </w:pPr>
+      <w:r>
+        <w:rPr>
+          <w:sz w:val="24"/>
+          <w:szCs w:val="24"/>
+        </w:rPr>
+        <w:lastRenderedPageBreak/>
+        <w:t xml:space="preserve"> If I were to remake the form, I would have some kind of section where user could rank potential features, instead of letting the user list them out, as that provides a more useful metric for what people want.</w:t>
+      </w:r>
+    </w:p>
+    <w:p>
+      <w:pPr>
+        <w:rPr>
+          <w:sz w:val="24"/>
+          <w:szCs w:val="24"/>
+        </w:rPr>
+      </w:pPr>
+      <w:r>
+        <w:rPr>
+          <w:sz w:val="24"/>
+          <w:szCs w:val="24"/>
+        </w:rPr>
+        <w:t>I received 9 respon</w:t>
+      </w:r>
+      <w:r>
+        <w:rPr>
+          <w:sz w:val="24"/>
+          <w:szCs w:val="24"/>
+        </w:rPr>
+        <w:t>s</w:t>
+      </w:r>
+      <w:r>
+        <w:rPr>
+          <w:sz w:val="24"/>
+          <w:szCs w:val="24"/>
+        </w:rPr>
+        <w:t>es,</w:t>
+      </w:r>
+      <w:r>
+        <w:rPr>
+          <w:sz w:val="24"/>
+          <w:szCs w:val="24"/>
+        </w:rPr>
+        <w:t xml:space="preserve"> a notable desire being to have descriptive error messages and showing syntax errors</w:t>
+      </w:r>
+      <w:r>
+        <w:rPr>
+          <w:sz w:val="24"/>
+          <w:szCs w:val="24"/>
+        </w:rPr>
+        <w:t>.</w:t>
+      </w:r>
+      <w:r>
+        <w:rPr>
+          <w:sz w:val="24"/>
+          <w:szCs w:val="24"/>
+        </w:rPr>
+        <w:t xml:space="preserve"> </w:t>
+      </w:r>
+    </w:p>
+    <w:p>
+      <w:pPr>
+        <w:rPr>
+          <w:sz w:val="32"/>
+          <w:szCs w:val="32"/>
+          <w:u w:val="single"/>
+        </w:rPr>
+      </w:pPr>
+      <w:r>
+        <w:rPr>
+          <w:sz w:val="32"/>
+          <w:szCs w:val="32"/>
+          <w:u w:val="single"/>
+        </w:rPr>
+        <w:t>User:</w:t>
+      </w:r>
+    </w:p>
+    <w:p>
+      <w:pPr>
+        <w:rPr>
+          <w:sz w:val="24"/>
+          <w:szCs w:val="24"/>
+        </w:rPr>
+      </w:pPr>
+      <w:r>
+        <w:rPr>
+          <w:sz w:val="24"/>
+          <w:szCs w:val="24"/>
+        </w:rPr>
+        <w:t xml:space="preserve">The form I sent to my fellow students was very insightful. After looking over each response I put their main points into a word cloud, helping me visualise what would be good to put into my program. </w:t>
+      </w:r>
+      <w:r>
+        <w:rPr>
+          <w:noProof/>
+          <w:sz w:val="24"/>
+          <w:szCs w:val="24"/>
+        </w:rPr>
+        <w:drawing>
+          <wp:inline distT="0" distB="0" distL="0" distR="0" wp14:anchorId="12FF3419" wp14:editId="2013A646">
+            <wp:extent cx="5731510" cy="2689860"/>
+            <wp:effectExtent l="0" t="0" r="2540" b="0"/>
+            <wp:docPr id="2" name="Picture 2"/>
+            <wp:cNvGraphicFramePr>
+              <a:graphicFrameLocks xmlns:a="http://schemas.openxmlformats.org/drawingml/2006/main" noChangeAspect="1"/>
+            </wp:cNvGraphicFramePr>
+            <a:graphic xmlns:a="http://schemas.openxmlformats.org/drawingml/2006/main">
+              <a:graphicData uri="http://schemas.openxmlformats.org/drawingml/2006/picture">
+                <pic:pic xmlns:pic="http://schemas.openxmlformats.org/drawingml/2006/picture">
+                  <pic:nvPicPr>
+                    <pic:cNvPr id="1" name=""/>
+                    <pic:cNvPicPr/>
+                  </pic:nvPicPr>
+                  <pic:blipFill>
+                    <a:blip r:embed="rId13"/>
+                    <a:stretch>
+                      <a:fillRect/>
+                    </a:stretch>
+                  </pic:blipFill>
+                  <pic:spPr>
+                    <a:xfrm>
+                      <a:off x="0" y="0"/>
                       <a:ext cx="5731510" cy="2689860"/>
                     </a:xfrm>
                     <a:prstGeom prst="rect">
@@ -485,39 +762,7 @@
           <w:sz w:val="24"/>
           <w:szCs w:val="24"/>
         </w:rPr>
-        <w:t xml:space="preserve">As I was researching this topic, I found the AQA Assembly Language Simulator by Peter Higginson. We have used it in lesson before, </w:t>
-      </w:r>
-      <w:proofErr w:type="gramStart"/>
-      <w:r>
-        <w:rPr>
-          <w:sz w:val="24"/>
-          <w:szCs w:val="24"/>
-        </w:rPr>
-        <w:t>in order to</w:t>
-      </w:r>
-      <w:proofErr w:type="gramEnd"/>
-      <w:r>
-        <w:rPr>
-          <w:sz w:val="24"/>
-          <w:szCs w:val="24"/>
-        </w:rPr>
-        <w:t xml:space="preserve"> simulate our assembly code and watch the fetch execute cycle as it is performed, however for my research I focused on the features available and the reasons they were added. For example, with this simulator the user </w:t>
-      </w:r>
-      <w:proofErr w:type="gramStart"/>
-      <w:r>
-        <w:rPr>
-          <w:sz w:val="24"/>
-          <w:szCs w:val="24"/>
-        </w:rPr>
-        <w:t>has the ability to</w:t>
-      </w:r>
-      <w:proofErr w:type="gramEnd"/>
-      <w:r>
-        <w:rPr>
-          <w:sz w:val="24"/>
-          <w:szCs w:val="24"/>
-        </w:rPr>
-        <w:t xml:space="preserve"> change the speed at which the program runs, from very slow, to a medium speed, to so fast that the fetch execute cycle is not shown, and only the result of each instruction is </w:t>
+        <w:t xml:space="preserve">As I was researching this topic, I found the AQA Assembly Language Simulator by Peter Higginson. We have used it in lesson before, in order to simulate our assembly code and watch the fetch execute cycle as it is performed, however for my research I focused on the features available and the reasons they were added. For example, with this simulator the user has the ability to change the speed at which the program runs, from very slow, to a medium speed, to so fast that the fetch execute cycle is not shown, and only the result of each instruction is </w:t>
       </w:r>
       <w:r>
         <w:rPr>
@@ -556,7 +801,7 @@
         </w:rPr>
         <w:t xml:space="preserve">I found the </w:t>
       </w:r>
-      <w:hyperlink r:id="rId10" w:history="1">
+      <w:hyperlink r:id="rId14" w:history="1">
         <w:r>
           <w:rPr>
             <w:rStyle w:val="Hyperlink"/>
@@ -609,7 +854,7 @@
                     <pic:cNvPicPr/>
                   </pic:nvPicPr>
                   <pic:blipFill>
-                    <a:blip r:embed="rId11">
+                    <a:blip r:embed="rId15">
                       <a:extLst>
                         <a:ext uri="{28A0092B-C50C-407E-A947-70E740481C1C}">
                           <a14:useLocalDpi xmlns:a14="http://schemas.microsoft.com/office/drawing/2010/main" val="0"/>
@@ -856,7 +1101,7 @@
         <w:lastRenderedPageBreak/>
         <w:t xml:space="preserve">I also found </w:t>
       </w:r>
-      <w:hyperlink r:id="rId12" w:history="1">
+      <w:hyperlink r:id="rId16" w:history="1">
         <w:r>
           <w:rPr>
             <w:rStyle w:val="Hyperlink"/>
@@ -891,7 +1136,7 @@
                     <pic:cNvPicPr/>
                   </pic:nvPicPr>
                   <pic:blipFill>
-                    <a:blip r:embed="rId13"/>
+                    <a:blip r:embed="rId17"/>
                     <a:stretch>
                       <a:fillRect/>
                     </a:stretch>
@@ -1045,7 +1290,7 @@
                     <pic:cNvPicPr/>
                   </pic:nvPicPr>
                   <pic:blipFill>
-                    <a:blip r:embed="rId14"/>
+                    <a:blip r:embed="rId18"/>
                     <a:stretch>
                       <a:fillRect/>
                     </a:stretch>
@@ -1222,21 +1467,12 @@
           <w:szCs w:val="24"/>
         </w:rPr>
       </w:pPr>
-      <w:proofErr w:type="gramStart"/>
-      <w:r>
-        <w:rPr>
-          <w:sz w:val="24"/>
-          <w:szCs w:val="24"/>
-        </w:rPr>
-        <w:t>In order to</w:t>
-      </w:r>
-      <w:proofErr w:type="gramEnd"/>
-      <w:r>
-        <w:rPr>
-          <w:sz w:val="24"/>
-          <w:szCs w:val="24"/>
-        </w:rPr>
-        <w:t xml:space="preserve"> implement a web server and handle databases, I had to research the available libraries. </w:t>
+      <w:r>
+        <w:rPr>
+          <w:sz w:val="24"/>
+          <w:szCs w:val="24"/>
+        </w:rPr>
+        <w:t xml:space="preserve">In order to implement a web server and handle databases, I had to research the available libraries. </w:t>
       </w:r>
     </w:p>
     <w:p>
@@ -1266,23 +1502,7 @@
           <w:sz w:val="24"/>
           <w:szCs w:val="24"/>
         </w:rPr>
-        <w:t xml:space="preserve">Flask, described as a “lightweight WSGI web application framework” python library. Primarily, it is used for smaller projects but has the capability to scale to more complex applications. This makes it useful for my project as it will be easy to </w:t>
-      </w:r>
-      <w:proofErr w:type="gramStart"/>
-      <w:r>
-        <w:rPr>
-          <w:sz w:val="24"/>
-          <w:szCs w:val="24"/>
-        </w:rPr>
-        <w:t>implement, and</w:t>
-      </w:r>
-      <w:proofErr w:type="gramEnd"/>
-      <w:r>
-        <w:rPr>
-          <w:sz w:val="24"/>
-          <w:szCs w:val="24"/>
-        </w:rPr>
-        <w:t xml:space="preserve"> will not require much extra work to ensure all code works with Flask. </w:t>
+        <w:t xml:space="preserve">Flask, described as a “lightweight WSGI web application framework” python library. Primarily, it is used for smaller projects but has the capability to scale to more complex applications. This makes it useful for my project as it will be easy to implement, and will not require much extra work to ensure all code works with Flask. </w:t>
       </w:r>
     </w:p>
     <w:p>
@@ -1357,7 +1577,7 @@
         </w:rPr>
         <w:t xml:space="preserve">For the database, there were two primary options; MySQL or SQLite. To compare them, I used this </w:t>
       </w:r>
-      <w:hyperlink r:id="rId15" w:history="1">
+      <w:hyperlink r:id="rId19" w:history="1">
         <w:r>
           <w:rPr>
             <w:rStyle w:val="Hyperlink"/>
@@ -1724,23 +1944,7 @@
           <w:sz w:val="24"/>
           <w:szCs w:val="24"/>
         </w:rPr>
-        <w:t xml:space="preserve">A second option would be to store a dictionary of the labels and their locations in </w:t>
-      </w:r>
-      <w:proofErr w:type="gramStart"/>
-      <w:r>
-        <w:rPr>
-          <w:sz w:val="24"/>
-          <w:szCs w:val="24"/>
-        </w:rPr>
-        <w:t>memory, and</w:t>
-      </w:r>
-      <w:proofErr w:type="gramEnd"/>
-      <w:r>
-        <w:rPr>
-          <w:sz w:val="24"/>
-          <w:szCs w:val="24"/>
-        </w:rPr>
-        <w:t xml:space="preserve"> get said location whenever the label is called upon, for a branch instruction or similar. This would be much slower compared to the method described above as it would take time to </w:t>
+        <w:t xml:space="preserve">A second option would be to store a dictionary of the labels and their locations in memory, and get said location whenever the label is called upon, for a branch instruction or similar. This would be much slower compared to the method described above as it would take time to </w:t>
       </w:r>
       <w:proofErr w:type="spellStart"/>
       <w:r>
@@ -2045,7 +2249,7 @@
                     <pic:cNvPicPr/>
                   </pic:nvPicPr>
                   <pic:blipFill>
-                    <a:blip r:embed="rId16"/>
+                    <a:blip r:embed="rId20"/>
                     <a:stretch>
                       <a:fillRect/>
                     </a:stretch>
@@ -2148,23 +2352,35 @@
           <w:sz w:val="24"/>
           <w:szCs w:val="24"/>
         </w:rPr>
-        <w:t xml:space="preserve">A debugging mode must be available in which the user can see more about their program than without it. If I were able to do it within the time bound, a stretch goal would be to allow the user to see the whole memory at any </w:t>
-      </w:r>
-      <w:proofErr w:type="gramStart"/>
-      <w:r>
-        <w:rPr>
-          <w:sz w:val="24"/>
-          <w:szCs w:val="24"/>
-        </w:rPr>
-        <w:t>point, and</w:t>
-      </w:r>
-      <w:proofErr w:type="gramEnd"/>
-      <w:r>
-        <w:rPr>
-          <w:sz w:val="24"/>
-          <w:szCs w:val="24"/>
-        </w:rPr>
-        <w:t xml:space="preserve"> go backwards </w:t>
+        <w:t xml:space="preserve">A debugging mode must be available in which the user can see more about their program than without it. If I </w:t>
+      </w:r>
+      <w:r>
+        <w:rPr>
+          <w:sz w:val="24"/>
+          <w:szCs w:val="24"/>
+        </w:rPr>
+        <w:t>am</w:t>
+      </w:r>
+      <w:r>
+        <w:rPr>
+          <w:sz w:val="24"/>
+          <w:szCs w:val="24"/>
+        </w:rPr>
+        <w:t xml:space="preserve"> able to do it within the time </w:t>
+      </w:r>
+      <w:r>
+        <w:rPr>
+          <w:sz w:val="24"/>
+          <w:szCs w:val="24"/>
+        </w:rPr>
+        <w:t>constraints</w:t>
+      </w:r>
+      <w:r>
+        <w:rPr>
+          <w:sz w:val="24"/>
+          <w:szCs w:val="24"/>
+        </w:rPr>
+        <w:t xml:space="preserve">, a stretch goal would be to allow the user to see the whole memory at any point, and go </w:t>
       </w:r>
       <w:r>
         <w:rPr>
@@ -2172,7 +2388,7 @@
           <w:szCs w:val="24"/>
         </w:rPr>
         <w:lastRenderedPageBreak/>
-        <w:t>and forwards through the program to see the changes from one instruction to another.</w:t>
+        <w:t>backwards and forwards through the program to see the changes from one instruction to another.</w:t>
       </w:r>
     </w:p>
     <w:p>
@@ -2249,7 +2465,7 @@
 </file>
 
 <file path=word/numbering.xml><?xml version="1.0" encoding="utf-8"?>
-<w:numbering xmlns:wpc="http://schemas.microsoft.com/office/word/2010/wordprocessingCanvas" xmlns:cx="http://schemas.microsoft.com/office/drawing/2014/chartex" xmlns:cx1="http://schemas.microsoft.com/office/drawing/2015/9/8/chartex" xmlns:cx2="http://schemas.microsoft.com/office/drawing/2015/10/21/chartex" xmlns:cx3="http://schemas.microsoft.com/office/drawing/2016/5/9/chartex" xmlns:cx4="http://schemas.microsoft.com/office/drawing/2016/5/10/chartex" xmlns:cx5="http://schemas.microsoft.com/office/drawing/2016/5/11/chartex" xmlns:cx6="http://schemas.microsoft.com/office/drawing/2016/5/12/chartex" xmlns:cx7="http://schemas.microsoft.com/office/drawing/2016/5/13/chartex" xmlns:cx8="http://schemas.microsoft.com/office/drawing/2016/5/14/chartex" xmlns:mc="http://schemas.openxmlformats.org/markup-compatibility/2006" xmlns:aink="http://schemas.microsoft.com/office/drawing/2016/ink" xmlns:am3d="http://schemas.microsoft.com/office/drawing/2017/model3d" xmlns:o="urn:schemas-microsoft-com:office:office" xmlns:oel="http://schemas.microsoft.com/office/2019/extlst" xmlns:r="http://schemas.openxmlformats.org/officeDocument/2006/relationships" xmlns:m="http://schemas.openxmlformats.org/officeDocument/2006/math" xmlns:v="urn:schemas-microsoft-com:vml" xmlns:wp14="http://schemas.microsoft.com/office/word/2010/wordprocessingDrawing" xmlns:wp="http://schemas.openxmlformats.org/drawingml/2006/wordprocessingDrawing" xmlns:w10="urn:schemas-microsoft-com:office:word" xmlns:w="http://schemas.openxmlformats.org/wordprocessingml/2006/main" xmlns:w14="http://schemas.microsoft.com/office/word/2010/wordml" xmlns:w15="http://schemas.microsoft.com/office/word/2012/wordml" xmlns:w16cex="http://schemas.microsoft.com/office/word/2018/wordml/cex" xmlns:w16cid="http://schemas.microsoft.com/office/word/2016/wordml/cid" xmlns:w16="http://schemas.microsoft.com/office/word/2018/wordml" xmlns:w16du="http://schemas.microsoft.com/office/word/2023/wordml/word16du" xmlns:w16sdtdh="http://schemas.microsoft.com/office/word/2020/wordml/sdtdatahash" xmlns:w16sdtfl="http://schemas.microsoft.com/office/word/2024/wordml/sdtformatlock" xmlns:w16se="http://schemas.microsoft.com/office/word/2015/wordml/symex" xmlns:wpg="http://schemas.microsoft.com/office/word/2010/wordprocessingGroup" xmlns:wpi="http://schemas.microsoft.com/office/word/2010/wordprocessingInk" xmlns:wne="http://schemas.microsoft.com/office/word/2006/wordml" xmlns:wps="http://schemas.microsoft.com/office/word/2010/wordprocessingShape" mc:Ignorable="w14 w15 w16se w16cid w16 w16cex w16sdtdh w16sdtfl w16du wp14">
+<w:numbering xmlns:wpc="http://schemas.microsoft.com/office/word/2010/wordprocessingCanvas" xmlns:cx="http://schemas.microsoft.com/office/drawing/2014/chartex" xmlns:cx1="http://schemas.microsoft.com/office/drawing/2015/9/8/chartex" xmlns:cx2="http://schemas.microsoft.com/office/drawing/2015/10/21/chartex" xmlns:cx3="http://schemas.microsoft.com/office/drawing/2016/5/9/chartex" xmlns:cx4="http://schemas.microsoft.com/office/drawing/2016/5/10/chartex" xmlns:cx5="http://schemas.microsoft.com/office/drawing/2016/5/11/chartex" xmlns:cx6="http://schemas.microsoft.com/office/drawing/2016/5/12/chartex" xmlns:cx7="http://schemas.microsoft.com/office/drawing/2016/5/13/chartex" xmlns:cx8="http://schemas.microsoft.com/office/drawing/2016/5/14/chartex" xmlns:mc="http://schemas.openxmlformats.org/markup-compatibility/2006" xmlns:aink="http://schemas.microsoft.com/office/drawing/2016/ink" xmlns:am3d="http://schemas.microsoft.com/office/drawing/2017/model3d" xmlns:o="urn:schemas-microsoft-com:office:office" xmlns:r="http://schemas.openxmlformats.org/officeDocument/2006/relationships" xmlns:m="http://schemas.openxmlformats.org/officeDocument/2006/math" xmlns:v="urn:schemas-microsoft-com:vml" xmlns:wp14="http://schemas.microsoft.com/office/word/2010/wordprocessingDrawing" xmlns:wp="http://schemas.openxmlformats.org/drawingml/2006/wordprocessingDrawing" xmlns:w10="urn:schemas-microsoft-com:office:word" xmlns:w="http://schemas.openxmlformats.org/wordprocessingml/2006/main" xmlns:w14="http://schemas.microsoft.com/office/word/2010/wordml" xmlns:w15="http://schemas.microsoft.com/office/word/2012/wordml" xmlns:w16cid="http://schemas.microsoft.com/office/word/2016/wordml/cid" xmlns:w16se="http://schemas.microsoft.com/office/word/2015/wordml/symex" xmlns:wpg="http://schemas.microsoft.com/office/word/2010/wordprocessingGroup" xmlns:wpi="http://schemas.microsoft.com/office/word/2010/wordprocessingInk" xmlns:wne="http://schemas.microsoft.com/office/word/2006/wordml" xmlns:wps="http://schemas.microsoft.com/office/word/2010/wordprocessingShape" mc:Ignorable="w14 w15 w16se w16cid wp14">
   <w:abstractNum w:abstractNumId="0" w15:restartNumberingAfterBreak="0">
     <w:nsid w:val="38EB60C4"/>
     <w:multiLevelType w:val="hybridMultilevel"/>
@@ -2362,14 +2578,14 @@
       </w:rPr>
     </w:lvl>
   </w:abstractNum>
-  <w:num w:numId="1" w16cid:durableId="1030374754">
+  <w:num w:numId="1">
     <w:abstractNumId w:val="0"/>
   </w:num>
 </w:numbering>
 </file>
 
 <file path=word/styles.xml><?xml version="1.0" encoding="utf-8"?>
-<w:styles xmlns:mc="http://schemas.openxmlformats.org/markup-compatibility/2006" xmlns:r="http://schemas.openxmlformats.org/officeDocument/2006/relationships" xmlns:w="http://schemas.openxmlformats.org/wordprocessingml/2006/main" xmlns:w14="http://schemas.microsoft.com/office/word/2010/wordml" xmlns:w15="http://schemas.microsoft.com/office/word/2012/wordml" xmlns:w16cex="http://schemas.microsoft.com/office/word/2018/wordml/cex" xmlns:w16cid="http://schemas.microsoft.com/office/word/2016/wordml/cid" xmlns:w16="http://schemas.microsoft.com/office/word/2018/wordml" xmlns:w16du="http://schemas.microsoft.com/office/word/2023/wordml/word16du" xmlns:w16sdtdh="http://schemas.microsoft.com/office/word/2020/wordml/sdtdatahash" xmlns:w16sdtfl="http://schemas.microsoft.com/office/word/2024/wordml/sdtformatlock" xmlns:w16se="http://schemas.microsoft.com/office/word/2015/wordml/symex" mc:Ignorable="w14 w15 w16se w16cid w16 w16cex w16sdtdh w16sdtfl w16du">
+<w:styles xmlns:mc="http://schemas.openxmlformats.org/markup-compatibility/2006" xmlns:r="http://schemas.openxmlformats.org/officeDocument/2006/relationships" xmlns:w="http://schemas.openxmlformats.org/wordprocessingml/2006/main" xmlns:w14="http://schemas.microsoft.com/office/word/2010/wordml" xmlns:w15="http://schemas.microsoft.com/office/word/2012/wordml" xmlns:w16cid="http://schemas.microsoft.com/office/word/2016/wordml/cid" xmlns:w16se="http://schemas.microsoft.com/office/word/2015/wordml/symex" mc:Ignorable="w14 w15 w16se w16cid">
   <w:docDefaults>
     <w:rPrDefault>
       <w:rPr>
@@ -2385,7 +2601,7 @@
       </w:pPr>
     </w:pPrDefault>
   </w:docDefaults>
-  <w:latentStyles w:defLockedState="0" w:defUIPriority="99" w:defSemiHidden="0" w:defUnhideWhenUsed="0" w:defQFormat="0" w:count="376">
+  <w:latentStyles w:defLockedState="0" w:defUIPriority="99" w:defSemiHidden="0" w:defUnhideWhenUsed="0" w:defQFormat="0" w:count="375">
     <w:lsdException w:name="Normal" w:uiPriority="0" w:qFormat="1"/>
     <w:lsdException w:name="heading 1" w:uiPriority="9" w:qFormat="1"/>
     <w:lsdException w:name="heading 2" w:semiHidden="1" w:uiPriority="9" w:unhideWhenUsed="1" w:qFormat="1"/>
@@ -2761,7 +2977,6 @@
     <w:lsdException w:name="Smart Hyperlink" w:semiHidden="1" w:unhideWhenUsed="1"/>
     <w:lsdException w:name="Hashtag" w:semiHidden="1" w:unhideWhenUsed="1"/>
     <w:lsdException w:name="Unresolved Mention" w:semiHidden="1" w:unhideWhenUsed="1"/>
-    <w:lsdException w:name="Smart Link" w:semiHidden="1" w:unhideWhenUsed="1"/>
   </w:latentStyles>
   <w:style w:type="paragraph" w:default="1" w:styleId="Normal">
     <w:name w:val="Normal"/>
@@ -3139,6 +3354,23 @@
 </file>
 
 <file path=customXml/item1.xml><?xml version="1.0" encoding="utf-8"?>
+<p:properties xmlns:p="http://schemas.microsoft.com/office/2006/metadata/properties" xmlns:xsi="http://www.w3.org/2001/XMLSchema-instance" xmlns:pc="http://schemas.microsoft.com/office/infopath/2007/PartnerControls">
+  <documentManagement>
+    <_activity xmlns="18287d57-4f0a-480d-ad86-c9ee94dcacf3" xsi:nil="true"/>
+  </documentManagement>
+</p:properties>
+</file>
+
+<file path=customXml/item2.xml><?xml version="1.0" encoding="utf-8"?>
+<?mso-contentType ?>
+<FormTemplates xmlns="http://schemas.microsoft.com/sharepoint/v3/contenttype/forms">
+  <Display>DocumentLibraryForm</Display>
+  <Edit>DocumentLibraryForm</Edit>
+  <New>DocumentLibraryForm</New>
+</FormTemplates>
+</file>
+
+<file path=customXml/item3.xml><?xml version="1.0" encoding="utf-8"?>
 <ct:contentTypeSchema xmlns:ct="http://schemas.microsoft.com/office/2006/metadata/contentType" xmlns:ma="http://schemas.microsoft.com/office/2006/metadata/properties/metaAttributes" ct:_="" ma:_="" ma:contentTypeName="Document" ma:contentTypeID="0x01010022BB3F6B8131D840BF96BCF4A4EF84F9" ma:contentTypeVersion="10" ma:contentTypeDescription="Create a new document." ma:contentTypeScope="" ma:versionID="0709e0e00c1628ada2952a194b352c4c">
   <xsd:schema xmlns:xsd="http://www.w3.org/2001/XMLSchema" xmlns:xs="http://www.w3.org/2001/XMLSchema" xmlns:p="http://schemas.microsoft.com/office/2006/metadata/properties" xmlns:ns3="18287d57-4f0a-480d-ad86-c9ee94dcacf3" targetNamespace="http://schemas.microsoft.com/office/2006/metadata/properties" ma:root="true" ma:fieldsID="015a3f7c76741bc21ba02f2dd042d1e6" ns3:_="">
     <xsd:import namespace="18287d57-4f0a-480d-ad86-c9ee94dcacf3"/>
@@ -3320,24 +3552,25 @@
 </ct:contentTypeSchema>
 </file>
 
-<file path=customXml/item2.xml><?xml version="1.0" encoding="utf-8"?>
-<?mso-contentType ?>
-<FormTemplates xmlns="http://schemas.microsoft.com/sharepoint/v3/contenttype/forms">
-  <Display>DocumentLibraryForm</Display>
-  <Edit>DocumentLibraryForm</Edit>
-  <New>DocumentLibraryForm</New>
-</FormTemplates>
+<file path=customXml/itemProps1.xml><?xml version="1.0" encoding="utf-8"?>
+<ds:datastoreItem xmlns:ds="http://schemas.openxmlformats.org/officeDocument/2006/customXml" ds:itemID="{64618EF6-6623-4DC4-AAB5-0FCDD6983B68}">
+  <ds:schemaRefs>
+    <ds:schemaRef ds:uri="http://schemas.microsoft.com/office/2006/metadata/properties"/>
+    <ds:schemaRef ds:uri="http://schemas.microsoft.com/office/infopath/2007/PartnerControls"/>
+    <ds:schemaRef ds:uri="18287d57-4f0a-480d-ad86-c9ee94dcacf3"/>
+  </ds:schemaRefs>
+</ds:datastoreItem>
 </file>
 
-<file path=customXml/item3.xml><?xml version="1.0" encoding="utf-8"?>
-<p:properties xmlns:p="http://schemas.microsoft.com/office/2006/metadata/properties" xmlns:xsi="http://www.w3.org/2001/XMLSchema-instance" xmlns:pc="http://schemas.microsoft.com/office/infopath/2007/PartnerControls">
-  <documentManagement>
-    <_activity xmlns="18287d57-4f0a-480d-ad86-c9ee94dcacf3" xsi:nil="true"/>
-  </documentManagement>
-</p:properties>
+<file path=customXml/itemProps2.xml><?xml version="1.0" encoding="utf-8"?>
+<ds:datastoreItem xmlns:ds="http://schemas.openxmlformats.org/officeDocument/2006/customXml" ds:itemID="{B0A76E36-1CD7-4800-A269-A83947C5CADC}">
+  <ds:schemaRefs>
+    <ds:schemaRef ds:uri="http://schemas.microsoft.com/sharepoint/v3/contenttype/forms"/>
+  </ds:schemaRefs>
+</ds:datastoreItem>
 </file>
 
-<file path=customXml/itemProps1.xml><?xml version="1.0" encoding="utf-8"?>
+<file path=customXml/itemProps3.xml><?xml version="1.0" encoding="utf-8"?>
 <ds:datastoreItem xmlns:ds="http://schemas.openxmlformats.org/officeDocument/2006/customXml" ds:itemID="{7B03F66D-B961-483C-B46B-B2DB333DF10C}">
   <ds:schemaRefs>
     <ds:schemaRef ds:uri="http://schemas.microsoft.com/office/2006/metadata/contentType"/>
@@ -3353,22 +3586,4 @@
     <ds:schemaRef ds:uri="http://schemas.microsoft.com/internal/obd"/>
   </ds:schemaRefs>
 </ds:datastoreItem>
-</file>
-
-<file path=customXml/itemProps2.xml><?xml version="1.0" encoding="utf-8"?>
-<ds:datastoreItem xmlns:ds="http://schemas.openxmlformats.org/officeDocument/2006/customXml" ds:itemID="{B0A76E36-1CD7-4800-A269-A83947C5CADC}">
-  <ds:schemaRefs>
-    <ds:schemaRef ds:uri="http://schemas.microsoft.com/sharepoint/v3/contenttype/forms"/>
-  </ds:schemaRefs>
-</ds:datastoreItem>
-</file>
-
-<file path=customXml/itemProps3.xml><?xml version="1.0" encoding="utf-8"?>
-<ds:datastoreItem xmlns:ds="http://schemas.openxmlformats.org/officeDocument/2006/customXml" ds:itemID="{64618EF6-6623-4DC4-AAB5-0FCDD6983B68}">
-  <ds:schemaRefs>
-    <ds:schemaRef ds:uri="http://schemas.microsoft.com/office/2006/metadata/properties"/>
-    <ds:schemaRef ds:uri="http://schemas.microsoft.com/office/infopath/2007/PartnerControls"/>
-    <ds:schemaRef ds:uri="18287d57-4f0a-480d-ad86-c9ee94dcacf3"/>
-  </ds:schemaRefs>
-</ds:datastoreItem>
 </file>
</xml_diff>

<commit_message>
minor fixes, improvement to analysis
</commit_message>
<xml_diff>
--- a/Analysis.docx
+++ b/Analysis.docx
@@ -220,7 +220,7 @@
                     <pic:cNvPicPr/>
                   </pic:nvPicPr>
                   <pic:blipFill>
-                    <a:blip r:embed="rId8"/>
+                    <a:blip r:embed="rId10"/>
                     <a:stretch>
                       <a:fillRect/>
                     </a:stretch>
@@ -269,7 +269,21 @@
           <w:sz w:val="24"/>
           <w:szCs w:val="24"/>
         </w:rPr>
-        <w:t xml:space="preserve">To research for this project, I have spoken with my fellow students to see what they would like in an assembly program. To aid with this, I created a form in which the others could </w:t>
+        <w:t>To research for this project, I have spoken with my fellow students to see what they would like in an assembly program. To aid with this, I created a form in which the</w:t>
+      </w:r>
+      <w:r>
+        <w:rPr>
+          <w:sz w:val="24"/>
+          <w:szCs w:val="24"/>
+        </w:rPr>
+        <w:t>y</w:t>
+      </w:r>
+      <w:r>
+        <w:rPr>
+          <w:sz w:val="24"/>
+          <w:szCs w:val="24"/>
+        </w:rPr>
+        <w:t xml:space="preserve"> could outline </w:t>
       </w:r>
       <w:r>
         <w:rPr>
@@ -277,16 +291,11 @@
           <w:szCs w:val="24"/>
         </w:rPr>
         <w:lastRenderedPageBreak/>
-        <w:t>outline their wishes.</w:t>
+        <w:t>what they wanted in a project like mine.</w:t>
       </w:r>
       <w:r>
         <w:rPr>
           <w:noProof/>
-        </w:rPr>
-        <w:t xml:space="preserve"> </w:t>
-      </w:r>
-      <w:r>
-        <w:rPr>
           <w:sz w:val="24"/>
           <w:szCs w:val="24"/>
         </w:rPr>
@@ -295,109 +304,6 @@
             <wp:extent cx="5731510" cy="2237105"/>
             <wp:effectExtent l="0" t="0" r="2540" b="0"/>
             <wp:docPr id="1" name="Picture 1"/>
-            <wp:cNvGraphicFramePr>
-              <a:graphicFrameLocks xmlns:a="http://schemas.openxmlformats.org/drawingml/2006/main" noChangeAspect="1"/>
-            </wp:cNvGraphicFramePr>
-            <a:graphic xmlns:a="http://schemas.openxmlformats.org/drawingml/2006/main">
-              <a:graphicData uri="http://schemas.openxmlformats.org/drawingml/2006/picture">
-                <pic:pic xmlns:pic="http://schemas.openxmlformats.org/drawingml/2006/picture">
-                  <pic:nvPicPr>
-                    <pic:cNvPr id="1" name=""/>
-                    <pic:cNvPicPr/>
-                  </pic:nvPicPr>
-                  <pic:blipFill>
-                    <a:blip r:embed="rId9"/>
-                    <a:stretch>
-                      <a:fillRect/>
-                    </a:stretch>
-                  </pic:blipFill>
-                  <pic:spPr>
-                    <a:xfrm>
-                      <a:off x="0" y="0"/>
-                      <a:ext cx="5731510" cy="2237105"/>
-                    </a:xfrm>
-                    <a:prstGeom prst="rect">
-                      <a:avLst/>
-                    </a:prstGeom>
-                  </pic:spPr>
-                </pic:pic>
-              </a:graphicData>
-            </a:graphic>
-          </wp:inline>
-        </w:drawing>
-      </w:r>
-    </w:p>
-    <w:p>
-      <w:pPr>
-        <w:rPr>
-          <w:sz w:val="24"/>
-          <w:szCs w:val="24"/>
-        </w:rPr>
-      </w:pPr>
-      <w:r>
-        <w:rPr>
-          <w:sz w:val="24"/>
-          <w:szCs w:val="24"/>
-        </w:rPr>
-        <w:t>I am very happy with this question. It was clear and easy to understand. The responses I was given show that a way to view the output of your code is a high priority.</w:t>
-      </w:r>
-      <w:r>
-        <w:rPr>
-          <w:noProof/>
-        </w:rPr>
-        <w:drawing>
-          <wp:inline distT="0" distB="0" distL="0" distR="0" wp14:anchorId="6C8FFF04" wp14:editId="6BAAAD57">
-            <wp:extent cx="5731510" cy="3910965"/>
-            <wp:effectExtent l="0" t="0" r="2540" b="0"/>
-            <wp:docPr id="5" name="Picture 5"/>
-            <wp:cNvGraphicFramePr>
-              <a:graphicFrameLocks xmlns:a="http://schemas.openxmlformats.org/drawingml/2006/main" noChangeAspect="1"/>
-            </wp:cNvGraphicFramePr>
-            <a:graphic xmlns:a="http://schemas.openxmlformats.org/drawingml/2006/main">
-              <a:graphicData uri="http://schemas.openxmlformats.org/drawingml/2006/picture">
-                <pic:pic xmlns:pic="http://schemas.openxmlformats.org/drawingml/2006/picture">
-                  <pic:nvPicPr>
-                    <pic:cNvPr id="1" name=""/>
-                    <pic:cNvPicPr/>
-                  </pic:nvPicPr>
-                  <pic:blipFill>
-                    <a:blip r:embed="rId10"/>
-                    <a:stretch>
-                      <a:fillRect/>
-                    </a:stretch>
-                  </pic:blipFill>
-                  <pic:spPr>
-                    <a:xfrm>
-                      <a:off x="0" y="0"/>
-                      <a:ext cx="5731510" cy="3910965"/>
-                    </a:xfrm>
-                    <a:prstGeom prst="rect">
-                      <a:avLst/>
-                    </a:prstGeom>
-                  </pic:spPr>
-                </pic:pic>
-              </a:graphicData>
-            </a:graphic>
-          </wp:inline>
-        </w:drawing>
-      </w:r>
-      <w:r>
-        <w:rPr>
-          <w:sz w:val="24"/>
-          <w:szCs w:val="24"/>
-        </w:rPr>
-        <w:t>Looking back, this question was too open-ended to provide a much of a useful conclusion. It is good to know why people like assembly, but it does not help me in figuring out the features people want from a code editor for assembly. If I were to remake this form, I would rewrite this question to use a set of pre-written responses, so that I could view a summary and see what is prioritised by my users. The conclusion I take from the responses to this question is that people enjoy the simplicity of assembly. Therefore, I will try not to add or “bloat” my compiler with too many features that do not directly assist coding.</w:t>
-      </w:r>
-      <w:r>
-        <w:rPr>
-          <w:noProof/>
-        </w:rPr>
-        <w:lastRenderedPageBreak/>
-        <w:drawing>
-          <wp:inline distT="0" distB="0" distL="0" distR="0" wp14:anchorId="3965186F" wp14:editId="02636541">
-            <wp:extent cx="5731510" cy="2137410"/>
-            <wp:effectExtent l="0" t="0" r="2540" b="0"/>
-            <wp:docPr id="3" name="Picture 3"/>
             <wp:cNvGraphicFramePr>
               <a:graphicFrameLocks xmlns:a="http://schemas.openxmlformats.org/drawingml/2006/main" noChangeAspect="1"/>
             </wp:cNvGraphicFramePr>
@@ -417,6 +323,109 @@
                   <pic:spPr>
                     <a:xfrm>
                       <a:off x="0" y="0"/>
+                      <a:ext cx="5731510" cy="2237105"/>
+                    </a:xfrm>
+                    <a:prstGeom prst="rect">
+                      <a:avLst/>
+                    </a:prstGeom>
+                  </pic:spPr>
+                </pic:pic>
+              </a:graphicData>
+            </a:graphic>
+          </wp:inline>
+        </w:drawing>
+      </w:r>
+    </w:p>
+    <w:p>
+      <w:pPr>
+        <w:rPr>
+          <w:sz w:val="24"/>
+          <w:szCs w:val="24"/>
+        </w:rPr>
+      </w:pPr>
+      <w:r>
+        <w:rPr>
+          <w:sz w:val="24"/>
+          <w:szCs w:val="24"/>
+        </w:rPr>
+        <w:t>I am very happy with this question. It was clear and easy to understand. The responses I was given show that a way to view the output of your code is a high priority.</w:t>
+      </w:r>
+      <w:r>
+        <w:rPr>
+          <w:noProof/>
+        </w:rPr>
+        <w:drawing>
+          <wp:inline distT="0" distB="0" distL="0" distR="0" wp14:anchorId="6C8FFF04" wp14:editId="6BAAAD57">
+            <wp:extent cx="5731510" cy="3910965"/>
+            <wp:effectExtent l="0" t="0" r="2540" b="0"/>
+            <wp:docPr id="5" name="Picture 5"/>
+            <wp:cNvGraphicFramePr>
+              <a:graphicFrameLocks xmlns:a="http://schemas.openxmlformats.org/drawingml/2006/main" noChangeAspect="1"/>
+            </wp:cNvGraphicFramePr>
+            <a:graphic xmlns:a="http://schemas.openxmlformats.org/drawingml/2006/main">
+              <a:graphicData uri="http://schemas.openxmlformats.org/drawingml/2006/picture">
+                <pic:pic xmlns:pic="http://schemas.openxmlformats.org/drawingml/2006/picture">
+                  <pic:nvPicPr>
+                    <pic:cNvPr id="1" name=""/>
+                    <pic:cNvPicPr/>
+                  </pic:nvPicPr>
+                  <pic:blipFill>
+                    <a:blip r:embed="rId12"/>
+                    <a:stretch>
+                      <a:fillRect/>
+                    </a:stretch>
+                  </pic:blipFill>
+                  <pic:spPr>
+                    <a:xfrm>
+                      <a:off x="0" y="0"/>
+                      <a:ext cx="5731510" cy="3910965"/>
+                    </a:xfrm>
+                    <a:prstGeom prst="rect">
+                      <a:avLst/>
+                    </a:prstGeom>
+                  </pic:spPr>
+                </pic:pic>
+              </a:graphicData>
+            </a:graphic>
+          </wp:inline>
+        </w:drawing>
+      </w:r>
+      <w:r>
+        <w:rPr>
+          <w:sz w:val="24"/>
+          <w:szCs w:val="24"/>
+        </w:rPr>
+        <w:t>Looking back, this question was too open-ended to provide a much of a useful conclusion. It is good to know why people like assembly, but it does not help me in figuring out the features people want from a code editor for assembly. If I were to remake this form, I would rewrite this question to use a set of pre-written responses, so that I could view a summary and see what is prioritised by my users. The conclusion I take from the responses to this question is that people enjoy the simplicity of assembly. Therefore, I will try not to add or “bloat” my compiler with too many features that do not directly assist coding.</w:t>
+      </w:r>
+      <w:r>
+        <w:rPr>
+          <w:noProof/>
+        </w:rPr>
+        <w:lastRenderedPageBreak/>
+        <w:drawing>
+          <wp:inline distT="0" distB="0" distL="0" distR="0" wp14:anchorId="3965186F" wp14:editId="02636541">
+            <wp:extent cx="5731510" cy="2137410"/>
+            <wp:effectExtent l="0" t="0" r="2540" b="0"/>
+            <wp:docPr id="3" name="Picture 3"/>
+            <wp:cNvGraphicFramePr>
+              <a:graphicFrameLocks xmlns:a="http://schemas.openxmlformats.org/drawingml/2006/main" noChangeAspect="1"/>
+            </wp:cNvGraphicFramePr>
+            <a:graphic xmlns:a="http://schemas.openxmlformats.org/drawingml/2006/main">
+              <a:graphicData uri="http://schemas.openxmlformats.org/drawingml/2006/picture">
+                <pic:pic xmlns:pic="http://schemas.openxmlformats.org/drawingml/2006/picture">
+                  <pic:nvPicPr>
+                    <pic:cNvPr id="1" name=""/>
+                    <pic:cNvPicPr/>
+                  </pic:nvPicPr>
+                  <pic:blipFill>
+                    <a:blip r:embed="rId13"/>
+                    <a:stretch>
+                      <a:fillRect/>
+                    </a:stretch>
+                  </pic:blipFill>
+                  <pic:spPr>
+                    <a:xfrm>
+                      <a:off x="0" y="0"/>
                       <a:ext cx="5731510" cy="2137410"/>
                     </a:xfrm>
                     <a:prstGeom prst="rect">
@@ -434,16 +443,7 @@
           <w:sz w:val="24"/>
           <w:szCs w:val="24"/>
         </w:rPr>
-        <w:t>I think this question was a good question to ask. It helped me to define my scope, and confirmed that a way to share programs is something I should aspire to have in my project.</w:t>
-      </w:r>
-      <w:bookmarkStart w:id="0" w:name="_GoBack"/>
-      <w:bookmarkEnd w:id="0"/>
-      <w:r>
-        <w:rPr>
-          <w:sz w:val="24"/>
-          <w:szCs w:val="24"/>
-        </w:rPr>
-        <w:t xml:space="preserve"> </w:t>
+        <w:t xml:space="preserve">I think this question was a good question to ask. It helped me to define my scope, and confirmed that a way to share programs is something I should aspire to have in my project. </w:t>
       </w:r>
       <w:r>
         <w:rPr>
@@ -471,7 +471,7 @@
                     <pic:cNvPicPr/>
                   </pic:nvPicPr>
                   <pic:blipFill>
-                    <a:blip r:embed="rId12"/>
+                    <a:blip r:embed="rId14"/>
                     <a:stretch>
                       <a:fillRect/>
                     </a:stretch>
@@ -655,7 +655,7 @@
                     <pic:cNvPicPr/>
                   </pic:nvPicPr>
                   <pic:blipFill>
-                    <a:blip r:embed="rId13"/>
+                    <a:blip r:embed="rId15"/>
                     <a:stretch>
                       <a:fillRect/>
                     </a:stretch>
@@ -801,7 +801,7 @@
         </w:rPr>
         <w:t xml:space="preserve">I found the </w:t>
       </w:r>
-      <w:hyperlink r:id="rId14" w:history="1">
+      <w:hyperlink r:id="rId16" w:history="1">
         <w:r>
           <w:rPr>
             <w:rStyle w:val="Hyperlink"/>
@@ -854,7 +854,7 @@
                     <pic:cNvPicPr/>
                   </pic:nvPicPr>
                   <pic:blipFill>
-                    <a:blip r:embed="rId15">
+                    <a:blip r:embed="rId17">
                       <a:extLst>
                         <a:ext uri="{28A0092B-C50C-407E-A947-70E740481C1C}">
                           <a14:useLocalDpi xmlns:a14="http://schemas.microsoft.com/office/drawing/2010/main" val="0"/>
@@ -1101,7 +1101,7 @@
         <w:lastRenderedPageBreak/>
         <w:t xml:space="preserve">I also found </w:t>
       </w:r>
-      <w:hyperlink r:id="rId16" w:history="1">
+      <w:hyperlink r:id="rId18" w:history="1">
         <w:r>
           <w:rPr>
             <w:rStyle w:val="Hyperlink"/>
@@ -1136,7 +1136,7 @@
                     <pic:cNvPicPr/>
                   </pic:nvPicPr>
                   <pic:blipFill>
-                    <a:blip r:embed="rId17"/>
+                    <a:blip r:embed="rId19"/>
                     <a:stretch>
                       <a:fillRect/>
                     </a:stretch>
@@ -1290,7 +1290,7 @@
                     <pic:cNvPicPr/>
                   </pic:nvPicPr>
                   <pic:blipFill>
-                    <a:blip r:embed="rId18"/>
+                    <a:blip r:embed="rId20"/>
                     <a:stretch>
                       <a:fillRect/>
                     </a:stretch>
@@ -1577,7 +1577,7 @@
         </w:rPr>
         <w:t xml:space="preserve">For the database, there were two primary options; MySQL or SQLite. To compare them, I used this </w:t>
       </w:r>
-      <w:hyperlink r:id="rId19" w:history="1">
+      <w:hyperlink r:id="rId21" w:history="1">
         <w:r>
           <w:rPr>
             <w:rStyle w:val="Hyperlink"/>
@@ -1640,7 +1640,7 @@
         <w:pStyle w:val="ListParagraph"/>
         <w:numPr>
           <w:ilvl w:val="0"/>
-          <w:numId w:val="1"/>
+          <w:numId w:val="3"/>
         </w:numPr>
         <w:rPr>
           <w:sz w:val="24"/>
@@ -1660,7 +1660,7 @@
         <w:pStyle w:val="ListParagraph"/>
         <w:numPr>
           <w:ilvl w:val="0"/>
-          <w:numId w:val="1"/>
+          <w:numId w:val="3"/>
         </w:numPr>
         <w:rPr>
           <w:sz w:val="24"/>
@@ -1680,7 +1680,7 @@
         <w:pStyle w:val="ListParagraph"/>
         <w:numPr>
           <w:ilvl w:val="0"/>
-          <w:numId w:val="1"/>
+          <w:numId w:val="3"/>
         </w:numPr>
         <w:rPr>
           <w:sz w:val="24"/>
@@ -1700,7 +1700,7 @@
         <w:pStyle w:val="ListParagraph"/>
         <w:numPr>
           <w:ilvl w:val="0"/>
-          <w:numId w:val="1"/>
+          <w:numId w:val="3"/>
         </w:numPr>
         <w:rPr>
           <w:sz w:val="24"/>
@@ -1734,7 +1734,7 @@
         <w:pStyle w:val="ListParagraph"/>
         <w:numPr>
           <w:ilvl w:val="0"/>
-          <w:numId w:val="1"/>
+          <w:numId w:val="3"/>
         </w:numPr>
         <w:rPr>
           <w:sz w:val="24"/>
@@ -1751,146 +1751,239 @@
     </w:p>
     <w:p>
       <w:pPr>
-        <w:pStyle w:val="ListParagraph"/>
-        <w:numPr>
-          <w:ilvl w:val="0"/>
-          <w:numId w:val="1"/>
-        </w:numPr>
-        <w:rPr>
-          <w:sz w:val="24"/>
-          <w:szCs w:val="24"/>
-        </w:rPr>
-      </w:pPr>
-      <w:r>
-        <w:rPr>
-          <w:sz w:val="24"/>
-          <w:szCs w:val="24"/>
-        </w:rPr>
-        <w:lastRenderedPageBreak/>
-        <w:t>Security: How will the website be secure?</w:t>
-      </w:r>
-    </w:p>
-    <w:p>
-      <w:pPr>
+        <w:rPr>
+          <w:sz w:val="24"/>
+          <w:szCs w:val="24"/>
+        </w:rPr>
+      </w:pPr>
+      <w:r>
         <w:rPr>
           <w:sz w:val="28"/>
           <w:szCs w:val="28"/>
           <w:u w:val="single"/>
         </w:rPr>
-      </w:pPr>
-      <w:r>
+        <w:lastRenderedPageBreak/>
+        <w:t>Challenge 1:</w:t>
+      </w:r>
+    </w:p>
+    <w:p>
+      <w:pPr>
+        <w:rPr>
+          <w:sz w:val="24"/>
+          <w:szCs w:val="24"/>
+          <w:u w:val="single"/>
+        </w:rPr>
+      </w:pPr>
+      <w:r>
+        <w:rPr>
+          <w:sz w:val="24"/>
+          <w:szCs w:val="24"/>
+        </w:rPr>
+        <w:t xml:space="preserve">Initially, I was unsure about how to handle the data. To solve this, I prototyped multiple designs and worked with them each for a short </w:t>
+      </w:r>
+      <w:r>
+        <w:rPr>
+          <w:sz w:val="24"/>
+          <w:szCs w:val="24"/>
+        </w:rPr>
+        <w:t>while;</w:t>
+      </w:r>
+      <w:r>
+        <w:rPr>
+          <w:sz w:val="24"/>
+          <w:szCs w:val="24"/>
+        </w:rPr>
+        <w:t xml:space="preserve"> to see how easy or hard it was to work with it.</w:t>
+      </w:r>
+      <w:r>
+        <w:rPr>
+          <w:sz w:val="24"/>
+          <w:szCs w:val="24"/>
+        </w:rPr>
+        <w:t xml:space="preserve"> </w:t>
+      </w:r>
+      <w:r>
+        <w:rPr>
+          <w:sz w:val="24"/>
+          <w:szCs w:val="24"/>
+        </w:rPr>
+        <w:t xml:space="preserve">Eventually I settled on having an array for each instruction, holding its type, (label, instruction, or data) its opcode (the instruction to be performed), its operand(s) (the value(s) the instruction is using), and a type for each of these operands. </w:t>
+      </w:r>
+    </w:p>
+    <w:p>
+      <w:pPr>
         <w:rPr>
           <w:sz w:val="28"/>
           <w:szCs w:val="28"/>
           <w:u w:val="single"/>
         </w:rPr>
-        <w:t>Challenge 1:</w:t>
-      </w:r>
-    </w:p>
-    <w:p>
-      <w:pPr>
-        <w:rPr>
-          <w:sz w:val="24"/>
-          <w:szCs w:val="24"/>
-          <w:u w:val="single"/>
-        </w:rPr>
-      </w:pPr>
-      <w:r>
-        <w:rPr>
-          <w:sz w:val="24"/>
-          <w:szCs w:val="24"/>
-        </w:rPr>
-        <w:t xml:space="preserve">Initially, I was unsure about how to handle the data. To solve this, I prototyped multiple designs and worked with them each for a short </w:t>
-      </w:r>
-      <w:r>
-        <w:rPr>
-          <w:sz w:val="24"/>
-          <w:szCs w:val="24"/>
-        </w:rPr>
-        <w:t>while;</w:t>
-      </w:r>
-      <w:r>
-        <w:rPr>
-          <w:sz w:val="24"/>
-          <w:szCs w:val="24"/>
-        </w:rPr>
-        <w:t xml:space="preserve"> to see how easy or hard it was to work with it.</w:t>
-      </w:r>
-      <w:r>
-        <w:rPr>
-          <w:sz w:val="24"/>
-          <w:szCs w:val="24"/>
-        </w:rPr>
-        <w:t xml:space="preserve"> </w:t>
-      </w:r>
-      <w:r>
-        <w:rPr>
-          <w:sz w:val="24"/>
-          <w:szCs w:val="24"/>
-        </w:rPr>
-        <w:t xml:space="preserve">Eventually I settled on having an array for each instruction, holding its type, (label, instruction, or data) its opcode (the instruction to be performed), its operand(s) (the value(s) the instruction is using), and a type for each of these operands. </w:t>
-      </w:r>
-    </w:p>
-    <w:p>
-      <w:pPr>
+      </w:pPr>
+      <w:r>
         <w:rPr>
           <w:sz w:val="28"/>
           <w:szCs w:val="28"/>
           <w:u w:val="single"/>
         </w:rPr>
-      </w:pPr>
-      <w:r>
+        <w:t>Challenge 2:</w:t>
+      </w:r>
+    </w:p>
+    <w:p>
+      <w:pPr>
+        <w:rPr>
+          <w:sz w:val="24"/>
+          <w:szCs w:val="24"/>
+        </w:rPr>
+      </w:pPr>
+      <w:r>
+        <w:rPr>
+          <w:sz w:val="24"/>
+          <w:szCs w:val="24"/>
+        </w:rPr>
+        <w:t xml:space="preserve">Working with a user’s input can always lead to problems.  Therefore, when figuring out how to deal with user input, I asked multiple of my fellow students to write their own assembly programs and send them to me. This was very helpful as it reminded me of the need to remove trailing whitespace. After this, I used a whiteboard to brainstorm a solution. My final solution was to decompose the input into smaller sub parts which could be dealt with individually, namely the opcode, operands, and then </w:t>
+      </w:r>
+      <w:r>
+        <w:rPr>
+          <w:sz w:val="24"/>
+          <w:szCs w:val="24"/>
+        </w:rPr>
+        <w:t xml:space="preserve">splitting the operands into </w:t>
+      </w:r>
+      <w:r>
+        <w:rPr>
+          <w:sz w:val="24"/>
+          <w:szCs w:val="24"/>
+        </w:rPr>
+        <w:t xml:space="preserve">each operand </w:t>
+      </w:r>
+      <w:r>
+        <w:rPr>
+          <w:sz w:val="24"/>
+          <w:szCs w:val="24"/>
+        </w:rPr>
+        <w:t>to be decoded individually.</w:t>
+      </w:r>
+    </w:p>
+    <w:p>
+      <w:pPr>
         <w:rPr>
           <w:sz w:val="28"/>
           <w:szCs w:val="28"/>
           <w:u w:val="single"/>
         </w:rPr>
-        <w:t>Challenge 2:</w:t>
-      </w:r>
-    </w:p>
-    <w:p>
-      <w:pPr>
-        <w:rPr>
-          <w:sz w:val="24"/>
-          <w:szCs w:val="24"/>
-        </w:rPr>
-      </w:pPr>
-      <w:r>
-        <w:rPr>
-          <w:sz w:val="24"/>
-          <w:szCs w:val="24"/>
-        </w:rPr>
-        <w:t xml:space="preserve">Working with a user’s input can always lead to problems.  Therefore, when figuring out how to deal with user input, I asked multiple of my fellow students to write their own assembly programs and send them to me. This was very helpful as it reminded me of the need to remove trailing whitespace. After this, I used a whiteboard to brainstorm a solution. My final solution was to decompose the input into smaller sub parts which could be dealt with individually, namely the opcode, operands, and then </w:t>
-      </w:r>
-      <w:r>
-        <w:rPr>
-          <w:sz w:val="24"/>
-          <w:szCs w:val="24"/>
-        </w:rPr>
-        <w:t xml:space="preserve">splitting the operands into </w:t>
-      </w:r>
-      <w:r>
-        <w:rPr>
-          <w:sz w:val="24"/>
-          <w:szCs w:val="24"/>
-        </w:rPr>
-        <w:t xml:space="preserve">each operand </w:t>
-      </w:r>
-      <w:r>
-        <w:rPr>
-          <w:sz w:val="24"/>
-          <w:szCs w:val="24"/>
-        </w:rPr>
-        <w:t>to be decoded individually.</w:t>
-      </w:r>
-    </w:p>
-    <w:p>
-      <w:pPr>
+      </w:pPr>
+      <w:r>
         <w:rPr>
           <w:sz w:val="28"/>
           <w:szCs w:val="28"/>
           <w:u w:val="single"/>
         </w:rPr>
+        <w:t>Challenge 3:</w:t>
+      </w:r>
+    </w:p>
+    <w:p>
+      <w:pPr>
+        <w:rPr>
+          <w:sz w:val="24"/>
+          <w:szCs w:val="24"/>
+        </w:rPr>
+      </w:pPr>
+      <w:r>
+        <w:rPr>
+          <w:sz w:val="24"/>
+          <w:szCs w:val="24"/>
+        </w:rPr>
+        <w:t xml:space="preserve">Originally, I had thought to replace the labels with their locations in memory when the program is compiled. That would make the program execute faster, as it would not have to </w:t>
+      </w:r>
+      <w:proofErr w:type="spellStart"/>
+      <w:r>
+        <w:rPr>
+          <w:sz w:val="24"/>
+          <w:szCs w:val="24"/>
+        </w:rPr>
+        <w:t>lookup</w:t>
+      </w:r>
+      <w:proofErr w:type="spellEnd"/>
+      <w:r>
+        <w:rPr>
+          <w:sz w:val="24"/>
+          <w:szCs w:val="24"/>
+        </w:rPr>
+        <w:t xml:space="preserve"> the location for a given label each time. However, doing so would make labels more unclear when shown in any errors that may occur, as a line number or location in memory is less recognisable than a label name.</w:t>
+      </w:r>
+    </w:p>
+    <w:p>
+      <w:pPr>
+        <w:rPr>
+          <w:sz w:val="24"/>
+          <w:szCs w:val="24"/>
+        </w:rPr>
+      </w:pPr>
+      <w:r>
+        <w:rPr>
+          <w:sz w:val="24"/>
+          <w:szCs w:val="24"/>
+        </w:rPr>
+        <w:t xml:space="preserve">A second option would be to store a dictionary of the labels and their locations in memory, and get said location whenever the label is called upon, for a branch instruction or similar. This would be much slower compared to the method described above as it would take time to </w:t>
+      </w:r>
+      <w:proofErr w:type="spellStart"/>
+      <w:r>
+        <w:rPr>
+          <w:sz w:val="24"/>
+          <w:szCs w:val="24"/>
+        </w:rPr>
+        <w:t>lookup</w:t>
+      </w:r>
+      <w:proofErr w:type="spellEnd"/>
+      <w:r>
+        <w:rPr>
+          <w:sz w:val="24"/>
+          <w:szCs w:val="24"/>
+        </w:rPr>
+        <w:t xml:space="preserve"> the values from the dictionary, but it would make errors easier to understand as I could simply give the label name.</w:t>
+      </w:r>
+    </w:p>
+    <w:p>
+      <w:pPr>
+        <w:rPr>
+          <w:sz w:val="24"/>
+          <w:szCs w:val="24"/>
+        </w:rPr>
+      </w:pPr>
+      <w:r>
+        <w:rPr>
+          <w:sz w:val="24"/>
+          <w:szCs w:val="24"/>
+        </w:rPr>
+        <w:t xml:space="preserve">Both methods have their advantages, but since this is a web program, and users </w:t>
+      </w:r>
+      <w:r>
+        <w:rPr>
+          <w:sz w:val="24"/>
+          <w:szCs w:val="24"/>
+        </w:rPr>
+        <w:t>expect</w:t>
+      </w:r>
+      <w:r>
+        <w:rPr>
+          <w:sz w:val="24"/>
+          <w:szCs w:val="24"/>
+        </w:rPr>
+        <w:t xml:space="preserve"> some delay</w:t>
+      </w:r>
+      <w:r>
+        <w:rPr>
+          <w:sz w:val="24"/>
+          <w:szCs w:val="24"/>
+        </w:rPr>
+        <w:t xml:space="preserve"> already and do not require blazingly fast execute speeds, I chose the second option, as it made the user debugging experience better. This also made the writing of the compiler easier, which gave me more time to work on the rest of the program.</w:t>
+      </w:r>
+    </w:p>
+    <w:p>
+      <w:pPr>
+        <w:rPr>
+          <w:sz w:val="28"/>
+          <w:szCs w:val="28"/>
+        </w:rPr>
       </w:pPr>
       <w:r>
         <w:rPr>
@@ -1898,166 +1991,52 @@
           <w:szCs w:val="28"/>
           <w:u w:val="single"/>
         </w:rPr>
-        <w:t>Challenge 3:</w:t>
-      </w:r>
-    </w:p>
-    <w:p>
-      <w:pPr>
-        <w:rPr>
-          <w:sz w:val="24"/>
-          <w:szCs w:val="24"/>
-        </w:rPr>
-      </w:pPr>
-      <w:r>
-        <w:rPr>
-          <w:sz w:val="24"/>
-          <w:szCs w:val="24"/>
-        </w:rPr>
-        <w:t xml:space="preserve">Originally, I had thought to replace the labels with their locations in memory when the program is compiled. That would make the program execute faster, as it would not have to </w:t>
-      </w:r>
-      <w:proofErr w:type="spellStart"/>
-      <w:r>
-        <w:rPr>
-          <w:sz w:val="24"/>
-          <w:szCs w:val="24"/>
-        </w:rPr>
-        <w:t>lookup</w:t>
-      </w:r>
-      <w:proofErr w:type="spellEnd"/>
-      <w:r>
-        <w:rPr>
-          <w:sz w:val="24"/>
-          <w:szCs w:val="24"/>
-        </w:rPr>
-        <w:t xml:space="preserve"> the location for a given label each time. However, doing so would make labels more unclear when shown in any errors that may occur, as a line number or location in memory is less recognisable than a label name.</w:t>
-      </w:r>
-    </w:p>
-    <w:p>
-      <w:pPr>
-        <w:rPr>
-          <w:sz w:val="24"/>
-          <w:szCs w:val="24"/>
-        </w:rPr>
-      </w:pPr>
-      <w:r>
-        <w:rPr>
-          <w:sz w:val="24"/>
-          <w:szCs w:val="24"/>
-        </w:rPr>
-        <w:t xml:space="preserve">A second option would be to store a dictionary of the labels and their locations in memory, and get said location whenever the label is called upon, for a branch instruction or similar. This would be much slower compared to the method described above as it would take time to </w:t>
-      </w:r>
-      <w:proofErr w:type="spellStart"/>
-      <w:r>
-        <w:rPr>
-          <w:sz w:val="24"/>
-          <w:szCs w:val="24"/>
-        </w:rPr>
-        <w:t>lookup</w:t>
-      </w:r>
-      <w:proofErr w:type="spellEnd"/>
-      <w:r>
-        <w:rPr>
-          <w:sz w:val="24"/>
-          <w:szCs w:val="24"/>
-        </w:rPr>
-        <w:t xml:space="preserve"> the values from the dictionary, but it would make errors easier to understand as I could simply give the label name.</w:t>
-      </w:r>
-    </w:p>
-    <w:p>
-      <w:pPr>
-        <w:rPr>
-          <w:sz w:val="24"/>
-          <w:szCs w:val="24"/>
-        </w:rPr>
-      </w:pPr>
-      <w:r>
-        <w:rPr>
-          <w:sz w:val="24"/>
-          <w:szCs w:val="24"/>
-        </w:rPr>
-        <w:t xml:space="preserve">Both methods have their advantages, but since this is a web program, and users </w:t>
-      </w:r>
-      <w:r>
-        <w:rPr>
-          <w:sz w:val="24"/>
-          <w:szCs w:val="24"/>
-        </w:rPr>
-        <w:t>expect</w:t>
-      </w:r>
-      <w:r>
-        <w:rPr>
-          <w:sz w:val="24"/>
-          <w:szCs w:val="24"/>
-        </w:rPr>
-        <w:t xml:space="preserve"> some delay</w:t>
-      </w:r>
-      <w:r>
-        <w:rPr>
-          <w:sz w:val="24"/>
-          <w:szCs w:val="24"/>
-        </w:rPr>
-        <w:t xml:space="preserve"> already and do not require blazingly fast execute speeds, I chose the second option, as it made the user debugging experience better. This also made the writing of the compiler easier, which gave me more time to work on the rest of the program.</w:t>
-      </w:r>
-    </w:p>
-    <w:p>
-      <w:pPr>
-        <w:rPr>
-          <w:sz w:val="28"/>
-          <w:szCs w:val="28"/>
-        </w:rPr>
-      </w:pPr>
-      <w:r>
+        <w:t>Challenge 4:</w:t>
+      </w:r>
+    </w:p>
+    <w:p>
+      <w:pPr>
+        <w:rPr>
+          <w:sz w:val="24"/>
+          <w:szCs w:val="24"/>
+        </w:rPr>
+      </w:pPr>
+      <w:r>
+        <w:rPr>
+          <w:sz w:val="24"/>
+          <w:szCs w:val="24"/>
+        </w:rPr>
+        <w:t xml:space="preserve">This was something I struggled with initially, until I was reminded of the research I had done. Peter Higginson’s solution to the problem used Von Neumann architecture </w:t>
+      </w:r>
+      <w:r>
+        <w:rPr>
+          <w:sz w:val="24"/>
+          <w:szCs w:val="24"/>
+        </w:rPr>
+        <w:t>to</w:t>
+      </w:r>
+      <w:r>
+        <w:rPr>
+          <w:sz w:val="24"/>
+          <w:szCs w:val="24"/>
+        </w:rPr>
+        <w:t xml:space="preserve"> closer mimic most modern computers, which informed my decision to do the same.</w:t>
+      </w:r>
+    </w:p>
+    <w:p>
+      <w:pPr>
         <w:rPr>
           <w:sz w:val="28"/>
           <w:szCs w:val="28"/>
           <w:u w:val="single"/>
         </w:rPr>
-        <w:t>Challenge 4:</w:t>
-      </w:r>
-    </w:p>
-    <w:p>
-      <w:pPr>
-        <w:rPr>
-          <w:sz w:val="24"/>
-          <w:szCs w:val="24"/>
-        </w:rPr>
-      </w:pPr>
-      <w:r>
-        <w:rPr>
-          <w:sz w:val="24"/>
-          <w:szCs w:val="24"/>
-        </w:rPr>
-        <w:t xml:space="preserve">This was something I struggled with initially, until I was reminded of the research I had done. Peter Higginson’s solution to the problem used Von Neumann architecture </w:t>
-      </w:r>
-      <w:r>
-        <w:rPr>
-          <w:sz w:val="24"/>
-          <w:szCs w:val="24"/>
-        </w:rPr>
-        <w:t>to</w:t>
-      </w:r>
-      <w:r>
-        <w:rPr>
-          <w:sz w:val="24"/>
-          <w:szCs w:val="24"/>
-        </w:rPr>
-        <w:t xml:space="preserve"> closer mimic most modern computers, which informed my decision to do the same.</w:t>
-      </w:r>
-    </w:p>
-    <w:p>
-      <w:pPr>
+      </w:pPr>
+      <w:r>
         <w:rPr>
           <w:sz w:val="28"/>
           <w:szCs w:val="28"/>
           <w:u w:val="single"/>
         </w:rPr>
-      </w:pPr>
-      <w:r>
-        <w:rPr>
-          <w:sz w:val="28"/>
-          <w:szCs w:val="28"/>
-          <w:u w:val="single"/>
-        </w:rPr>
         <w:t>Challenge 5:</w:t>
       </w:r>
     </w:p>
@@ -2073,7 +2052,7 @@
           <w:sz w:val="24"/>
           <w:szCs w:val="24"/>
         </w:rPr>
-        <w:t xml:space="preserve">When I had the idea to allow users to share programs, I did not consider how to implement it. It would require some way of storing the programs, and some way of accessing them. </w:t>
+        <w:t xml:space="preserve">When I had the idea to allow users to share programs, I did not consider how to implement it. It would require some way of storing the programs, and some way of accessing them. Thanks to my education, I knew of databases and their uses, which aligned perfectly to solve </w:t>
       </w:r>
       <w:r>
         <w:rPr>
@@ -2081,7 +2060,7 @@
           <w:szCs w:val="24"/>
         </w:rPr>
         <w:lastRenderedPageBreak/>
-        <w:t xml:space="preserve">Thanks to my education, I knew of databases and their uses, which aligned perfectly to solve this problem. </w:t>
+        <w:t xml:space="preserve">this problem. </w:t>
       </w:r>
       <w:r>
         <w:rPr>
@@ -2111,13 +2090,6 @@
           <w:szCs w:val="24"/>
         </w:rPr>
         <w:t xml:space="preserve">However, storing programs and making them accessible led to another program. </w:t>
-      </w:r>
-      <w:r>
-        <w:rPr>
-          <w:sz w:val="24"/>
-          <w:szCs w:val="24"/>
-        </w:rPr>
-        <w:t>/</w:t>
       </w:r>
     </w:p>
     <w:p>
@@ -2249,7 +2221,7 @@
                     <pic:cNvPicPr/>
                   </pic:nvPicPr>
                   <pic:blipFill>
-                    <a:blip r:embed="rId20"/>
+                    <a:blip r:embed="rId22"/>
                     <a:stretch>
                       <a:fillRect/>
                     </a:stretch>
@@ -2273,6 +2245,28 @@
     <w:p>
       <w:pPr>
         <w:rPr>
+          <w:sz w:val="24"/>
+          <w:szCs w:val="24"/>
+        </w:rPr>
+      </w:pPr>
+      <w:r>
+        <w:rPr>
+          <w:sz w:val="24"/>
+          <w:szCs w:val="24"/>
+        </w:rPr>
+        <w:t>Additionally, I created multiple prototypes, which ran in terminal locally, in order to ease myself into the methods required for this program.</w:t>
+      </w:r>
+      <w:r>
+        <w:rPr>
+          <w:sz w:val="24"/>
+          <w:szCs w:val="24"/>
+        </w:rPr>
+        <w:t xml:space="preserve"> Prototyping my program helped me to figure out certain logical problems, like how the memory of the “computer” being simulated will be stored. I also figured out how to parse the user’s input, and make that useable by my second program.</w:t>
+      </w:r>
+    </w:p>
+    <w:p>
+      <w:pPr>
+        <w:rPr>
           <w:sz w:val="32"/>
           <w:szCs w:val="32"/>
         </w:rPr>
@@ -2300,7 +2294,7 @@
         <w:pStyle w:val="ListParagraph"/>
         <w:numPr>
           <w:ilvl w:val="0"/>
-          <w:numId w:val="1"/>
+          <w:numId w:val="2"/>
         </w:numPr>
         <w:rPr>
           <w:sz w:val="24"/>
@@ -2312,7 +2306,93 @@
           <w:sz w:val="24"/>
           <w:szCs w:val="24"/>
         </w:rPr>
-        <w:t>The project should be able to produce the correct output for any given assembly program.</w:t>
+        <w:t xml:space="preserve">The project </w:t>
+      </w:r>
+      <w:r>
+        <w:rPr>
+          <w:sz w:val="24"/>
+          <w:szCs w:val="24"/>
+        </w:rPr>
+        <w:t xml:space="preserve">must </w:t>
+      </w:r>
+      <w:r>
+        <w:rPr>
+          <w:sz w:val="24"/>
+          <w:szCs w:val="24"/>
+        </w:rPr>
+        <w:t>be able to produce the correct output for any given assembly program.</w:t>
+      </w:r>
+    </w:p>
+    <w:p>
+      <w:pPr>
+        <w:pStyle w:val="ListParagraph"/>
+        <w:rPr>
+          <w:sz w:val="24"/>
+          <w:szCs w:val="24"/>
+        </w:rPr>
+      </w:pPr>
+      <w:r>
+        <w:rPr>
+          <w:sz w:val="24"/>
+          <w:szCs w:val="24"/>
+        </w:rPr>
+        <w:lastRenderedPageBreak/>
+        <w:t>1.1: Every original command from the AQA Assembly specification must be present and working as it would in an exam question.</w:t>
+      </w:r>
+    </w:p>
+    <w:p>
+      <w:pPr>
+        <w:pStyle w:val="ListParagraph"/>
+        <w:rPr>
+          <w:sz w:val="24"/>
+          <w:szCs w:val="24"/>
+        </w:rPr>
+      </w:pPr>
+      <w:r>
+        <w:rPr>
+          <w:sz w:val="24"/>
+          <w:szCs w:val="24"/>
+        </w:rPr>
+        <w:t xml:space="preserve">1.2: </w:t>
+      </w:r>
+      <w:r>
+        <w:rPr>
+          <w:sz w:val="24"/>
+          <w:szCs w:val="24"/>
+        </w:rPr>
+        <w:t>No instruction should allow anything not already present within the specification, i.e. a MOV instruction should not allow immediate addressing (getting the value from main memory)</w:t>
+      </w:r>
+    </w:p>
+    <w:p>
+      <w:pPr>
+        <w:pStyle w:val="ListParagraph"/>
+        <w:rPr>
+          <w:sz w:val="24"/>
+          <w:szCs w:val="24"/>
+        </w:rPr>
+      </w:pPr>
+      <w:r>
+        <w:rPr>
+          <w:sz w:val="24"/>
+          <w:szCs w:val="24"/>
+        </w:rPr>
+        <w:t>1.3: Any extra instructions should not interfere with the running of other instructions, e.g. an OUTPUT instruction should not affect any other instructions.</w:t>
+      </w:r>
+    </w:p>
+    <w:p>
+      <w:pPr>
+        <w:pStyle w:val="ListParagraph"/>
+        <w:rPr>
+          <w:sz w:val="24"/>
+          <w:szCs w:val="24"/>
+        </w:rPr>
+      </w:pPr>
+      <w:r>
+        <w:rPr>
+          <w:sz w:val="24"/>
+          <w:szCs w:val="24"/>
+        </w:rPr>
+        <w:t>1.4: Any extra instructions should only be included to allow the user to view data, or set up values which would be present in an exam. E.g. Some kind of “MEM” instruction, which places a value at a certain location in memory, would be reasonable to add, but something like “BCC” from 6502 assembly (Branch on carry clear, or in other words if a carry has occurred then branch), which allows for more than the AQA Specification allows, is not fit to be included in the program.</w:t>
       </w:r>
     </w:p>
     <w:p>
@@ -2320,7 +2400,7 @@
         <w:pStyle w:val="ListParagraph"/>
         <w:numPr>
           <w:ilvl w:val="0"/>
-          <w:numId w:val="1"/>
+          <w:numId w:val="2"/>
         </w:numPr>
         <w:rPr>
           <w:sz w:val="24"/>
@@ -2332,7 +2412,122 @@
           <w:sz w:val="24"/>
           <w:szCs w:val="24"/>
         </w:rPr>
-        <w:t>The user must be able to code on the website and send the code to be processed by the server.</w:t>
+        <w:t xml:space="preserve">The user </w:t>
+      </w:r>
+      <w:r>
+        <w:rPr>
+          <w:sz w:val="24"/>
+          <w:szCs w:val="24"/>
+        </w:rPr>
+        <w:t>should</w:t>
+      </w:r>
+      <w:r>
+        <w:rPr>
+          <w:sz w:val="24"/>
+          <w:szCs w:val="24"/>
+        </w:rPr>
+        <w:t xml:space="preserve"> be able to code on the website and send</w:t>
+      </w:r>
+      <w:r>
+        <w:rPr>
+          <w:sz w:val="24"/>
+          <w:szCs w:val="24"/>
+        </w:rPr>
+        <w:t xml:space="preserve"> said</w:t>
+      </w:r>
+      <w:r>
+        <w:rPr>
+          <w:sz w:val="24"/>
+          <w:szCs w:val="24"/>
+        </w:rPr>
+        <w:t xml:space="preserve"> code to be processed by the server</w:t>
+      </w:r>
+      <w:r>
+        <w:rPr>
+          <w:sz w:val="24"/>
+          <w:szCs w:val="24"/>
+        </w:rPr>
+        <w:t>, and then receive the output of their program.</w:t>
+      </w:r>
+      <w:bookmarkStart w:id="0" w:name="_GoBack"/>
+      <w:bookmarkEnd w:id="0"/>
+    </w:p>
+    <w:p>
+      <w:pPr>
+        <w:pStyle w:val="ListParagraph"/>
+        <w:rPr>
+          <w:sz w:val="24"/>
+          <w:szCs w:val="24"/>
+        </w:rPr>
+      </w:pPr>
+      <w:r>
+        <w:rPr>
+          <w:sz w:val="24"/>
+          <w:szCs w:val="24"/>
+        </w:rPr>
+        <w:t>2.1: When the user codes on the website, they should be able to write a complete program which is stored in a way that is understandable for the user.</w:t>
+      </w:r>
+    </w:p>
+    <w:p>
+      <w:pPr>
+        <w:pStyle w:val="ListParagraph"/>
+        <w:rPr>
+          <w:sz w:val="24"/>
+          <w:szCs w:val="24"/>
+        </w:rPr>
+      </w:pPr>
+      <w:r>
+        <w:rPr>
+          <w:sz w:val="24"/>
+          <w:szCs w:val="24"/>
+        </w:rPr>
+        <w:t xml:space="preserve">2.2: This program should be sent to the server hosting the website, which will then handle all compiling and execution of the program. </w:t>
+      </w:r>
+    </w:p>
+    <w:p>
+      <w:pPr>
+        <w:pStyle w:val="ListParagraph"/>
+        <w:rPr>
+          <w:sz w:val="24"/>
+          <w:szCs w:val="24"/>
+        </w:rPr>
+      </w:pPr>
+      <w:r>
+        <w:rPr>
+          <w:sz w:val="24"/>
+          <w:szCs w:val="24"/>
+        </w:rPr>
+        <w:t xml:space="preserve">2.3: At no point during compiling and execution should the user be able to change their program, </w:t>
+      </w:r>
+      <w:r>
+        <w:rPr>
+          <w:sz w:val="24"/>
+          <w:szCs w:val="24"/>
+        </w:rPr>
+        <w:t>i.e.</w:t>
+      </w:r>
+      <w:r>
+        <w:rPr>
+          <w:sz w:val="24"/>
+          <w:szCs w:val="24"/>
+        </w:rPr>
+        <w:t xml:space="preserve"> once it has been sent it cannot be modified.</w:t>
+      </w:r>
+    </w:p>
+    <w:p>
+      <w:pPr>
+        <w:pStyle w:val="ListParagraph"/>
+        <w:rPr>
+          <w:sz w:val="24"/>
+          <w:szCs w:val="24"/>
+        </w:rPr>
+      </w:pPr>
+      <w:r>
+        <w:rPr>
+          <w:sz w:val="24"/>
+          <w:szCs w:val="24"/>
+        </w:rPr>
+        <w:t>2.4: Once executed, and all output has been collected by the server, the server should send this output to the user in a way that the user can easily understand without the need for extra tools. This output should be correct to the output of the program if it were traced by hand or by any other method, and should not include more information than what the program would output, unless the user has decided to use the debugging mode (see below).</w:t>
       </w:r>
     </w:p>
     <w:p>
@@ -2340,7 +2535,7 @@
         <w:pStyle w:val="ListParagraph"/>
         <w:numPr>
           <w:ilvl w:val="0"/>
-          <w:numId w:val="1"/>
+          <w:numId w:val="2"/>
         </w:numPr>
         <w:rPr>
           <w:sz w:val="24"/>
@@ -2352,43 +2547,46 @@
           <w:sz w:val="24"/>
           <w:szCs w:val="24"/>
         </w:rPr>
-        <w:t xml:space="preserve">A debugging mode must be available in which the user can see more about their program than without it. If I </w:t>
-      </w:r>
-      <w:r>
-        <w:rPr>
-          <w:sz w:val="24"/>
-          <w:szCs w:val="24"/>
-        </w:rPr>
-        <w:t>am</w:t>
-      </w:r>
-      <w:r>
-        <w:rPr>
-          <w:sz w:val="24"/>
-          <w:szCs w:val="24"/>
-        </w:rPr>
-        <w:t xml:space="preserve"> able to do it within the time </w:t>
-      </w:r>
-      <w:r>
-        <w:rPr>
-          <w:sz w:val="24"/>
-          <w:szCs w:val="24"/>
-        </w:rPr>
-        <w:t>constraints</w:t>
-      </w:r>
-      <w:r>
-        <w:rPr>
-          <w:sz w:val="24"/>
-          <w:szCs w:val="24"/>
-        </w:rPr>
-        <w:t xml:space="preserve">, a stretch goal would be to allow the user to see the whole memory at any point, and go </w:t>
-      </w:r>
-      <w:r>
-        <w:rPr>
-          <w:sz w:val="24"/>
-          <w:szCs w:val="24"/>
-        </w:rPr>
-        <w:lastRenderedPageBreak/>
-        <w:t>backwards and forwards through the program to see the changes from one instruction to another.</w:t>
+        <w:t>Security is always a priority in every project. Ensure that when a user connects to the server there should be no way for them to use SQL-Injection, or similar exploits.</w:t>
+      </w:r>
+    </w:p>
+    <w:p>
+      <w:pPr>
+        <w:pStyle w:val="ListParagraph"/>
+        <w:rPr>
+          <w:sz w:val="24"/>
+          <w:szCs w:val="24"/>
+        </w:rPr>
+      </w:pPr>
+      <w:r>
+        <w:rPr>
+          <w:sz w:val="24"/>
+          <w:szCs w:val="24"/>
+        </w:rPr>
+        <w:t xml:space="preserve">3.1: </w:t>
+      </w:r>
+      <w:r>
+        <w:rPr>
+          <w:sz w:val="24"/>
+          <w:szCs w:val="24"/>
+        </w:rPr>
+        <w:t>An SQL-Injection attack abuses a program taking the user’s input as a string, which can lead to the user being able to run any SQL command they choose onto the server. This should be stopped in a way that is not obtrusive to the user but is still secure.</w:t>
+      </w:r>
+    </w:p>
+    <w:p>
+      <w:pPr>
+        <w:pStyle w:val="ListParagraph"/>
+        <w:rPr>
+          <w:sz w:val="24"/>
+          <w:szCs w:val="24"/>
+        </w:rPr>
+      </w:pPr>
+      <w:r>
+        <w:rPr>
+          <w:sz w:val="24"/>
+          <w:szCs w:val="24"/>
+        </w:rPr>
+        <w:t>3.2: When I mention similar exploits, I mean any other simple attack which abuses something the programmer gives the user permission to do. For example, if when coding the user had the option to send a command to the server to get all previous versions of their program which they had sent, and this somehow allowed them to view others’ code’s history, this would be a “similar exploit” and should be stopped.</w:t>
       </w:r>
     </w:p>
     <w:p>
@@ -2396,7 +2594,7 @@
         <w:pStyle w:val="ListParagraph"/>
         <w:numPr>
           <w:ilvl w:val="0"/>
-          <w:numId w:val="1"/>
+          <w:numId w:val="2"/>
         </w:numPr>
         <w:rPr>
           <w:sz w:val="24"/>
@@ -2408,7 +2606,140 @@
           <w:sz w:val="24"/>
           <w:szCs w:val="24"/>
         </w:rPr>
-        <w:t>The user should be able to share their code to be accessible by other users.</w:t>
+        <w:t xml:space="preserve">A debugging mode must be available in which the user can see more </w:t>
+      </w:r>
+      <w:r>
+        <w:rPr>
+          <w:sz w:val="24"/>
+          <w:szCs w:val="24"/>
+        </w:rPr>
+        <w:t xml:space="preserve">information about their program, and how each instruction is being handled by the executer. </w:t>
+      </w:r>
+      <w:r>
+        <w:rPr>
+          <w:sz w:val="24"/>
+          <w:szCs w:val="24"/>
+        </w:rPr>
+        <w:t xml:space="preserve">If I </w:t>
+      </w:r>
+      <w:r>
+        <w:rPr>
+          <w:sz w:val="24"/>
+          <w:szCs w:val="24"/>
+        </w:rPr>
+        <w:t>am</w:t>
+      </w:r>
+      <w:r>
+        <w:rPr>
+          <w:sz w:val="24"/>
+          <w:szCs w:val="24"/>
+        </w:rPr>
+        <w:t xml:space="preserve"> able to do it within the time </w:t>
+      </w:r>
+      <w:r>
+        <w:rPr>
+          <w:sz w:val="24"/>
+          <w:szCs w:val="24"/>
+        </w:rPr>
+        <w:t>constraints</w:t>
+      </w:r>
+      <w:r>
+        <w:rPr>
+          <w:sz w:val="24"/>
+          <w:szCs w:val="24"/>
+        </w:rPr>
+        <w:t>, a stretch goal would be to allow the user to see the whole memory at any point, and go backwards and forwards through the program to see the changes from one instruction to another</w:t>
+      </w:r>
+      <w:r>
+        <w:rPr>
+          <w:sz w:val="24"/>
+          <w:szCs w:val="24"/>
+        </w:rPr>
+        <w:t xml:space="preserve">, </w:t>
+      </w:r>
+      <w:proofErr w:type="spellStart"/>
+      <w:r>
+        <w:rPr>
+          <w:sz w:val="24"/>
+          <w:szCs w:val="24"/>
+        </w:rPr>
+        <w:t>i.e</w:t>
+      </w:r>
+      <w:proofErr w:type="spellEnd"/>
+      <w:r>
+        <w:rPr>
+          <w:sz w:val="24"/>
+          <w:szCs w:val="24"/>
+        </w:rPr>
+        <w:t xml:space="preserve"> run a MOV R1,#2 command (copy 2 into register 1), then check the memory and see that r1 now </w:t>
+      </w:r>
+      <w:r>
+        <w:rPr>
+          <w:sz w:val="24"/>
+          <w:szCs w:val="24"/>
+        </w:rPr>
+        <w:lastRenderedPageBreak/>
+        <w:t>holds 2, or if they are moving backwards, un-do that command, and see that r1 is whatever value it held before.</w:t>
+      </w:r>
+    </w:p>
+    <w:p>
+      <w:pPr>
+        <w:pStyle w:val="ListParagraph"/>
+        <w:rPr>
+          <w:sz w:val="24"/>
+          <w:szCs w:val="24"/>
+        </w:rPr>
+      </w:pPr>
+      <w:r>
+        <w:rPr>
+          <w:sz w:val="24"/>
+          <w:szCs w:val="24"/>
+        </w:rPr>
+        <w:t>4.1: This debug mode should be readily available to all users.</w:t>
+      </w:r>
+    </w:p>
+    <w:p>
+      <w:pPr>
+        <w:pStyle w:val="ListParagraph"/>
+        <w:rPr>
+          <w:sz w:val="24"/>
+          <w:szCs w:val="24"/>
+        </w:rPr>
+      </w:pPr>
+      <w:r>
+        <w:rPr>
+          <w:sz w:val="24"/>
+          <w:szCs w:val="24"/>
+        </w:rPr>
+        <w:t xml:space="preserve">4.2: When using this debug mode, the output of the original program should still remain intact, </w:t>
+      </w:r>
+      <w:r>
+        <w:rPr>
+          <w:sz w:val="24"/>
+          <w:szCs w:val="24"/>
+        </w:rPr>
+        <w:t>i.e.</w:t>
+      </w:r>
+      <w:r>
+        <w:rPr>
+          <w:sz w:val="24"/>
+          <w:szCs w:val="24"/>
+        </w:rPr>
+        <w:t xml:space="preserve"> enabling debug mode should not cause a program to function differently to without it, in the form that if no debugging tools are used and the program is still </w:t>
+      </w:r>
+      <w:r>
+        <w:rPr>
+          <w:sz w:val="24"/>
+          <w:szCs w:val="24"/>
+        </w:rPr>
+        <w:t>running</w:t>
+      </w:r>
+      <w:r>
+        <w:rPr>
+          <w:sz w:val="24"/>
+          <w:szCs w:val="24"/>
+        </w:rPr>
+        <w:t xml:space="preserve"> as normal, it should execute the same way as if the debug mode was turned off.</w:t>
       </w:r>
     </w:p>
     <w:p>
@@ -2416,7 +2747,7 @@
         <w:pStyle w:val="ListParagraph"/>
         <w:numPr>
           <w:ilvl w:val="0"/>
-          <w:numId w:val="1"/>
+          <w:numId w:val="2"/>
         </w:numPr>
         <w:rPr>
           <w:sz w:val="24"/>
@@ -2428,6 +2759,102 @@
           <w:sz w:val="24"/>
           <w:szCs w:val="24"/>
         </w:rPr>
+        <w:t>The user should be able to share their code to be accessible by other users</w:t>
+      </w:r>
+      <w:r>
+        <w:rPr>
+          <w:sz w:val="24"/>
+          <w:szCs w:val="24"/>
+        </w:rPr>
+        <w:t>, who can then edit and run said code on their own device.</w:t>
+      </w:r>
+    </w:p>
+    <w:p>
+      <w:pPr>
+        <w:ind w:left="720"/>
+        <w:rPr>
+          <w:sz w:val="24"/>
+          <w:szCs w:val="24"/>
+        </w:rPr>
+      </w:pPr>
+      <w:r>
+        <w:rPr>
+          <w:sz w:val="24"/>
+          <w:szCs w:val="24"/>
+        </w:rPr>
+        <w:t xml:space="preserve">5.1: </w:t>
+      </w:r>
+      <w:r>
+        <w:rPr>
+          <w:sz w:val="24"/>
+          <w:szCs w:val="24"/>
+        </w:rPr>
+        <w:t xml:space="preserve">When I say accessible, I mean that another user should be able to access some database storing all saved programs, and filter to find a specific program, then request that program and see its code. </w:t>
+      </w:r>
+    </w:p>
+    <w:p>
+      <w:pPr>
+        <w:ind w:left="720"/>
+        <w:rPr>
+          <w:sz w:val="24"/>
+          <w:szCs w:val="24"/>
+        </w:rPr>
+      </w:pPr>
+      <w:r>
+        <w:rPr>
+          <w:sz w:val="24"/>
+          <w:szCs w:val="24"/>
+        </w:rPr>
+        <w:t xml:space="preserve">5.2: </w:t>
+      </w:r>
+      <w:r>
+        <w:rPr>
+          <w:sz w:val="24"/>
+          <w:szCs w:val="24"/>
+        </w:rPr>
+        <w:t xml:space="preserve">They should not be able to alter code another user is actively working on, nor alter the saved program as it is in the database. </w:t>
+      </w:r>
+      <w:r>
+        <w:rPr>
+          <w:sz w:val="24"/>
+          <w:szCs w:val="24"/>
+        </w:rPr>
+        <w:t>They may request the code, have it on their copy of the website, and edit it as they would their own program. Any changes they make should not affect the original saved program within the database.</w:t>
+      </w:r>
+    </w:p>
+    <w:p>
+      <w:pPr>
+        <w:ind w:left="720"/>
+        <w:rPr>
+          <w:sz w:val="24"/>
+          <w:szCs w:val="24"/>
+        </w:rPr>
+      </w:pPr>
+      <w:r>
+        <w:rPr>
+          <w:sz w:val="24"/>
+          <w:szCs w:val="24"/>
+        </w:rPr>
+        <w:t xml:space="preserve">5.3 When I say “on their own device”, I mean their copy of the website should, in the section where they edit their code, have a copy of the requested program. </w:t>
+      </w:r>
+    </w:p>
+    <w:p>
+      <w:pPr>
+        <w:pStyle w:val="ListParagraph"/>
+        <w:numPr>
+          <w:ilvl w:val="0"/>
+          <w:numId w:val="2"/>
+        </w:numPr>
+        <w:rPr>
+          <w:sz w:val="24"/>
+          <w:szCs w:val="24"/>
+        </w:rPr>
+      </w:pPr>
+      <w:r>
+        <w:rPr>
+          <w:sz w:val="24"/>
+          <w:szCs w:val="24"/>
+        </w:rPr>
         <w:t>As another stretch goal, there could be syntax highlighting on the code the user writes. This</w:t>
       </w:r>
       <w:r>
@@ -2437,21 +2864,49 @@
         </w:rPr>
         <w:t xml:space="preserve"> may fall out of the timescale I have, as it would require learning some </w:t>
       </w:r>
-      <w:proofErr w:type="spellStart"/>
-      <w:r>
-        <w:rPr>
-          <w:sz w:val="24"/>
-          <w:szCs w:val="24"/>
-        </w:rPr>
-        <w:t>javascript</w:t>
-      </w:r>
-      <w:proofErr w:type="spellEnd"/>
-      <w:r>
-        <w:rPr>
-          <w:sz w:val="24"/>
-          <w:szCs w:val="24"/>
-        </w:rPr>
-        <w:t>, but if I were able to achieve it, that would improve the user experience.</w:t>
+      <w:r>
+        <w:rPr>
+          <w:sz w:val="24"/>
+          <w:szCs w:val="24"/>
+        </w:rPr>
+        <w:t>JavaScript</w:t>
+      </w:r>
+      <w:r>
+        <w:rPr>
+          <w:sz w:val="24"/>
+          <w:szCs w:val="24"/>
+        </w:rPr>
+        <w:t xml:space="preserve">, but if I were able to achieve it, </w:t>
+      </w:r>
+      <w:r>
+        <w:rPr>
+          <w:sz w:val="24"/>
+          <w:szCs w:val="24"/>
+        </w:rPr>
+        <w:t>i</w:t>
+      </w:r>
+      <w:r>
+        <w:rPr>
+          <w:sz w:val="24"/>
+          <w:szCs w:val="24"/>
+        </w:rPr>
+        <w:t>t would improve the user experience.</w:t>
+      </w:r>
+    </w:p>
+    <w:p>
+      <w:pPr>
+        <w:pStyle w:val="ListParagraph"/>
+        <w:rPr>
+          <w:sz w:val="24"/>
+          <w:szCs w:val="24"/>
+        </w:rPr>
+      </w:pPr>
+      <w:r>
+        <w:rPr>
+          <w:sz w:val="24"/>
+          <w:szCs w:val="24"/>
+        </w:rPr>
+        <w:t>6.1: This syntax highlighting would run as they code, similar to other coding environments like Visual Studio Code.</w:t>
       </w:r>
     </w:p>
     <w:sectPr>
@@ -2464,9 +2919,180 @@
 </w:document>
 </file>
 
+<file path=word/endnotes.xml><?xml version="1.0" encoding="utf-8"?>
+<w:endnotes xmlns:wpc="http://schemas.microsoft.com/office/word/2010/wordprocessingCanvas" xmlns:cx="http://schemas.microsoft.com/office/drawing/2014/chartex" xmlns:cx1="http://schemas.microsoft.com/office/drawing/2015/9/8/chartex" xmlns:cx2="http://schemas.microsoft.com/office/drawing/2015/10/21/chartex" xmlns:cx3="http://schemas.microsoft.com/office/drawing/2016/5/9/chartex" xmlns:cx4="http://schemas.microsoft.com/office/drawing/2016/5/10/chartex" xmlns:cx5="http://schemas.microsoft.com/office/drawing/2016/5/11/chartex" xmlns:cx6="http://schemas.microsoft.com/office/drawing/2016/5/12/chartex" xmlns:cx7="http://schemas.microsoft.com/office/drawing/2016/5/13/chartex" xmlns:cx8="http://schemas.microsoft.com/office/drawing/2016/5/14/chartex" xmlns:mc="http://schemas.openxmlformats.org/markup-compatibility/2006" xmlns:aink="http://schemas.microsoft.com/office/drawing/2016/ink" xmlns:am3d="http://schemas.microsoft.com/office/drawing/2017/model3d" xmlns:o="urn:schemas-microsoft-com:office:office" xmlns:r="http://schemas.openxmlformats.org/officeDocument/2006/relationships" xmlns:m="http://schemas.openxmlformats.org/officeDocument/2006/math" xmlns:v="urn:schemas-microsoft-com:vml" xmlns:wp14="http://schemas.microsoft.com/office/word/2010/wordprocessingDrawing" xmlns:wp="http://schemas.openxmlformats.org/drawingml/2006/wordprocessingDrawing" xmlns:w10="urn:schemas-microsoft-com:office:word" xmlns:w="http://schemas.openxmlformats.org/wordprocessingml/2006/main" xmlns:w14="http://schemas.microsoft.com/office/word/2010/wordml" xmlns:w15="http://schemas.microsoft.com/office/word/2012/wordml" xmlns:w16cid="http://schemas.microsoft.com/office/word/2016/wordml/cid" xmlns:w16se="http://schemas.microsoft.com/office/word/2015/wordml/symex" xmlns:wpg="http://schemas.microsoft.com/office/word/2010/wordprocessingGroup" xmlns:wpi="http://schemas.microsoft.com/office/word/2010/wordprocessingInk" xmlns:wne="http://schemas.microsoft.com/office/word/2006/wordml" xmlns:wps="http://schemas.microsoft.com/office/word/2010/wordprocessingShape" mc:Ignorable="w14 w15 w16se w16cid wp14">
+  <w:endnote w:type="separator" w:id="-1">
+    <w:p>
+      <w:pPr>
+        <w:spacing w:after="0" w:line="240" w:lineRule="auto"/>
+      </w:pPr>
+      <w:r>
+        <w:separator/>
+      </w:r>
+    </w:p>
+  </w:endnote>
+  <w:endnote w:type="continuationSeparator" w:id="0">
+    <w:p>
+      <w:pPr>
+        <w:spacing w:after="0" w:line="240" w:lineRule="auto"/>
+      </w:pPr>
+      <w:r>
+        <w:continuationSeparator/>
+      </w:r>
+    </w:p>
+  </w:endnote>
+</w:endnotes>
+</file>
+
+<file path=word/footnotes.xml><?xml version="1.0" encoding="utf-8"?>
+<w:footnotes xmlns:wpc="http://schemas.microsoft.com/office/word/2010/wordprocessingCanvas" xmlns:cx="http://schemas.microsoft.com/office/drawing/2014/chartex" xmlns:cx1="http://schemas.microsoft.com/office/drawing/2015/9/8/chartex" xmlns:cx2="http://schemas.microsoft.com/office/drawing/2015/10/21/chartex" xmlns:cx3="http://schemas.microsoft.com/office/drawing/2016/5/9/chartex" xmlns:cx4="http://schemas.microsoft.com/office/drawing/2016/5/10/chartex" xmlns:cx5="http://schemas.microsoft.com/office/drawing/2016/5/11/chartex" xmlns:cx6="http://schemas.microsoft.com/office/drawing/2016/5/12/chartex" xmlns:cx7="http://schemas.microsoft.com/office/drawing/2016/5/13/chartex" xmlns:cx8="http://schemas.microsoft.com/office/drawing/2016/5/14/chartex" xmlns:mc="http://schemas.openxmlformats.org/markup-compatibility/2006" xmlns:aink="http://schemas.microsoft.com/office/drawing/2016/ink" xmlns:am3d="http://schemas.microsoft.com/office/drawing/2017/model3d" xmlns:o="urn:schemas-microsoft-com:office:office" xmlns:r="http://schemas.openxmlformats.org/officeDocument/2006/relationships" xmlns:m="http://schemas.openxmlformats.org/officeDocument/2006/math" xmlns:v="urn:schemas-microsoft-com:vml" xmlns:wp14="http://schemas.microsoft.com/office/word/2010/wordprocessingDrawing" xmlns:wp="http://schemas.openxmlformats.org/drawingml/2006/wordprocessingDrawing" xmlns:w10="urn:schemas-microsoft-com:office:word" xmlns:w="http://schemas.openxmlformats.org/wordprocessingml/2006/main" xmlns:w14="http://schemas.microsoft.com/office/word/2010/wordml" xmlns:w15="http://schemas.microsoft.com/office/word/2012/wordml" xmlns:w16cid="http://schemas.microsoft.com/office/word/2016/wordml/cid" xmlns:w16se="http://schemas.microsoft.com/office/word/2015/wordml/symex" xmlns:wpg="http://schemas.microsoft.com/office/word/2010/wordprocessingGroup" xmlns:wpi="http://schemas.microsoft.com/office/word/2010/wordprocessingInk" xmlns:wne="http://schemas.microsoft.com/office/word/2006/wordml" xmlns:wps="http://schemas.microsoft.com/office/word/2010/wordprocessingShape" mc:Ignorable="w14 w15 w16se w16cid wp14">
+  <w:footnote w:type="separator" w:id="-1">
+    <w:p>
+      <w:pPr>
+        <w:spacing w:after="0" w:line="240" w:lineRule="auto"/>
+      </w:pPr>
+      <w:r>
+        <w:separator/>
+      </w:r>
+    </w:p>
+  </w:footnote>
+  <w:footnote w:type="continuationSeparator" w:id="0">
+    <w:p>
+      <w:pPr>
+        <w:spacing w:after="0" w:line="240" w:lineRule="auto"/>
+      </w:pPr>
+      <w:r>
+        <w:continuationSeparator/>
+      </w:r>
+    </w:p>
+  </w:footnote>
+</w:footnotes>
+</file>
+
 <file path=word/numbering.xml><?xml version="1.0" encoding="utf-8"?>
 <w:numbering xmlns:wpc="http://schemas.microsoft.com/office/word/2010/wordprocessingCanvas" xmlns:cx="http://schemas.microsoft.com/office/drawing/2014/chartex" xmlns:cx1="http://schemas.microsoft.com/office/drawing/2015/9/8/chartex" xmlns:cx2="http://schemas.microsoft.com/office/drawing/2015/10/21/chartex" xmlns:cx3="http://schemas.microsoft.com/office/drawing/2016/5/9/chartex" xmlns:cx4="http://schemas.microsoft.com/office/drawing/2016/5/10/chartex" xmlns:cx5="http://schemas.microsoft.com/office/drawing/2016/5/11/chartex" xmlns:cx6="http://schemas.microsoft.com/office/drawing/2016/5/12/chartex" xmlns:cx7="http://schemas.microsoft.com/office/drawing/2016/5/13/chartex" xmlns:cx8="http://schemas.microsoft.com/office/drawing/2016/5/14/chartex" xmlns:mc="http://schemas.openxmlformats.org/markup-compatibility/2006" xmlns:aink="http://schemas.microsoft.com/office/drawing/2016/ink" xmlns:am3d="http://schemas.microsoft.com/office/drawing/2017/model3d" xmlns:o="urn:schemas-microsoft-com:office:office" xmlns:r="http://schemas.openxmlformats.org/officeDocument/2006/relationships" xmlns:m="http://schemas.openxmlformats.org/officeDocument/2006/math" xmlns:v="urn:schemas-microsoft-com:vml" xmlns:wp14="http://schemas.microsoft.com/office/word/2010/wordprocessingDrawing" xmlns:wp="http://schemas.openxmlformats.org/drawingml/2006/wordprocessingDrawing" xmlns:w10="urn:schemas-microsoft-com:office:word" xmlns:w="http://schemas.openxmlformats.org/wordprocessingml/2006/main" xmlns:w14="http://schemas.microsoft.com/office/word/2010/wordml" xmlns:w15="http://schemas.microsoft.com/office/word/2012/wordml" xmlns:w16cid="http://schemas.microsoft.com/office/word/2016/wordml/cid" xmlns:w16se="http://schemas.microsoft.com/office/word/2015/wordml/symex" xmlns:wpg="http://schemas.microsoft.com/office/word/2010/wordprocessingGroup" xmlns:wpi="http://schemas.microsoft.com/office/word/2010/wordprocessingInk" xmlns:wne="http://schemas.microsoft.com/office/word/2006/wordml" xmlns:wps="http://schemas.microsoft.com/office/word/2010/wordprocessingShape" mc:Ignorable="w14 w15 w16se w16cid wp14">
   <w:abstractNum w:abstractNumId="0" w15:restartNumberingAfterBreak="0">
+    <w:nsid w:val="1A0E4C39"/>
+    <w:multiLevelType w:val="multilevel"/>
+    <w:tmpl w:val="E36C55E2"/>
+    <w:lvl w:ilvl="0">
+      <w:start w:val="1"/>
+      <w:numFmt w:val="decimal"/>
+      <w:lvlText w:val="%1."/>
+      <w:lvlJc w:val="left"/>
+      <w:pPr>
+        <w:ind w:left="720" w:hanging="360"/>
+      </w:pPr>
+      <w:rPr>
+        <w:rFonts w:hint="default"/>
+      </w:rPr>
+    </w:lvl>
+    <w:lvl w:ilvl="1">
+      <w:start w:val="1"/>
+      <w:numFmt w:val="decimal"/>
+      <w:isLgl/>
+      <w:lvlText w:val="%1.%2"/>
+      <w:lvlJc w:val="left"/>
+      <w:pPr>
+        <w:ind w:left="1080" w:hanging="360"/>
+      </w:pPr>
+      <w:rPr>
+        <w:rFonts w:hint="default"/>
+      </w:rPr>
+    </w:lvl>
+    <w:lvl w:ilvl="2">
+      <w:start w:val="1"/>
+      <w:numFmt w:val="decimal"/>
+      <w:isLgl/>
+      <w:lvlText w:val="%1.%2.%3"/>
+      <w:lvlJc w:val="left"/>
+      <w:pPr>
+        <w:ind w:left="1800" w:hanging="720"/>
+      </w:pPr>
+      <w:rPr>
+        <w:rFonts w:hint="default"/>
+      </w:rPr>
+    </w:lvl>
+    <w:lvl w:ilvl="3">
+      <w:start w:val="1"/>
+      <w:numFmt w:val="decimal"/>
+      <w:isLgl/>
+      <w:lvlText w:val="%1.%2.%3.%4"/>
+      <w:lvlJc w:val="left"/>
+      <w:pPr>
+        <w:ind w:left="2160" w:hanging="720"/>
+      </w:pPr>
+      <w:rPr>
+        <w:rFonts w:hint="default"/>
+      </w:rPr>
+    </w:lvl>
+    <w:lvl w:ilvl="4">
+      <w:start w:val="1"/>
+      <w:numFmt w:val="decimal"/>
+      <w:isLgl/>
+      <w:lvlText w:val="%1.%2.%3.%4.%5"/>
+      <w:lvlJc w:val="left"/>
+      <w:pPr>
+        <w:ind w:left="2880" w:hanging="1080"/>
+      </w:pPr>
+      <w:rPr>
+        <w:rFonts w:hint="default"/>
+      </w:rPr>
+    </w:lvl>
+    <w:lvl w:ilvl="5">
+      <w:start w:val="1"/>
+      <w:numFmt w:val="decimal"/>
+      <w:isLgl/>
+      <w:lvlText w:val="%1.%2.%3.%4.%5.%6"/>
+      <w:lvlJc w:val="left"/>
+      <w:pPr>
+        <w:ind w:left="3240" w:hanging="1080"/>
+      </w:pPr>
+      <w:rPr>
+        <w:rFonts w:hint="default"/>
+      </w:rPr>
+    </w:lvl>
+    <w:lvl w:ilvl="6">
+      <w:start w:val="1"/>
+      <w:numFmt w:val="decimal"/>
+      <w:isLgl/>
+      <w:lvlText w:val="%1.%2.%3.%4.%5.%6.%7"/>
+      <w:lvlJc w:val="left"/>
+      <w:pPr>
+        <w:ind w:left="3960" w:hanging="1440"/>
+      </w:pPr>
+      <w:rPr>
+        <w:rFonts w:hint="default"/>
+      </w:rPr>
+    </w:lvl>
+    <w:lvl w:ilvl="7">
+      <w:start w:val="1"/>
+      <w:numFmt w:val="decimal"/>
+      <w:isLgl/>
+      <w:lvlText w:val="%1.%2.%3.%4.%5.%6.%7.%8"/>
+      <w:lvlJc w:val="left"/>
+      <w:pPr>
+        <w:ind w:left="4320" w:hanging="1440"/>
+      </w:pPr>
+      <w:rPr>
+        <w:rFonts w:hint="default"/>
+      </w:rPr>
+    </w:lvl>
+    <w:lvl w:ilvl="8">
+      <w:start w:val="1"/>
+      <w:numFmt w:val="decimal"/>
+      <w:isLgl/>
+      <w:lvlText w:val="%1.%2.%3.%4.%5.%6.%7.%8.%9"/>
+      <w:lvlJc w:val="left"/>
+      <w:pPr>
+        <w:ind w:left="5040" w:hanging="1800"/>
+      </w:pPr>
+      <w:rPr>
+        <w:rFonts w:hint="default"/>
+      </w:rPr>
+    </w:lvl>
+  </w:abstractNum>
+  <w:abstractNum w:abstractNumId="1" w15:restartNumberingAfterBreak="0">
     <w:nsid w:val="38EB60C4"/>
     <w:multiLevelType w:val="hybridMultilevel"/>
     <w:tmpl w:val="62FAAB72"/>
@@ -2578,8 +3204,103 @@
       </w:rPr>
     </w:lvl>
   </w:abstractNum>
+  <w:abstractNum w:abstractNumId="2" w15:restartNumberingAfterBreak="0">
+    <w:nsid w:val="63E06337"/>
+    <w:multiLevelType w:val="hybridMultilevel"/>
+    <w:tmpl w:val="7D268D36"/>
+    <w:lvl w:ilvl="0" w:tplc="E14E232A">
+      <w:start w:val="1"/>
+      <w:numFmt w:val="decimal"/>
+      <w:lvlText w:val="%1."/>
+      <w:lvlJc w:val="left"/>
+      <w:pPr>
+        <w:ind w:left="1080" w:hanging="360"/>
+      </w:pPr>
+      <w:rPr>
+        <w:rFonts w:hint="default"/>
+      </w:rPr>
+    </w:lvl>
+    <w:lvl w:ilvl="1" w:tplc="08090019" w:tentative="1">
+      <w:start w:val="1"/>
+      <w:numFmt w:val="lowerLetter"/>
+      <w:lvlText w:val="%2."/>
+      <w:lvlJc w:val="left"/>
+      <w:pPr>
+        <w:ind w:left="1800" w:hanging="360"/>
+      </w:pPr>
+    </w:lvl>
+    <w:lvl w:ilvl="2" w:tplc="0809001B" w:tentative="1">
+      <w:start w:val="1"/>
+      <w:numFmt w:val="lowerRoman"/>
+      <w:lvlText w:val="%3."/>
+      <w:lvlJc w:val="right"/>
+      <w:pPr>
+        <w:ind w:left="2520" w:hanging="180"/>
+      </w:pPr>
+    </w:lvl>
+    <w:lvl w:ilvl="3" w:tplc="0809000F" w:tentative="1">
+      <w:start w:val="1"/>
+      <w:numFmt w:val="decimal"/>
+      <w:lvlText w:val="%4."/>
+      <w:lvlJc w:val="left"/>
+      <w:pPr>
+        <w:ind w:left="3240" w:hanging="360"/>
+      </w:pPr>
+    </w:lvl>
+    <w:lvl w:ilvl="4" w:tplc="08090019" w:tentative="1">
+      <w:start w:val="1"/>
+      <w:numFmt w:val="lowerLetter"/>
+      <w:lvlText w:val="%5."/>
+      <w:lvlJc w:val="left"/>
+      <w:pPr>
+        <w:ind w:left="3960" w:hanging="360"/>
+      </w:pPr>
+    </w:lvl>
+    <w:lvl w:ilvl="5" w:tplc="0809001B" w:tentative="1">
+      <w:start w:val="1"/>
+      <w:numFmt w:val="lowerRoman"/>
+      <w:lvlText w:val="%6."/>
+      <w:lvlJc w:val="right"/>
+      <w:pPr>
+        <w:ind w:left="4680" w:hanging="180"/>
+      </w:pPr>
+    </w:lvl>
+    <w:lvl w:ilvl="6" w:tplc="0809000F" w:tentative="1">
+      <w:start w:val="1"/>
+      <w:numFmt w:val="decimal"/>
+      <w:lvlText w:val="%7."/>
+      <w:lvlJc w:val="left"/>
+      <w:pPr>
+        <w:ind w:left="5400" w:hanging="360"/>
+      </w:pPr>
+    </w:lvl>
+    <w:lvl w:ilvl="7" w:tplc="08090019" w:tentative="1">
+      <w:start w:val="1"/>
+      <w:numFmt w:val="lowerLetter"/>
+      <w:lvlText w:val="%8."/>
+      <w:lvlJc w:val="left"/>
+      <w:pPr>
+        <w:ind w:left="6120" w:hanging="360"/>
+      </w:pPr>
+    </w:lvl>
+    <w:lvl w:ilvl="8" w:tplc="0809001B" w:tentative="1">
+      <w:start w:val="1"/>
+      <w:numFmt w:val="lowerRoman"/>
+      <w:lvlText w:val="%9."/>
+      <w:lvlJc w:val="right"/>
+      <w:pPr>
+        <w:ind w:left="6840" w:hanging="180"/>
+      </w:pPr>
+    </w:lvl>
+  </w:abstractNum>
   <w:num w:numId="1">
+    <w:abstractNumId w:val="1"/>
+  </w:num>
+  <w:num w:numId="2">
     <w:abstractNumId w:val="0"/>
+  </w:num>
+  <w:num w:numId="3">
+    <w:abstractNumId w:val="2"/>
   </w:num>
 </w:numbering>
 </file>
@@ -3055,6 +3776,50 @@
       <w:contextualSpacing/>
     </w:pPr>
   </w:style>
+  <w:style w:type="paragraph" w:styleId="Header">
+    <w:name w:val="header"/>
+    <w:basedOn w:val="Normal"/>
+    <w:link w:val="HeaderChar"/>
+    <w:uiPriority w:val="99"/>
+    <w:unhideWhenUsed/>
+    <w:rsid w:val="00B6709E"/>
+    <w:pPr>
+      <w:tabs>
+        <w:tab w:val="center" w:pos="4513"/>
+        <w:tab w:val="right" w:pos="9026"/>
+      </w:tabs>
+      <w:spacing w:after="0" w:line="240" w:lineRule="auto"/>
+    </w:pPr>
+  </w:style>
+  <w:style w:type="character" w:customStyle="1" w:styleId="HeaderChar">
+    <w:name w:val="Header Char"/>
+    <w:basedOn w:val="DefaultParagraphFont"/>
+    <w:link w:val="Header"/>
+    <w:uiPriority w:val="99"/>
+    <w:rsid w:val="00B6709E"/>
+  </w:style>
+  <w:style w:type="paragraph" w:styleId="Footer">
+    <w:name w:val="footer"/>
+    <w:basedOn w:val="Normal"/>
+    <w:link w:val="FooterChar"/>
+    <w:uiPriority w:val="99"/>
+    <w:unhideWhenUsed/>
+    <w:rsid w:val="00B6709E"/>
+    <w:pPr>
+      <w:tabs>
+        <w:tab w:val="center" w:pos="4513"/>
+        <w:tab w:val="right" w:pos="9026"/>
+      </w:tabs>
+      <w:spacing w:after="0" w:line="240" w:lineRule="auto"/>
+    </w:pPr>
+  </w:style>
+  <w:style w:type="character" w:customStyle="1" w:styleId="FooterChar">
+    <w:name w:val="Footer Char"/>
+    <w:basedOn w:val="DefaultParagraphFont"/>
+    <w:link w:val="Footer"/>
+    <w:uiPriority w:val="99"/>
+    <w:rsid w:val="00B6709E"/>
+  </w:style>
 </w:styles>
 </file>
 
@@ -3354,20 +4119,20 @@
 </file>
 
 <file path=customXml/item1.xml><?xml version="1.0" encoding="utf-8"?>
-<p:properties xmlns:p="http://schemas.microsoft.com/office/2006/metadata/properties" xmlns:xsi="http://www.w3.org/2001/XMLSchema-instance" xmlns:pc="http://schemas.microsoft.com/office/infopath/2007/PartnerControls">
-  <documentManagement>
-    <_activity xmlns="18287d57-4f0a-480d-ad86-c9ee94dcacf3" xsi:nil="true"/>
-  </documentManagement>
-</p:properties>
-</file>
-
-<file path=customXml/item2.xml><?xml version="1.0" encoding="utf-8"?>
 <?mso-contentType ?>
 <FormTemplates xmlns="http://schemas.microsoft.com/sharepoint/v3/contenttype/forms">
   <Display>DocumentLibraryForm</Display>
   <Edit>DocumentLibraryForm</Edit>
   <New>DocumentLibraryForm</New>
 </FormTemplates>
+</file>
+
+<file path=customXml/item2.xml><?xml version="1.0" encoding="utf-8"?>
+<p:properties xmlns:p="http://schemas.microsoft.com/office/2006/metadata/properties" xmlns:xsi="http://www.w3.org/2001/XMLSchema-instance" xmlns:pc="http://schemas.microsoft.com/office/infopath/2007/PartnerControls">
+  <documentManagement>
+    <_activity xmlns="18287d57-4f0a-480d-ad86-c9ee94dcacf3" xsi:nil="true"/>
+  </documentManagement>
+</p:properties>
 </file>
 
 <file path=customXml/item3.xml><?xml version="1.0" encoding="utf-8"?>
@@ -3553,19 +4318,25 @@
 </file>
 
 <file path=customXml/itemProps1.xml><?xml version="1.0" encoding="utf-8"?>
-<ds:datastoreItem xmlns:ds="http://schemas.openxmlformats.org/officeDocument/2006/customXml" ds:itemID="{64618EF6-6623-4DC4-AAB5-0FCDD6983B68}">
+<ds:datastoreItem xmlns:ds="http://schemas.openxmlformats.org/officeDocument/2006/customXml" ds:itemID="{B0A76E36-1CD7-4800-A269-A83947C5CADC}">
   <ds:schemaRefs>
-    <ds:schemaRef ds:uri="http://schemas.microsoft.com/office/2006/metadata/properties"/>
-    <ds:schemaRef ds:uri="http://schemas.microsoft.com/office/infopath/2007/PartnerControls"/>
-    <ds:schemaRef ds:uri="18287d57-4f0a-480d-ad86-c9ee94dcacf3"/>
+    <ds:schemaRef ds:uri="http://schemas.microsoft.com/sharepoint/v3/contenttype/forms"/>
   </ds:schemaRefs>
 </ds:datastoreItem>
 </file>
 
 <file path=customXml/itemProps2.xml><?xml version="1.0" encoding="utf-8"?>
-<ds:datastoreItem xmlns:ds="http://schemas.openxmlformats.org/officeDocument/2006/customXml" ds:itemID="{B0A76E36-1CD7-4800-A269-A83947C5CADC}">
+<ds:datastoreItem xmlns:ds="http://schemas.openxmlformats.org/officeDocument/2006/customXml" ds:itemID="{64618EF6-6623-4DC4-AAB5-0FCDD6983B68}">
   <ds:schemaRefs>
-    <ds:schemaRef ds:uri="http://schemas.microsoft.com/sharepoint/v3/contenttype/forms"/>
+    <ds:schemaRef ds:uri="http://www.w3.org/XML/1998/namespace"/>
+    <ds:schemaRef ds:uri="http://purl.org/dc/dcmitype/"/>
+    <ds:schemaRef ds:uri="http://schemas.microsoft.com/office/2006/metadata/properties"/>
+    <ds:schemaRef ds:uri="http://schemas.microsoft.com/office/infopath/2007/PartnerControls"/>
+    <ds:schemaRef ds:uri="http://purl.org/dc/terms/"/>
+    <ds:schemaRef ds:uri="http://schemas.microsoft.com/office/2006/documentManagement/types"/>
+    <ds:schemaRef ds:uri="http://schemas.openxmlformats.org/package/2006/metadata/core-properties"/>
+    <ds:schemaRef ds:uri="18287d57-4f0a-480d-ad86-c9ee94dcacf3"/>
+    <ds:schemaRef ds:uri="http://purl.org/dc/elements/1.1/"/>
   </ds:schemaRefs>
 </ds:datastoreItem>
 </file>

</xml_diff>